<commit_message>
Drop the duplicate EV reference
references.bib already contained saeidian2023 for the JCI Insight EV virome
paper, cited from the Introduction. The Methods paragraph added with the tier
correction cited the same paper under a second key, vahidnezhad2023 with the
same DOI, so it appeared twice in the bibliography. Removed the added entry and
pointed the Methods citation at the existing key.

Found by reading the rendered DOCX rather than the HTML. The DOCX float
structure itself is correct: each supplementary figure and table is emitted as
a single-cell wrapper table holding the content followed by its caption, and
Figure S2 and Table S6 now match that pattern.

Co-Authored-By: Claude Opus 4.8 <noreply@anthropic.com>
</commit_message>
<xml_diff>
--- a/manuscript/manuscript.docx
+++ b/manuscript/manuscript.docx
@@ -680,7 +680,7 @@
         <w:t xml:space="preserve"> </w:t>
       </w:r>
       <w:r>
-        <w:t xml:space="preserve">(Saeidian, Youssefian, Naji, others, et al. 2023)</w:t>
+        <w:t xml:space="preserve">(Saeidian et al. 2023)</w:t>
       </w:r>
       <w:r>
         <w:t xml:space="preserve">, whereas others have reported the opposite, finding HPV transcriptionally silent in cSCC</w:t>
@@ -1481,7 +1481,7 @@
         <w:t xml:space="preserve"> </w:t>
       </w:r>
       <w:r>
-        <w:t xml:space="preserve">(Saeidian, Youssefian, Naji, Mahmoudi, et al. 2023)</w:t>
+        <w:t xml:space="preserve">(Saeidian et al. 2023)</w:t>
       </w:r>
       <w:r>
         <w:t xml:space="preserve"> </w:t>
@@ -3285,7 +3285,7 @@
     </w:p>
     <w:bookmarkEnd w:id="51"/>
     <w:bookmarkEnd w:id="52"/>
-    <w:bookmarkStart w:id="121" w:name="references"/>
+    <w:bookmarkStart w:id="120" w:name="references"/>
     <w:p>
       <w:pPr>
         <w:pStyle w:val="Heading2"/>
@@ -3294,7 +3294,7 @@
         <w:t xml:space="preserve">References</w:t>
       </w:r>
     </w:p>
-    <w:bookmarkStart w:id="120" w:name="refs"/>
+    <w:bookmarkStart w:id="119" w:name="refs"/>
     <w:bookmarkStart w:id="54" w:name="ref-adey2013"/>
     <w:p>
       <w:pPr>
@@ -4919,19 +4919,61 @@
       </w:r>
     </w:p>
     <w:bookmarkEnd w:id="102"/>
-    <w:bookmarkStart w:id="104" w:name="ref-vahidnezhad2023"/>
+    <w:bookmarkStart w:id="104" w:name="ref-saeidian2023"/>
     <w:p>
       <w:pPr>
         <w:pStyle w:val="Bibliography"/>
       </w:pPr>
       <w:r>
-        <w:t xml:space="preserve">Saeidian, Amir Hossein, Leila Youssefian, Maryam Naji, Hamidreza Mahmoudi, Samantha M. Barnada, Cheng Huang, Kamran Naghipoor, et al. 2023.</w:t>
-      </w:r>
-      <w:r>
-        <w:t xml:space="preserve"> </w:t>
-      </w:r>
-      <w:r>
-        <w:t xml:space="preserve">“Whole Transcriptome-Based Skin Virome Profiling in Typical Epidermodysplasia Verruciformis Reveals Alpha-, Beta-, and Gamma-HPV Infections.”</w:t>
+        <w:t xml:space="preserve">Saeidian, Amir Hossein, Leila Youssefian, Maryam Naji, others, Jouni Uitto, and Hassan Vahidnezhad. 2023.</w:t>
+      </w:r>
+      <w:r>
+        <w:t xml:space="preserve"> </w:t>
+      </w:r>
+      <w:r>
+        <w:t xml:space="preserve">“Whole Transcriptome–Based Skin Virome Profiling in Typical Epidermodysplasia Verruciformis Reveals</w:t>
+      </w:r>
+      <w:r>
+        <w:t xml:space="preserve"> </w:t>
+      </w:r>
+      <m:oMath>
+        <m:r>
+          <m:t>α</m:t>
+        </m:r>
+      </m:oMath>
+      <w:r>
+        <w:t xml:space="preserve">-,</w:t>
+      </w:r>
+      <w:r>
+        <w:t xml:space="preserve"> </w:t>
+      </w:r>
+      <m:oMath>
+        <m:r>
+          <m:t>β</m:t>
+        </m:r>
+      </m:oMath>
+      <w:r>
+        <w:t xml:space="preserve">-, and</w:t>
+      </w:r>
+      <w:r>
+        <w:t xml:space="preserve"> </w:t>
+      </w:r>
+      <m:oMath>
+        <m:r>
+          <m:t>γ</m:t>
+        </m:r>
+      </m:oMath>
+      <w:r>
+        <w:t xml:space="preserve">-</w:t>
+      </w:r>
+      <w:r>
+        <w:t xml:space="preserve">HPV</w:t>
+      </w:r>
+      <w:r>
+        <w:t xml:space="preserve"> </w:t>
+      </w:r>
+      <w:r>
+        <w:t xml:space="preserve">Infections.”</w:t>
       </w:r>
       <w:r>
         <w:t xml:space="preserve"> </w:t>
@@ -4965,95 +5007,7 @@
       </w:r>
     </w:p>
     <w:bookmarkEnd w:id="104"/>
-    <w:bookmarkStart w:id="105" w:name="ref-saeidian2023"/>
-    <w:p>
-      <w:pPr>
-        <w:pStyle w:val="Bibliography"/>
-      </w:pPr>
-      <w:r>
-        <w:t xml:space="preserve">Saeidian, Amir Hossein, Leila Youssefian, Maryam Naji, others, Jouni Uitto, and Hassan Vahidnezhad. 2023.</w:t>
-      </w:r>
-      <w:r>
-        <w:t xml:space="preserve"> </w:t>
-      </w:r>
-      <w:r>
-        <w:t xml:space="preserve">“Whole Transcriptome–Based Skin Virome Profiling in Typical Epidermodysplasia Verruciformis Reveals</w:t>
-      </w:r>
-      <w:r>
-        <w:t xml:space="preserve"> </w:t>
-      </w:r>
-      <m:oMath>
-        <m:r>
-          <m:t>α</m:t>
-        </m:r>
-      </m:oMath>
-      <w:r>
-        <w:t xml:space="preserve">-,</w:t>
-      </w:r>
-      <w:r>
-        <w:t xml:space="preserve"> </w:t>
-      </w:r>
-      <m:oMath>
-        <m:r>
-          <m:t>β</m:t>
-        </m:r>
-      </m:oMath>
-      <w:r>
-        <w:t xml:space="preserve">-, and</w:t>
-      </w:r>
-      <w:r>
-        <w:t xml:space="preserve"> </w:t>
-      </w:r>
-      <m:oMath>
-        <m:r>
-          <m:t>γ</m:t>
-        </m:r>
-      </m:oMath>
-      <w:r>
-        <w:t xml:space="preserve">-</w:t>
-      </w:r>
-      <w:r>
-        <w:t xml:space="preserve">HPV</w:t>
-      </w:r>
-      <w:r>
-        <w:t xml:space="preserve"> </w:t>
-      </w:r>
-      <w:r>
-        <w:t xml:space="preserve">Infections.”</w:t>
-      </w:r>
-      <w:r>
-        <w:t xml:space="preserve"> </w:t>
-      </w:r>
-      <w:r>
-        <w:rPr>
-          <w:i/>
-          <w:iCs/>
-        </w:rPr>
-        <w:t xml:space="preserve">JCI Insight</w:t>
-      </w:r>
-      <w:r>
-        <w:t xml:space="preserve"> </w:t>
-      </w:r>
-      <w:r>
-        <w:t xml:space="preserve">8 (5): e162558.</w:t>
-      </w:r>
-      <w:r>
-        <w:t xml:space="preserve"> </w:t>
-      </w:r>
-      <w:hyperlink r:id="rId103">
-        <w:r>
-          <w:rPr>
-            <w:rStyle w:val="Hyperlink"/>
-          </w:rPr>
-          <w:t xml:space="preserve">https://doi.org/10.1172/jci.insight.162558</w:t>
-        </w:r>
-      </w:hyperlink>
-      <w:r>
-        <w:t xml:space="preserve">.</w:t>
-      </w:r>
-    </w:p>
-    <w:bookmarkEnd w:id="105"/>
-    <w:bookmarkStart w:id="107" w:name="ref-shen2016"/>
+    <w:bookmarkStart w:id="106" w:name="ref-shen2016"/>
     <w:p>
       <w:pPr>
         <w:pStyle w:val="Bibliography"/>
@@ -5104,7 +5058,7 @@
       <w:r>
         <w:t xml:space="preserve"> </w:t>
       </w:r>
-      <w:hyperlink r:id="rId106">
+      <w:hyperlink r:id="rId105">
         <w:r>
           <w:rPr>
             <w:rStyle w:val="Hyperlink"/>
@@ -5116,8 +5070,8 @@
         <w:t xml:space="preserve">.</w:t>
       </w:r>
     </w:p>
-    <w:bookmarkEnd w:id="107"/>
-    <w:bookmarkStart w:id="109" w:name="ref-strickley2019"/>
+    <w:bookmarkEnd w:id="106"/>
+    <w:bookmarkStart w:id="108" w:name="ref-strickley2019"/>
     <w:p>
       <w:pPr>
         <w:pStyle w:val="Bibliography"/>
@@ -5150,7 +5104,7 @@
       <w:r>
         <w:t xml:space="preserve"> </w:t>
       </w:r>
-      <w:hyperlink r:id="rId108">
+      <w:hyperlink r:id="rId107">
         <w:r>
           <w:rPr>
             <w:rStyle w:val="Hyperlink"/>
@@ -5162,8 +5116,8 @@
         <w:t xml:space="preserve">.</w:t>
       </w:r>
     </w:p>
-    <w:bookmarkEnd w:id="109"/>
-    <w:bookmarkStart w:id="110" w:name="ref-uberoi2016"/>
+    <w:bookmarkEnd w:id="108"/>
+    <w:bookmarkStart w:id="109" w:name="ref-uberoi2016"/>
     <w:p>
       <w:pPr>
         <w:pStyle w:val="Bibliography"/>
@@ -5194,8 +5148,8 @@
         <w:t xml:space="preserve">12 (5): e1005664.</w:t>
       </w:r>
     </w:p>
-    <w:bookmarkEnd w:id="110"/>
-    <w:bookmarkStart w:id="112" w:name="ref-vandoorslaer2017"/>
+    <w:bookmarkEnd w:id="109"/>
+    <w:bookmarkStart w:id="111" w:name="ref-vandoorslaer2017"/>
     <w:p>
       <w:pPr>
         <w:pStyle w:val="Bibliography"/>
@@ -5237,7 +5191,7 @@
       <w:r>
         <w:t xml:space="preserve"> </w:t>
       </w:r>
-      <w:hyperlink r:id="rId111">
+      <w:hyperlink r:id="rId110">
         <w:r>
           <w:rPr>
             <w:rStyle w:val="Hyperlink"/>
@@ -5249,8 +5203,8 @@
         <w:t xml:space="preserve">.</w:t>
       </w:r>
     </w:p>
-    <w:bookmarkEnd w:id="112"/>
-    <w:bookmarkStart w:id="114" w:name="ref-viarisio2018"/>
+    <w:bookmarkEnd w:id="111"/>
+    <w:bookmarkStart w:id="113" w:name="ref-viarisio2018"/>
     <w:p>
       <w:pPr>
         <w:pStyle w:val="Bibliography"/>
@@ -5295,7 +5249,7 @@
       <w:r>
         <w:t xml:space="preserve"> </w:t>
       </w:r>
-      <w:hyperlink r:id="rId113">
+      <w:hyperlink r:id="rId112">
         <w:r>
           <w:rPr>
             <w:rStyle w:val="Hyperlink"/>
@@ -5307,8 +5261,8 @@
         <w:t xml:space="preserve">.</w:t>
       </w:r>
     </w:p>
-    <w:bookmarkEnd w:id="114"/>
-    <w:bookmarkStart w:id="115" w:name="ref-devilliers2004"/>
+    <w:bookmarkEnd w:id="113"/>
+    <w:bookmarkStart w:id="114" w:name="ref-devilliers2004"/>
     <w:p>
       <w:pPr>
         <w:pStyle w:val="Bibliography"/>
@@ -5339,8 +5293,8 @@
         <w:t xml:space="preserve">324 (1): 17–27.</w:t>
       </w:r>
     </w:p>
-    <w:bookmarkEnd w:id="115"/>
-    <w:bookmarkStart w:id="116" w:name="ref-wallace2012"/>
+    <w:bookmarkEnd w:id="114"/>
+    <w:bookmarkStart w:id="115" w:name="ref-wallace2012"/>
     <w:p>
       <w:pPr>
         <w:pStyle w:val="Bibliography"/>
@@ -5425,8 +5379,8 @@
         <w:t xml:space="preserve">8 (7): e1002807.</w:t>
       </w:r>
     </w:p>
-    <w:bookmarkEnd w:id="116"/>
-    <w:bookmarkStart w:id="118" w:name="ref-wood2019"/>
+    <w:bookmarkEnd w:id="115"/>
+    <w:bookmarkStart w:id="117" w:name="ref-wood2019"/>
     <w:p>
       <w:pPr>
         <w:pStyle w:val="Bibliography"/>
@@ -5468,7 +5422,7 @@
       <w:r>
         <w:t xml:space="preserve"> </w:t>
       </w:r>
-      <w:hyperlink r:id="rId117">
+      <w:hyperlink r:id="rId116">
         <w:r>
           <w:rPr>
             <w:rStyle w:val="Hyperlink"/>
@@ -5480,8 +5434,8 @@
         <w:t xml:space="preserve">.</w:t>
       </w:r>
     </w:p>
-    <w:bookmarkEnd w:id="118"/>
-    <w:bookmarkStart w:id="119" w:name="ref-yasumizu2021"/>
+    <w:bookmarkEnd w:id="117"/>
+    <w:bookmarkStart w:id="118" w:name="ref-yasumizu2021"/>
     <w:p>
       <w:pPr>
         <w:pStyle w:val="Bibliography"/>
@@ -5530,10 +5484,10 @@
         <w:t xml:space="preserve">37 (10): 1465–67.</w:t>
       </w:r>
     </w:p>
+    <w:bookmarkEnd w:id="118"/>
     <w:bookmarkEnd w:id="119"/>
     <w:bookmarkEnd w:id="120"/>
-    <w:bookmarkEnd w:id="121"/>
-    <w:bookmarkStart w:id="136" w:name="supplementary-material"/>
+    <w:bookmarkStart w:id="135" w:name="supplementary-material"/>
     <w:p>
       <w:pPr>
         <w:pStyle w:val="Heading1"/>
@@ -5555,7 +5509,7 @@
       <w:tr>
         <w:tc>
           <w:tcPr/>
-          <w:bookmarkStart w:id="125" w:name="suppfig-depth"/>
+          <w:bookmarkStart w:id="124" w:name="suppfig-depth"/>
           <w:p>
             <w:pPr>
               <w:pStyle w:val="Compact"/>
@@ -5566,18 +5520,18 @@
                 <wp:inline>
                   <wp:extent cx="5943600" cy="3714749"/>
                   <wp:effectExtent b="0" l="0" r="0" t="0"/>
-                  <wp:docPr descr="" title="" id="123" name="Picture"/>
+                  <wp:docPr descr="" title="" id="122" name="Picture"/>
                   <a:graphic>
                     <a:graphicData uri="http://schemas.openxmlformats.org/drawingml/2006/picture">
                       <pic:pic>
                         <pic:nvPicPr>
-                          <pic:cNvPr descr="figureS1.png" id="124" name="Picture"/>
+                          <pic:cNvPr descr="figureS1.png" id="123" name="Picture"/>
                           <pic:cNvPicPr>
                             <a:picLocks noChangeArrowheads="1" noChangeAspect="1"/>
                           </pic:cNvPicPr>
                         </pic:nvPicPr>
                         <pic:blipFill>
-                          <a:blip r:embed="rId122"/>
+                          <a:blip r:embed="rId121"/>
                           <a:stretch>
                             <a:fillRect/>
                           </a:stretch>
@@ -5634,7 +5588,7 @@
               <w:t xml:space="preserve">is not produced by differences in sequencing depth: the tiers that reach the floor do so at every depth, and the tiers that do not never reach it, however deeply sequenced. Point size is proportional to the number of libraries in each tier × bin.</w:t>
             </w:r>
           </w:p>
-          <w:bookmarkEnd w:id="125"/>
+          <w:bookmarkEnd w:id="124"/>
         </w:tc>
       </w:tr>
     </w:tbl>
@@ -5659,7 +5613,7 @@
       <w:tr>
         <w:tc>
           <w:tcPr/>
-          <w:bookmarkStart w:id="126" w:name="supptbl-types"/>
+          <w:bookmarkStart w:id="125" w:name="supptbl-types"/>
           <w:tbl>
             <w:tblPr>
               <w:tblStyle w:val="Table"/>
@@ -8850,7 +8804,7 @@
               <w:t xml:space="preserve">, at the level of HPV genus.</w:t>
             </w:r>
           </w:p>
-          <w:bookmarkEnd w:id="126"/>
+          <w:bookmarkEnd w:id="125"/>
         </w:tc>
       </w:tr>
     </w:tbl>
@@ -8875,7 +8829,7 @@
       <w:tr>
         <w:tc>
           <w:tcPr/>
-          <w:bookmarkStart w:id="127" w:name="supptbl-productive"/>
+          <w:bookmarkStart w:id="126" w:name="supptbl-productive"/>
           <w:tbl>
             <w:tblPr>
               <w:tblStyle w:val="Table"/>
@@ -9574,7 +9528,7 @@
               <w:t xml:space="preserve">).</w:t>
             </w:r>
           </w:p>
-          <w:bookmarkEnd w:id="127"/>
+          <w:bookmarkEnd w:id="126"/>
         </w:tc>
       </w:tr>
     </w:tbl>
@@ -9599,7 +9553,7 @@
       <w:tr>
         <w:tc>
           <w:tcPr/>
-          <w:bookmarkStart w:id="128" w:name="supptbl-bayes"/>
+          <w:bookmarkStart w:id="127" w:name="supptbl-bayes"/>
           <w:tbl>
             <w:tblPr>
               <w:tblStyle w:val="Table"/>
@@ -10179,7 +10133,7 @@
               <w:t xml:space="preserve">(3) prior gives an even larger posterior OR, 10,715 [3,250, 46,581], confirming robustness). Sequencing depth is modelled per 10-fold (log₁₀) change in library size.</w:t>
             </w:r>
           </w:p>
-          <w:bookmarkEnd w:id="128"/>
+          <w:bookmarkEnd w:id="127"/>
         </w:tc>
       </w:tr>
     </w:tbl>
@@ -10204,7 +10158,7 @@
       <w:tr>
         <w:tc>
           <w:tcPr/>
-          <w:bookmarkStart w:id="129" w:name="supptbl-cin"/>
+          <w:bookmarkStart w:id="128" w:name="supptbl-cin"/>
           <w:tbl>
             <w:tblPr>
               <w:tblStyle w:val="Table"/>
@@ -10585,7 +10539,7 @@
               <w:t xml:space="preserve">= 0.0038). Retaining them is therefore the conservative analytical choice: the small floor-level excess of neoplasia over skin reported in the main text is an upper bound.</w:t>
             </w:r>
           </w:p>
-          <w:bookmarkEnd w:id="129"/>
+          <w:bookmarkEnd w:id="128"/>
         </w:tc>
       </w:tr>
     </w:tbl>
@@ -10610,7 +10564,7 @@
       <w:tr>
         <w:tc>
           <w:tcPr/>
-          <w:bookmarkStart w:id="130" w:name="supptbl-trace"/>
+          <w:bookmarkStart w:id="129" w:name="supptbl-trace"/>
           <w:tbl>
             <w:tblPr>
               <w:tblStyle w:val="Table"/>
@@ -13284,7 +13238,7 @@
               <w:t xml:space="preserve">, from HPV type to HPV genus.</w:t>
             </w:r>
           </w:p>
-          <w:bookmarkEnd w:id="130"/>
+          <w:bookmarkEnd w:id="129"/>
         </w:tc>
       </w:tr>
     </w:tbl>
@@ -13309,7 +13263,7 @@
       <w:tr>
         <w:tc>
           <w:tcPr/>
-          <w:bookmarkStart w:id="134" w:name="suppfig-genus"/>
+          <w:bookmarkStart w:id="133" w:name="suppfig-genus"/>
           <w:p>
             <w:pPr>
               <w:pStyle w:val="Compact"/>
@@ -13320,18 +13274,18 @@
                 <wp:inline>
                   <wp:extent cx="5943600" cy="3622765"/>
                   <wp:effectExtent b="0" l="0" r="0" t="0"/>
-                  <wp:docPr descr="" title="" id="132" name="Picture"/>
+                  <wp:docPr descr="" title="" id="131" name="Picture"/>
                   <a:graphic>
                     <a:graphicData uri="http://schemas.openxmlformats.org/drawingml/2006/picture">
                       <pic:pic>
                         <pic:nvPicPr>
-                          <pic:cNvPr descr="figureS2.png" id="133" name="Picture"/>
+                          <pic:cNvPr descr="figureS2.png" id="132" name="Picture"/>
                           <pic:cNvPicPr>
                             <a:picLocks noChangeArrowheads="1" noChangeAspect="1"/>
                           </pic:cNvPicPr>
                         </pic:nvPicPr>
                         <pic:blipFill>
-                          <a:blip r:embed="rId131"/>
+                          <a:blip r:embed="rId130"/>
                           <a:stretch>
                             <a:fillRect/>
                           </a:stretch>
@@ -13418,7 +13372,7 @@
               <w:t xml:space="preserve">-axis is log-scaled and the lowest tick, labelled 0, is a placeholder for zero. A library carrying two types of different genera contributes to both, so the points within a tier need not sum to that tier’s positivity rate. Read across the bottom row, the figure is the type landscape of the study in one panel: the productive controls are alpha-dominated (39/44 libraries, 88% [77–96]) with a gamma minority (10% [3.1–20]) and no beta at all, the repertoire of cutaneous and mucocutaneous warts; the EV biopsies are the mirror image, essentially pure beta (10/10, 95% [78–100]), the genus the syndrome is defined by; peri-lesional mucosa is purely alpha (15/15), carrying its adjacent condylomata’s types and nothing cutaneous; cell lines are alpha (13% [10–15]), the integrated HPV16/HPV18 contamination signature; unselected skin is flat and low, with alpha, beta and gamma at indistinguishable rates near 0.27% [0.16–0.40] and the study’s only nu detections (2/7327 libraries, HPV41), the profile of a sparse commensal reservoir rather than of any one disease; and cutaneous neoplasia is the one tissue tier in which beta exceeds alpha (2.6% [1.3–4.3] versus 1.9% [0.86–3.4]), consistent with a beta-HPV footprint, though at prevalences one to two orders of magnitude below the productive tiers. The mu genus (HPV1, the classic plantar-wart type) was detected in no tier.</w:t>
             </w:r>
           </w:p>
-          <w:bookmarkEnd w:id="134"/>
+          <w:bookmarkEnd w:id="133"/>
         </w:tc>
       </w:tr>
     </w:tbl>
@@ -13443,7 +13397,7 @@
       <w:tr>
         <w:tc>
           <w:tcPr/>
-          <w:bookmarkStart w:id="135" w:name="supptbl-coinf"/>
+          <w:bookmarkStart w:id="134" w:name="supptbl-coinf"/>
           <w:tbl>
             <w:tblPr>
               <w:tblStyle w:val="Table"/>
@@ -15634,11 +15588,11 @@
               <w:t xml:space="preserve">, where 14 HPV11 and 13 HPV42 calls are distributed over 15 libraries. Requiring both partners to clear a stricter bar (breadth ≥ 0.70 and depth ≥ 5× for each) leaves 9 libraries from 3 donors: one condyloma lesion (CA_1) and two peri-lesional specimens (CON_1, CON_3). Their dominance relation is asymmetric but not cleanly so. HPV11 is the deeper type in all five condyloma lesions, exceeding HPV42 48- to 4,100-fold in the three with a strong HPV11 signal (CA_1, CA_4, CA_5) and 2- to 4-fold in the other two; in peri-lesional mucosa HPV42 is the deeper type in CON_1 and CON_3, the two specimens where it is unambiguous (955× versus 138×, and 3,816× versus 9×, i.e. 7-fold and 410-fold), whereas in CON_2, CON_4 and CON_5, where HPV42 barely clears the assignment threshold, HPV11 remains the deeper type. Whether that reflects a genuine tissue difference in which type predominates, or merely that HPV42 clears the threshold only where it happens to be abundant, cannot be settled from three donors of one study: it is a hypothesis the data motivate, not a result they support.</w:t>
             </w:r>
           </w:p>
-          <w:bookmarkEnd w:id="135"/>
+          <w:bookmarkEnd w:id="134"/>
         </w:tc>
       </w:tr>
     </w:tbl>
-    <w:bookmarkEnd w:id="136"/>
+    <w:bookmarkEnd w:id="135"/>
     <w:sectPr>
       <w:headerReference r:id="rId9" w:type="default"/>
       <w:pgSz w:h="15840" w:w="12240"/>

</xml_diff>

<commit_message>
Trim abstract from 292 to 250 words
Tightened phrasing throughout, keeping every statistic and both models: shorter
methods clauses, "controls" for "productive controls" on second mention,
"Fisher OR" for "Fisher exact OR", "marginally above" for "above the near-zero
baseline of", and dropped hedges (roughly, thus, nonetheless, dominant). No
result or number was removed.

Co-Authored-By: Claude Opus 4.8 <noreply@anthropic.com>
</commit_message>
<xml_diff>
--- a/manuscript/manuscript.docx
+++ b/manuscript/manuscript.docx
@@ -40,7 +40,7 @@
         <w:pStyle w:val="FirstParagraph"/>
       </w:pPr>
       <w:r>
-        <w:t xml:space="preserve">Most human papillomaviruses (HPVs) are cutaneous beta- and gamma-types that reside on skin as a commensal reservoir, yet their role in cutaneous squamous cell carcinoma (cSCC) remains contested between a</w:t>
+        <w:t xml:space="preserve">Most human papillomaviruses (HPVs) are cutaneous beta- and gamma-types residing on skin as commensals, yet their role in cutaneous squamous cell carcinoma (cSCC) is contested between</w:t>
       </w:r>
       <w:r>
         <w:t xml:space="preserve"> </w:t>
@@ -52,7 +52,7 @@
         <w:t xml:space="preserve"> </w:t>
       </w:r>
       <w:r>
-        <w:t xml:space="preserve">oncogenic model and a protective-immunity model. Because standard pipelines discard the non-human reads that carry HPV signal, we re-mined public human RNA-seq across skin and related tissues with a uniform pipeline that screens each library for papillomavirus reads, types positives against the full reference panel, and scores productive infection from late (L1 major-capsid) transcript expression. To control the two dominant confounders, we flagged cell-line and engineered material and scored each library as papillomavirus reads-per-million, neutralising sequencing depth. HPV signal was concentrated in non-primary material: cell-line and engineered libraries were roughly five-fold enriched for positivity (OR 4.7–5.3,</w:t>
+        <w:t xml:space="preserve">oncogenic and protective-immunity models. Because standard pipelines discard the non-human reads carrying HPV signal, we re-mined public human RNA-seq across skin with a pipeline that screens each library for papillomavirus reads, types positives against the full panel, and scores productive infection from late (L1 major-capsid) transcripts. To control the two confounders, we flagged cell-line and engineered material and scored each library as papillomavirus reads-per-million. HPV signal was concentrated in non-primary material: cell-line and engineered libraries were five-fold enriched for positivity (OR 4.7–5.3,</w:t>
       </w:r>
       <w:r>
         <w:t xml:space="preserve"> </w:t>
@@ -68,7 +68,7 @@
         <w:t xml:space="preserve"> </w:t>
       </w:r>
       <w:r>
-        <w:t xml:space="preserve">&lt; 10⁻⁸) and dominated by integrated HPV16/HPV18, whereas primary skin carried HPV at only 2–4%. Productive infection was abundant in warts and epidermodysplasia verruciformis (64% of libraries). By contrast, cSCC and actinic keratosis, sequenced almost four times more deeply than the productive controls, reached the control-calibrated detection floor in only 1.4% of libraries against 93.2% of productive controls (Fisher exact OR 8,296), and their median burden was six orders of magnitude lower. Depth-adjusted, neoplasia did sit above the near-zero baseline of unselected skin (OR 10,</w:t>
+        <w:t xml:space="preserve">&lt; 10⁻⁸), dominated by integrated HPV16/HPV18, whereas primary skin carried HPV at only 2–4%. Productive infection was abundant in warts and epidermodysplasia verruciformis (64% of libraries). By contrast, cSCC and actinic keratosis, though sequenced four times more deeply, reached the detection floor in only 1.4% of libraries versus 93.2% of controls (Fisher OR 8,296), with median burden six orders of magnitude lower. Depth-adjusted, neoplasia sat marginally above unselected skin (OR 10,</w:t>
       </w:r>
       <w:r>
         <w:t xml:space="preserve"> </w:t>
@@ -100,7 +100,7 @@
         <w:t xml:space="preserve"> </w:t>
       </w:r>
       <w:r>
-        <w:t xml:space="preserve">= 3.3×10⁻⁷) that deeper sequencing never converted into productive-level signal. A minority of lesions nonetheless harboured bona fide productive gamma-/alpha-HPV infection (HPV12, HPV96, HPV182, HPV16). Cutaneous HPV is thus productive in warts but transcriptionally quiet in healthy skin and carcinoma: a trace, non-productive footprint that both contested models must accommodate. Beyond HPV, this contamination-aware, depth-normalised framework can mine the discarded fraction of public transcriptomes.</w:t>
+        <w:t xml:space="preserve">= 3.3×10⁻⁷) that deeper sequencing never made productive. A minority of lesions harboured genuine productive gamma-/alpha-HPV infection (HPV12, HPV96, HPV182, HPV16). Cutaneous HPV is productive in warts but quiet in healthy skin and carcinoma: a trace, non-productive footprint both models must accommodate. Beyond HPV, this contamination-aware, depth-normalised framework can mine the discarded fraction of public transcriptomes.</w:t>
       </w:r>
     </w:p>
     <w:p>

</xml_diff>

<commit_message>
results: say which scale the E1:E2 numbers are on
The cervical validation sentence quoted -1.48, -0.36 and 1.47 as "the median
E1:E2", but those are log2 values from the median_log2 column, and a ratio
cannot be negative. Worse, the preceding sentence quotes 129.48, 0.27, 0.49 and
0.04 from the fold column, so two different scales were being reported as the
same quantity two sentences apart.

Both are now labelled. The linear values are "the median E1:E2 ratio", and the
cervical gradient is introduced as being on the log2 scale of figure 1C, which
is what that axis plots, with the eightfold shift stated as applying to the
ratio itself. Same fix in the long and short versions. No numbers changed.

Short version still within every JID limit.

Co-Authored-By: Claude Opus 5 (1M context) <noreply@anthropic.com>
</commit_message>
<xml_diff>
--- a/manuscript/manuscript.docx
+++ b/manuscript/manuscript.docx
@@ -2625,7 +2625,7 @@
         <w:pStyle w:val="BodyText"/>
       </w:pPr>
       <w:r>
-        <w:t xml:space="preserve">The transcripts themselves carry an independent signature of that artefact, in two forms. E1 and E2 are encoded on the same early polycistronic message, so their read counts should track one another; integration characteristically disrupts the E2 open reading frame while sparing E1, inverting the ratio. Cell-line libraries show a median E1:E2 of 129, against 0.27 in productive controls, 0.49 in unselected skin and 0.04 in neoplasia, and the ratio separates cell lines from productive primary infection almost completely (AUC 0.97, Wilcoxon</w:t>
+        <w:t xml:space="preserve">The transcripts themselves carry an independent signature of that artefact, in two forms. E1 and E2 are encoded on the same early polycistronic message, so their read counts should track one another; integration characteristically disrupts the E2 open reading frame while sparing E1, inverting the ratio. Cell-line libraries show a median E1:E2 ratio of 129, against 0.27 in productive controls, 0.49 in unselected skin and 0.04 in neoplasia, and the ratio separates cell lines from productive primary infection almost completely (AUC 0.97, Wilcoxon</w:t>
       </w:r>
       <w:r>
         <w:t xml:space="preserve"> </w:t>
@@ -2708,46 +2708,22 @@
         <w:pStyle w:val="BodyText"/>
       </w:pPr>
       <w:r>
-        <w:t xml:space="preserve">The ratio was then read against a progression in which the answer is known independently. A cervical series (SRP252916) sequenced HPV16-positive normal epithelium, high-grade squamous intraepithelial lesion and squamous carcinoma, six cases per arm under one rRNA-depleted protocol, alongside six HPV-negative normal controls; the arms are the submitting study’s, and the tissue and the progression are ones the marker was not developed on. The HPV-negative controls returned no HPV of any type, and across the three positive arms the median E1:E2 rises monotonically with grade, from -1.48 in normal epithelium (</w:t>
+        <w:t xml:space="preserve">The ratio was then read against a progression in which the answer is known independently. A cervical series (SRP252916) sequenced HPV16-positive normal epithelium, high-grade squamous intraepithelial lesion and squamous carcinoma, six cases per arm under one rRNA-depleted protocol, alongside six HPV-negative normal controls; the arms are the submitting study’s, and the tissue and the progression are ones the marker was not developed on. The HPV-negative controls returned no HPV of any type, and across the three positive arms the median ratio rises monotonically with grade. On the log</w:t>
       </w:r>
       <w:r>
         <w:rPr>
-          <w:i/>
-          <w:iCs/>
+          <w:vertAlign w:val="subscript"/>
         </w:rPr>
-        <w:t xml:space="preserve">n</w:t>
-      </w:r>
-      <w:r>
-        <w:t xml:space="preserve"> </w:t>
-      </w:r>
-      <w:r>
-        <w:t xml:space="preserve">= 3) through -0.36 in HSIL (</w:t>
-      </w:r>
-      <w:r>
-        <w:rPr>
-          <w:i/>
-          <w:iCs/>
-        </w:rPr>
-        <w:t xml:space="preserve">n</w:t>
-      </w:r>
-      <w:r>
-        <w:t xml:space="preserve"> </w:t>
-      </w:r>
-      <w:r>
-        <w:t xml:space="preserve">= 6) to 1.47 in carcinoma (</w:t>
-      </w:r>
-      <w:r>
-        <w:rPr>
-          <w:i/>
-          <w:iCs/>
-        </w:rPr>
-        <w:t xml:space="preserve">n</w:t>
-      </w:r>
-      <w:r>
-        <w:t xml:space="preserve"> </w:t>
-      </w:r>
-      <w:r>
-        <w:t xml:space="preserve">= 6), a shift of roughly eightfold in the direction integration predicts (</w:t>
+        <w:t xml:space="preserve">2</w:t>
+      </w:r>
+      <w:r>
+        <w:t xml:space="preserve"> </w:t>
+      </w:r>
+      <w:r>
+        <w:t xml:space="preserve">scale of</w:t>
+      </w:r>
+      <w:r>
+        <w:t xml:space="preserve"> </w:t>
       </w:r>
       <w:hyperlink w:anchor="fig-integration">
         <w:r>
@@ -2761,7 +2737,46 @@
         <w:t xml:space="preserve"> </w:t>
       </w:r>
       <w:r>
-        <w:t xml:space="preserve">C). Late transcription tracks the same axis without being part of the criterion: the libraries called episomal carry abundant L1, while those with a disrupted ratio carry almost none. The binary call is the weaker readout at this size, separating the carcinoma and lesion arms from normal epithelium (2 and 2 of six against 0 of 3) but not from each other, and the normal-epithelium arm is thin: two of its six libraries yielded no HPV reads and a third carried two. The gradient, not the threshold, is what this series supports.</w:t>
+        <w:t xml:space="preserve">C it runs from -1.48 in normal epithelium (</w:t>
+      </w:r>
+      <w:r>
+        <w:rPr>
+          <w:i/>
+          <w:iCs/>
+        </w:rPr>
+        <w:t xml:space="preserve">n</w:t>
+      </w:r>
+      <w:r>
+        <w:t xml:space="preserve"> </w:t>
+      </w:r>
+      <w:r>
+        <w:t xml:space="preserve">= 3) through -0.36 in HSIL (</w:t>
+      </w:r>
+      <w:r>
+        <w:rPr>
+          <w:i/>
+          <w:iCs/>
+        </w:rPr>
+        <w:t xml:space="preserve">n</w:t>
+      </w:r>
+      <w:r>
+        <w:t xml:space="preserve"> </w:t>
+      </w:r>
+      <w:r>
+        <w:t xml:space="preserve">= 6) to 1.47 in carcinoma (</w:t>
+      </w:r>
+      <w:r>
+        <w:rPr>
+          <w:i/>
+          <w:iCs/>
+        </w:rPr>
+        <w:t xml:space="preserve">n</w:t>
+      </w:r>
+      <w:r>
+        <w:t xml:space="preserve"> </w:t>
+      </w:r>
+      <w:r>
+        <w:t xml:space="preserve">= 6), which is a shift of roughly eightfold in the ratio itself, in the direction integration predicts. Late transcription tracks the same axis without being part of the criterion: the libraries called episomal carry abundant L1, while those with a disrupted ratio carry almost none. The binary call is the weaker readout at this size, separating the carcinoma and lesion arms from normal epithelium (2 and 2 of six against 0 of 3) but not from each other, and the normal-epithelium arm is thin: two of its six libraries yielded no HPV reads and a third carried two. The gradient, not the threshold, is what this series supports.</w:t>
       </w:r>
     </w:p>
     <w:tbl>

</xml_diff>

<commit_message>
manuscript: add funding statements
Adds a Funding section carrying both statements, placed after the Discussion and
before the References in the long and short versions via a shared _funding.qmd,
so the two cannot drift apart.

Both are reproduced verbatim. The DURABLE statement in particular is a mandated
funder text whose wording, including the disclaimer sentences about the European
Union and the European Health and Digital Executive Agency, is not ours to
paraphrase; it was diffed against the supplied text to confirm a
character-for-character match.

The short version remains within the JID limit either way: 2,907 words with
funding treated as back matter, 2,987 if it is counted against the main text.

Co-Authored-By: Claude Opus 5 (1M context) <noreply@anthropic.com>
</commit_message>
<xml_diff>
--- a/manuscript/manuscript.docx
+++ b/manuscript/manuscript.docx
@@ -23,7 +23,7 @@
         <w:pStyle w:val="Date"/>
       </w:pPr>
       <w:r>
-        <w:t xml:space="preserve">2026-07-06</w:t>
+        <w:t xml:space="preserve">2026-08-24</w:t>
       </w:r>
     </w:p>
     <w:bookmarkStart w:id="20" w:name="abstract"/>
@@ -5344,17 +5344,43 @@
     </w:p>
     <w:bookmarkEnd w:id="69"/>
     <w:bookmarkEnd w:id="70"/>
-    <w:bookmarkStart w:id="203" w:name="references"/>
+    <w:bookmarkStart w:id="71" w:name="funding"/>
     <w:p>
       <w:pPr>
         <w:pStyle w:val="Heading2"/>
       </w:pPr>
       <w:r>
+        <w:t xml:space="preserve">Funding</w:t>
+      </w:r>
+    </w:p>
+    <w:p>
+      <w:pPr>
+        <w:pStyle w:val="FirstParagraph"/>
+      </w:pPr>
+      <w:r>
+        <w:t xml:space="preserve">This research was supported by the Estonian Research Council grant (PRG2707).</w:t>
+      </w:r>
+    </w:p>
+    <w:p>
+      <w:pPr>
+        <w:pStyle w:val="BodyText"/>
+      </w:pPr>
+      <w:r>
+        <w:t xml:space="preserve">This research was co-financed through the DURABLE project. The DURABLE project has been co-funded by the European Union, under the EU4Health Programme (EU4H), Project no. 101102733. Views and opinions expressed are however those of the authors only and do not necessarily reflect those of the European Union or the European Health and Digital Executive Agency. Neither the European Union nor the granting authority can be held responsible for them.</w:t>
+      </w:r>
+    </w:p>
+    <w:bookmarkEnd w:id="71"/>
+    <w:bookmarkStart w:id="204" w:name="references"/>
+    <w:p>
+      <w:pPr>
+        <w:pStyle w:val="Heading2"/>
+      </w:pPr>
+      <w:r>
         <w:t xml:space="preserve">References</w:t>
       </w:r>
     </w:p>
-    <w:bookmarkStart w:id="202" w:name="refs"/>
-    <w:bookmarkStart w:id="72" w:name="ref-adey2013"/>
+    <w:bookmarkStart w:id="203" w:name="refs"/>
+    <w:bookmarkStart w:id="73" w:name="ref-adey2013"/>
     <w:p>
       <w:pPr>
         <w:pStyle w:val="Bibliography"/>
@@ -5399,7 +5425,7 @@
       <w:r>
         <w:t xml:space="preserve"> </w:t>
       </w:r>
-      <w:hyperlink r:id="rId71">
+      <w:hyperlink r:id="rId72">
         <w:r>
           <w:rPr>
             <w:rStyle w:val="Hyperlink"/>
@@ -5411,8 +5437,8 @@
         <w:t xml:space="preserve">.</w:t>
       </w:r>
     </w:p>
-    <w:bookmarkEnd w:id="72"/>
-    <w:bookmarkStart w:id="74" w:name="ref-antonsson2000"/>
+    <w:bookmarkEnd w:id="73"/>
+    <w:bookmarkStart w:id="75" w:name="ref-antonsson2000"/>
     <w:p>
       <w:pPr>
         <w:pStyle w:val="Bibliography"/>
@@ -5445,7 +5471,7 @@
       <w:r>
         <w:t xml:space="preserve"> </w:t>
       </w:r>
-      <w:hyperlink r:id="rId73">
+      <w:hyperlink r:id="rId74">
         <w:r>
           <w:rPr>
             <w:rStyle w:val="Hyperlink"/>
@@ -5457,8 +5483,8 @@
         <w:t xml:space="preserve">.</w:t>
       </w:r>
     </w:p>
-    <w:bookmarkEnd w:id="74"/>
-    <w:bookmarkStart w:id="76" w:name="ref-arron2011"/>
+    <w:bookmarkEnd w:id="75"/>
+    <w:bookmarkStart w:id="77" w:name="ref-arron2011"/>
     <w:p>
       <w:pPr>
         <w:pStyle w:val="Bibliography"/>
@@ -5491,7 +5517,7 @@
       <w:r>
         <w:t xml:space="preserve"> </w:t>
       </w:r>
-      <w:hyperlink r:id="rId75">
+      <w:hyperlink r:id="rId76">
         <w:r>
           <w:rPr>
             <w:rStyle w:val="Hyperlink"/>
@@ -5503,8 +5529,8 @@
         <w:t xml:space="preserve">.</w:t>
       </w:r>
     </w:p>
-    <w:bookmarkEnd w:id="76"/>
-    <w:bookmarkStart w:id="78" w:name="ref-arroyomuhr2021"/>
+    <w:bookmarkEnd w:id="77"/>
+    <w:bookmarkStart w:id="79" w:name="ref-arroyomuhr2021"/>
     <w:p>
       <w:pPr>
         <w:pStyle w:val="Bibliography"/>
@@ -5537,7 +5563,7 @@
       <w:r>
         <w:t xml:space="preserve"> </w:t>
       </w:r>
-      <w:hyperlink r:id="rId77">
+      <w:hyperlink r:id="rId78">
         <w:r>
           <w:rPr>
             <w:rStyle w:val="Hyperlink"/>
@@ -5549,8 +5575,8 @@
         <w:t xml:space="preserve">.</w:t>
       </w:r>
     </w:p>
-    <w:bookmarkEnd w:id="78"/>
-    <w:bookmarkStart w:id="80" w:name="ref-asplund2019"/>
+    <w:bookmarkEnd w:id="79"/>
+    <w:bookmarkStart w:id="81" w:name="ref-asplund2019"/>
     <w:p>
       <w:pPr>
         <w:pStyle w:val="Bibliography"/>
@@ -5583,7 +5609,7 @@
       <w:r>
         <w:t xml:space="preserve"> </w:t>
       </w:r>
-      <w:hyperlink r:id="rId79">
+      <w:hyperlink r:id="rId80">
         <w:r>
           <w:rPr>
             <w:rStyle w:val="Hyperlink"/>
@@ -5595,8 +5621,8 @@
         <w:t xml:space="preserve">.</w:t>
       </w:r>
     </w:p>
-    <w:bookmarkEnd w:id="80"/>
-    <w:bookmarkStart w:id="82" w:name="ref-bhargava2025"/>
+    <w:bookmarkEnd w:id="81"/>
+    <w:bookmarkStart w:id="83" w:name="ref-bhargava2025"/>
     <w:p>
       <w:pPr>
         <w:pStyle w:val="Bibliography"/>
@@ -5641,7 +5667,7 @@
       <w:r>
         <w:t xml:space="preserve"> </w:t>
       </w:r>
-      <w:hyperlink r:id="rId81">
+      <w:hyperlink r:id="rId82">
         <w:r>
           <w:rPr>
             <w:rStyle w:val="Hyperlink"/>
@@ -5653,8 +5679,8 @@
         <w:t xml:space="preserve">.</w:t>
       </w:r>
     </w:p>
-    <w:bookmarkEnd w:id="82"/>
-    <w:bookmarkStart w:id="83" w:name="ref-borgogna2014"/>
+    <w:bookmarkEnd w:id="83"/>
+    <w:bookmarkStart w:id="84" w:name="ref-borgogna2014"/>
     <w:p>
       <w:pPr>
         <w:pStyle w:val="Bibliography"/>
@@ -5696,8 +5722,8 @@
         <w:t xml:space="preserve">27: 1101–15.</w:t>
       </w:r>
     </w:p>
-    <w:bookmarkEnd w:id="83"/>
-    <w:bookmarkStart w:id="85" w:name="ref-borgogna2018"/>
+    <w:bookmarkEnd w:id="84"/>
+    <w:bookmarkStart w:id="86" w:name="ref-borgogna2018"/>
     <w:p>
       <w:pPr>
         <w:pStyle w:val="Bibliography"/>
@@ -5747,7 +5773,7 @@
       <w:r>
         <w:t xml:space="preserve"> </w:t>
       </w:r>
-      <w:hyperlink r:id="rId84">
+      <w:hyperlink r:id="rId85">
         <w:r>
           <w:rPr>
             <w:rStyle w:val="Hyperlink"/>
@@ -5759,8 +5785,8 @@
         <w:t xml:space="preserve">.</w:t>
       </w:r>
     </w:p>
-    <w:bookmarkEnd w:id="85"/>
-    <w:bookmarkStart w:id="87" w:name="ref-boulet2009"/>
+    <w:bookmarkEnd w:id="86"/>
+    <w:bookmarkStart w:id="88" w:name="ref-boulet2009"/>
     <w:p>
       <w:pPr>
         <w:pStyle w:val="Bibliography"/>
@@ -5828,7 +5854,7 @@
       <w:r>
         <w:t xml:space="preserve"> </w:t>
       </w:r>
-      <w:hyperlink r:id="rId86">
+      <w:hyperlink r:id="rId87">
         <w:r>
           <w:rPr>
             <w:rStyle w:val="Hyperlink"/>
@@ -5840,8 +5866,8 @@
         <w:t xml:space="preserve">.</w:t>
       </w:r>
     </w:p>
-    <w:bookmarkEnd w:id="87"/>
-    <w:bookmarkStart w:id="89" w:name="ref-bzhalava2014"/>
+    <w:bookmarkEnd w:id="88"/>
+    <w:bookmarkStart w:id="90" w:name="ref-bzhalava2014"/>
     <w:p>
       <w:pPr>
         <w:pStyle w:val="Bibliography"/>
@@ -5874,7 +5900,7 @@
       <w:r>
         <w:t xml:space="preserve"> </w:t>
       </w:r>
-      <w:hyperlink r:id="rId88">
+      <w:hyperlink r:id="rId89">
         <w:r>
           <w:rPr>
             <w:rStyle w:val="Hyperlink"/>
@@ -5886,8 +5912,8 @@
         <w:t xml:space="preserve">.</w:t>
       </w:r>
     </w:p>
-    <w:bookmarkEnd w:id="89"/>
-    <w:bookmarkStart w:id="90" w:name="ref-bzhalava2015"/>
+    <w:bookmarkEnd w:id="90"/>
+    <w:bookmarkStart w:id="91" w:name="ref-bzhalava2015"/>
     <w:p>
       <w:pPr>
         <w:pStyle w:val="Bibliography"/>
@@ -5918,8 +5944,8 @@
         <w:t xml:space="preserve">476: 341–44.</w:t>
       </w:r>
     </w:p>
-    <w:bookmarkEnd w:id="90"/>
-    <w:bookmarkStart w:id="92" w:name="ref-cantalupo2015"/>
+    <w:bookmarkEnd w:id="91"/>
+    <w:bookmarkStart w:id="93" w:name="ref-cantalupo2015"/>
     <w:p>
       <w:pPr>
         <w:pStyle w:val="Bibliography"/>
@@ -5973,7 +5999,7 @@
       <w:r>
         <w:t xml:space="preserve"> </w:t>
       </w:r>
-      <w:hyperlink r:id="rId91">
+      <w:hyperlink r:id="rId92">
         <w:r>
           <w:rPr>
             <w:rStyle w:val="Hyperlink"/>
@@ -5985,8 +6011,8 @@
         <w:t xml:space="preserve">.</w:t>
       </w:r>
     </w:p>
-    <w:bookmarkEnd w:id="92"/>
-    <w:bookmarkStart w:id="94" w:name="ref-cantalupo2019"/>
+    <w:bookmarkEnd w:id="93"/>
+    <w:bookmarkStart w:id="95" w:name="ref-cantalupo2019"/>
     <w:p>
       <w:pPr>
         <w:pStyle w:val="Bibliography"/>
@@ -6031,7 +6057,7 @@
       <w:r>
         <w:t xml:space="preserve"> </w:t>
       </w:r>
-      <w:hyperlink r:id="rId93">
+      <w:hyperlink r:id="rId94">
         <w:r>
           <w:rPr>
             <w:rStyle w:val="Hyperlink"/>
@@ -6043,8 +6069,8 @@
         <w:t xml:space="preserve">.</w:t>
       </w:r>
     </w:p>
-    <w:bookmarkEnd w:id="94"/>
-    <w:bookmarkStart w:id="96" w:name="ref-chen2018"/>
+    <w:bookmarkEnd w:id="95"/>
+    <w:bookmarkStart w:id="97" w:name="ref-chen2018"/>
     <w:p>
       <w:pPr>
         <w:pStyle w:val="Bibliography"/>
@@ -6089,7 +6115,7 @@
       <w:r>
         <w:t xml:space="preserve"> </w:t>
       </w:r>
-      <w:hyperlink r:id="rId95">
+      <w:hyperlink r:id="rId96">
         <w:r>
           <w:rPr>
             <w:rStyle w:val="Hyperlink"/>
@@ -6101,8 +6127,8 @@
         <w:t xml:space="preserve">.</w:t>
       </w:r>
     </w:p>
-    <w:bookmarkEnd w:id="96"/>
-    <w:bookmarkStart w:id="98" w:name="ref-cheung2008"/>
+    <w:bookmarkEnd w:id="97"/>
+    <w:bookmarkStart w:id="99" w:name="ref-cheung2008"/>
     <w:p>
       <w:pPr>
         <w:pStyle w:val="Bibliography"/>
@@ -6135,7 +6161,7 @@
       <w:r>
         <w:t xml:space="preserve"> </w:t>
       </w:r>
-      <w:hyperlink r:id="rId97">
+      <w:hyperlink r:id="rId98">
         <w:r>
           <w:rPr>
             <w:rStyle w:val="Hyperlink"/>
@@ -6147,8 +6173,8 @@
         <w:t xml:space="preserve">.</w:t>
       </w:r>
     </w:p>
-    <w:bookmarkEnd w:id="98"/>
-    <w:bookmarkStart w:id="100" w:name="ref-chikhi2024"/>
+    <w:bookmarkEnd w:id="99"/>
+    <w:bookmarkStart w:id="101" w:name="ref-chikhi2024"/>
     <w:p>
       <w:pPr>
         <w:pStyle w:val="Bibliography"/>
@@ -6178,7 +6204,7 @@
       <w:r>
         <w:t xml:space="preserve"> </w:t>
       </w:r>
-      <w:hyperlink r:id="rId99">
+      <w:hyperlink r:id="rId100">
         <w:r>
           <w:rPr>
             <w:rStyle w:val="Hyperlink"/>
@@ -6190,8 +6216,8 @@
         <w:t xml:space="preserve">.</w:t>
       </w:r>
     </w:p>
-    <w:bookmarkEnd w:id="100"/>
-    <w:bookmarkStart w:id="102" w:name="ref-choi2018"/>
+    <w:bookmarkEnd w:id="101"/>
+    <w:bookmarkStart w:id="103" w:name="ref-choi2018"/>
     <w:p>
       <w:pPr>
         <w:pStyle w:val="Bibliography"/>
@@ -6263,7 +6289,7 @@
       <w:r>
         <w:t xml:space="preserve"> </w:t>
       </w:r>
-      <w:hyperlink r:id="rId101">
+      <w:hyperlink r:id="rId102">
         <w:r>
           <w:rPr>
             <w:rStyle w:val="Hyperlink"/>
@@ -6275,8 +6301,8 @@
         <w:t xml:space="preserve">.</w:t>
       </w:r>
     </w:p>
-    <w:bookmarkEnd w:id="102"/>
-    <w:bookmarkStart w:id="104" w:name="ref-collins2009"/>
+    <w:bookmarkEnd w:id="103"/>
+    <w:bookmarkStart w:id="105" w:name="ref-collins2009"/>
     <w:p>
       <w:pPr>
         <w:pStyle w:val="Bibliography"/>
@@ -6321,7 +6347,7 @@
       <w:r>
         <w:t xml:space="preserve"> </w:t>
       </w:r>
-      <w:hyperlink r:id="rId103">
+      <w:hyperlink r:id="rId104">
         <w:r>
           <w:rPr>
             <w:rStyle w:val="Hyperlink"/>
@@ -6333,8 +6359,8 @@
         <w:t xml:space="preserve">.</w:t>
       </w:r>
     </w:p>
-    <w:bookmarkEnd w:id="104"/>
-    <w:bookmarkStart w:id="106" w:name="ref-danecek2021"/>
+    <w:bookmarkEnd w:id="105"/>
+    <w:bookmarkStart w:id="107" w:name="ref-danecek2021"/>
     <w:p>
       <w:pPr>
         <w:pStyle w:val="Bibliography"/>
@@ -6388,7 +6414,7 @@
       <w:r>
         <w:t xml:space="preserve"> </w:t>
       </w:r>
-      <w:hyperlink r:id="rId105">
+      <w:hyperlink r:id="rId106">
         <w:r>
           <w:rPr>
             <w:rStyle w:val="Hyperlink"/>
@@ -6400,8 +6426,8 @@
         <w:t xml:space="preserve">.</w:t>
       </w:r>
     </w:p>
-    <w:bookmarkEnd w:id="106"/>
-    <w:bookmarkStart w:id="108" w:name="ref-devitt2019"/>
+    <w:bookmarkEnd w:id="107"/>
+    <w:bookmarkStart w:id="109" w:name="ref-devitt2019"/>
     <w:p>
       <w:pPr>
         <w:pStyle w:val="Bibliography"/>
@@ -6458,7 +6484,7 @@
       <w:r>
         <w:t xml:space="preserve"> </w:t>
       </w:r>
-      <w:hyperlink r:id="rId107">
+      <w:hyperlink r:id="rId108">
         <w:r>
           <w:rPr>
             <w:rStyle w:val="Hyperlink"/>
@@ -6470,8 +6496,8 @@
         <w:t xml:space="preserve">.</w:t>
       </w:r>
     </w:p>
-    <w:bookmarkEnd w:id="108"/>
-    <w:bookmarkStart w:id="110" w:name="ref-ditommaso2017"/>
+    <w:bookmarkEnd w:id="109"/>
+    <w:bookmarkStart w:id="111" w:name="ref-ditommaso2017"/>
     <w:p>
       <w:pPr>
         <w:pStyle w:val="Bibliography"/>
@@ -6504,7 +6530,7 @@
       <w:r>
         <w:t xml:space="preserve"> </w:t>
       </w:r>
-      <w:hyperlink r:id="rId109">
+      <w:hyperlink r:id="rId110">
         <w:r>
           <w:rPr>
             <w:rStyle w:val="Hyperlink"/>
@@ -6516,8 +6542,8 @@
         <w:t xml:space="preserve">.</w:t>
       </w:r>
     </w:p>
-    <w:bookmarkEnd w:id="110"/>
-    <w:bookmarkStart w:id="112" w:name="ref-dobin2013"/>
+    <w:bookmarkEnd w:id="111"/>
+    <w:bookmarkStart w:id="113" w:name="ref-dobin2013"/>
     <w:p>
       <w:pPr>
         <w:pStyle w:val="Bibliography"/>
@@ -6568,7 +6594,7 @@
       <w:r>
         <w:t xml:space="preserve"> </w:t>
       </w:r>
-      <w:hyperlink r:id="rId111">
+      <w:hyperlink r:id="rId112">
         <w:r>
           <w:rPr>
             <w:rStyle w:val="Hyperlink"/>
@@ -6580,8 +6606,8 @@
         <w:t xml:space="preserve">.</w:t>
       </w:r>
     </w:p>
-    <w:bookmarkEnd w:id="112"/>
-    <w:bookmarkStart w:id="113" w:name="ref-doorbar2023"/>
+    <w:bookmarkEnd w:id="113"/>
+    <w:bookmarkStart w:id="114" w:name="ref-doorbar2023"/>
     <w:p>
       <w:pPr>
         <w:pStyle w:val="Bibliography"/>
@@ -6612,8 +6638,8 @@
         <w:t xml:space="preserve">16: 200268.</w:t>
       </w:r>
     </w:p>
-    <w:bookmarkEnd w:id="113"/>
-    <w:bookmarkStart w:id="114" w:name="ref-doorbar2012"/>
+    <w:bookmarkEnd w:id="114"/>
+    <w:bookmarkStart w:id="115" w:name="ref-doorbar2012"/>
     <w:p>
       <w:pPr>
         <w:pStyle w:val="Bibliography"/>
@@ -6644,8 +6670,8 @@
         <w:t xml:space="preserve">30 (Suppl 5): F55–70.</w:t>
       </w:r>
     </w:p>
-    <w:bookmarkEnd w:id="114"/>
-    <w:bookmarkStart w:id="115" w:name="ref-dorfer2021"/>
+    <w:bookmarkEnd w:id="115"/>
+    <w:bookmarkStart w:id="116" w:name="ref-dorfer2021"/>
     <w:p>
       <w:pPr>
         <w:pStyle w:val="Bibliography"/>
@@ -6685,8 +6711,8 @@
         <w:t xml:space="preserve">21 (2): 525–39.</w:t>
       </w:r>
     </w:p>
-    <w:bookmarkEnd w:id="115"/>
-    <w:bookmarkStart w:id="117" w:name="ref-edgar2022"/>
+    <w:bookmarkEnd w:id="116"/>
+    <w:bookmarkStart w:id="118" w:name="ref-edgar2022"/>
     <w:p>
       <w:pPr>
         <w:pStyle w:val="Bibliography"/>
@@ -6719,7 +6745,7 @@
       <w:r>
         <w:t xml:space="preserve"> </w:t>
       </w:r>
-      <w:hyperlink r:id="rId116">
+      <w:hyperlink r:id="rId117">
         <w:r>
           <w:rPr>
             <w:rStyle w:val="Hyperlink"/>
@@ -6731,8 +6757,8 @@
         <w:t xml:space="preserve">.</w:t>
       </w:r>
     </w:p>
-    <w:bookmarkEnd w:id="117"/>
-    <w:bookmarkStart w:id="118" w:name="ref-egawa2017"/>
+    <w:bookmarkEnd w:id="118"/>
+    <w:bookmarkStart w:id="119" w:name="ref-egawa2017"/>
     <w:p>
       <w:pPr>
         <w:pStyle w:val="Bibliography"/>
@@ -6763,8 +6789,8 @@
         <w:t xml:space="preserve">231: 119–27.</w:t>
       </w:r>
     </w:p>
-    <w:bookmarkEnd w:id="118"/>
-    <w:bookmarkStart w:id="120" w:name="ref-fan2023"/>
+    <w:bookmarkEnd w:id="119"/>
+    <w:bookmarkStart w:id="121" w:name="ref-fan2023"/>
     <w:p>
       <w:pPr>
         <w:pStyle w:val="Bibliography"/>
@@ -6809,7 +6835,7 @@
       <w:r>
         <w:t xml:space="preserve"> </w:t>
       </w:r>
-      <w:hyperlink r:id="rId119">
+      <w:hyperlink r:id="rId120">
         <w:r>
           <w:rPr>
             <w:rStyle w:val="Hyperlink"/>
@@ -6821,8 +6847,8 @@
         <w:t xml:space="preserve">.</w:t>
       </w:r>
     </w:p>
-    <w:bookmarkEnd w:id="120"/>
-    <w:bookmarkStart w:id="121" w:name="ref-foulongne2012"/>
+    <w:bookmarkEnd w:id="121"/>
+    <w:bookmarkStart w:id="122" w:name="ref-foulongne2012"/>
     <w:p>
       <w:pPr>
         <w:pStyle w:val="Bibliography"/>
@@ -6865,8 +6891,8 @@
         <w:t xml:space="preserve">7 (6): e38499.</w:t>
       </w:r>
     </w:p>
-    <w:bookmarkEnd w:id="121"/>
-    <w:bookmarkStart w:id="123" w:name="ref-fujimoto2019"/>
+    <w:bookmarkEnd w:id="122"/>
+    <w:bookmarkStart w:id="124" w:name="ref-fujimoto2019"/>
     <w:p>
       <w:pPr>
         <w:pStyle w:val="Bibliography"/>
@@ -6929,7 +6955,7 @@
       <w:r>
         <w:t xml:space="preserve"> </w:t>
       </w:r>
-      <w:hyperlink r:id="rId122">
+      <w:hyperlink r:id="rId123">
         <w:r>
           <w:rPr>
             <w:rStyle w:val="Hyperlink"/>
@@ -6941,8 +6967,8 @@
         <w:t xml:space="preserve">.</w:t>
       </w:r>
     </w:p>
-    <w:bookmarkEnd w:id="123"/>
-    <w:bookmarkStart w:id="125" w:name="ref-gihawi2023"/>
+    <w:bookmarkEnd w:id="124"/>
+    <w:bookmarkStart w:id="126" w:name="ref-gihawi2023"/>
     <w:p>
       <w:pPr>
         <w:pStyle w:val="Bibliography"/>
@@ -6975,7 +7001,7 @@
       <w:r>
         <w:t xml:space="preserve"> </w:t>
       </w:r>
-      <w:hyperlink r:id="rId124">
+      <w:hyperlink r:id="rId125">
         <w:r>
           <w:rPr>
             <w:rStyle w:val="Hyperlink"/>
@@ -6987,8 +7013,8 @@
         <w:t xml:space="preserve">.</w:t>
       </w:r>
     </w:p>
-    <w:bookmarkEnd w:id="125"/>
-    <w:bookmarkStart w:id="127" w:name="ref-rstanarm"/>
+    <w:bookmarkEnd w:id="126"/>
+    <w:bookmarkStart w:id="128" w:name="ref-rstanarm"/>
     <w:p>
       <w:pPr>
         <w:pStyle w:val="Bibliography"/>
@@ -7061,7 +7087,7 @@
       <w:r>
         <w:t xml:space="preserve"> </w:t>
       </w:r>
-      <w:hyperlink r:id="rId126">
+      <w:hyperlink r:id="rId127">
         <w:r>
           <w:rPr>
             <w:rStyle w:val="Hyperlink"/>
@@ -7073,8 +7099,8 @@
         <w:t xml:space="preserve">.</w:t>
       </w:r>
     </w:p>
-    <w:bookmarkEnd w:id="127"/>
-    <w:bookmarkStart w:id="128" w:name="ref-graham2017"/>
+    <w:bookmarkEnd w:id="128"/>
+    <w:bookmarkStart w:id="129" w:name="ref-graham2017"/>
     <w:p>
       <w:pPr>
         <w:pStyle w:val="Bibliography"/>
@@ -7105,8 +7131,8 @@
         <w:t xml:space="preserve">131 (17): 2201–21.</w:t>
       </w:r>
     </w:p>
-    <w:bookmarkEnd w:id="128"/>
-    <w:bookmarkStart w:id="129" w:name="ref-howley2015"/>
+    <w:bookmarkEnd w:id="129"/>
+    <w:bookmarkStart w:id="130" w:name="ref-howley2015"/>
     <w:p>
       <w:pPr>
         <w:pStyle w:val="Bibliography"/>
@@ -7137,8 +7163,8 @@
         <w:t xml:space="preserve">479-480: 290–96.</w:t>
       </w:r>
     </w:p>
-    <w:bookmarkEnd w:id="129"/>
-    <w:bookmarkStart w:id="131" w:name="ref-hultin2019"/>
+    <w:bookmarkEnd w:id="130"/>
+    <w:bookmarkStart w:id="132" w:name="ref-hultin2019"/>
     <w:p>
       <w:pPr>
         <w:pStyle w:val="Bibliography"/>
@@ -7180,7 +7206,7 @@
       <w:r>
         <w:t xml:space="preserve"> </w:t>
       </w:r>
-      <w:hyperlink r:id="rId130">
+      <w:hyperlink r:id="rId131">
         <w:r>
           <w:rPr>
             <w:rStyle w:val="Hyperlink"/>
@@ -7192,8 +7218,8 @@
         <w:t xml:space="preserve">.</w:t>
       </w:r>
     </w:p>
-    <w:bookmarkEnd w:id="131"/>
-    <w:bookmarkStart w:id="132" w:name="ref-johansson2013"/>
+    <w:bookmarkEnd w:id="132"/>
+    <w:bookmarkStart w:id="133" w:name="ref-johansson2013"/>
     <w:p>
       <w:pPr>
         <w:pStyle w:val="Bibliography"/>
@@ -7224,8 +7250,8 @@
         <w:t xml:space="preserve">11: 239–51.</w:t>
       </w:r>
     </w:p>
-    <w:bookmarkEnd w:id="132"/>
-    <w:bookmarkStart w:id="134" w:name="ref-dejong2018b"/>
+    <w:bookmarkEnd w:id="133"/>
+    <w:bookmarkStart w:id="135" w:name="ref-dejong2018b"/>
     <w:p>
       <w:pPr>
         <w:pStyle w:val="Bibliography"/>
@@ -7293,7 +7319,7 @@
       <w:r>
         <w:t xml:space="preserve"> </w:t>
       </w:r>
-      <w:hyperlink r:id="rId133">
+      <w:hyperlink r:id="rId134">
         <w:r>
           <w:rPr>
             <w:rStyle w:val="Hyperlink"/>
@@ -7305,8 +7331,8 @@
         <w:t xml:space="preserve">.</w:t>
       </w:r>
     </w:p>
-    <w:bookmarkEnd w:id="134"/>
-    <w:bookmarkStart w:id="135" w:name="ref-dejong2018a"/>
+    <w:bookmarkEnd w:id="135"/>
+    <w:bookmarkStart w:id="136" w:name="ref-dejong2018a"/>
     <w:p>
       <w:pPr>
         <w:pStyle w:val="Bibliography"/>
@@ -7337,8 +7363,8 @@
         <w:t xml:space="preserve">9: 1222.</w:t>
       </w:r>
     </w:p>
-    <w:bookmarkEnd w:id="135"/>
-    <w:bookmarkStart w:id="137" w:name="ref-kazemian2015"/>
+    <w:bookmarkEnd w:id="136"/>
+    <w:bookmarkStart w:id="138" w:name="ref-kazemian2015"/>
     <w:p>
       <w:pPr>
         <w:pStyle w:val="Bibliography"/>
@@ -7392,7 +7418,7 @@
       <w:r>
         <w:t xml:space="preserve"> </w:t>
       </w:r>
-      <w:hyperlink r:id="rId136">
+      <w:hyperlink r:id="rId137">
         <w:r>
           <w:rPr>
             <w:rStyle w:val="Hyperlink"/>
@@ -7404,8 +7430,8 @@
         <w:t xml:space="preserve">.</w:t>
       </w:r>
     </w:p>
-    <w:bookmarkEnd w:id="137"/>
-    <w:bookmarkStart w:id="138" w:name="ref-klymenko2017"/>
+    <w:bookmarkEnd w:id="138"/>
+    <w:bookmarkStart w:id="139" w:name="ref-klymenko2017"/>
     <w:p>
       <w:pPr>
         <w:pStyle w:val="Bibliography"/>
@@ -7445,8 +7471,8 @@
         <w:t xml:space="preserve">91 (24): e01001–17.</w:t>
       </w:r>
     </w:p>
-    <w:bookmarkEnd w:id="138"/>
-    <w:bookmarkStart w:id="140" w:name="ref-lambert2021"/>
+    <w:bookmarkEnd w:id="139"/>
+    <w:bookmarkStart w:id="141" w:name="ref-lambert2021"/>
     <w:p>
       <w:pPr>
         <w:pStyle w:val="Bibliography"/>
@@ -7479,7 +7505,7 @@
       <w:r>
         <w:t xml:space="preserve"> </w:t>
       </w:r>
-      <w:hyperlink r:id="rId139">
+      <w:hyperlink r:id="rId140">
         <w:r>
           <w:rPr>
             <w:rStyle w:val="Hyperlink"/>
@@ -7491,8 +7517,8 @@
         <w:t xml:space="preserve">.</w:t>
       </w:r>
     </w:p>
-    <w:bookmarkEnd w:id="140"/>
-    <w:bookmarkStart w:id="141" w:name="ref-lazarczyk2008"/>
+    <w:bookmarkEnd w:id="141"/>
+    <w:bookmarkStart w:id="142" w:name="ref-lazarczyk2008"/>
     <w:p>
       <w:pPr>
         <w:pStyle w:val="Bibliography"/>
@@ -7532,8 +7558,8 @@
         <w:t xml:space="preserve">205 (1): 35–42.</w:t>
       </w:r>
     </w:p>
-    <w:bookmarkEnd w:id="141"/>
-    <w:bookmarkStart w:id="143" w:name="ref-leiendecker2023"/>
+    <w:bookmarkEnd w:id="142"/>
+    <w:bookmarkStart w:id="144" w:name="ref-leiendecker2023"/>
     <w:p>
       <w:pPr>
         <w:pStyle w:val="Bibliography"/>
@@ -7575,7 +7601,7 @@
       <w:r>
         <w:t xml:space="preserve"> </w:t>
       </w:r>
-      <w:hyperlink r:id="rId142">
+      <w:hyperlink r:id="rId143">
         <w:r>
           <w:rPr>
             <w:rStyle w:val="Hyperlink"/>
@@ -7587,8 +7613,8 @@
         <w:t xml:space="preserve">.</w:t>
       </w:r>
     </w:p>
-    <w:bookmarkEnd w:id="143"/>
-    <w:bookmarkStart w:id="145" w:name="ref-leinonen2011"/>
+    <w:bookmarkEnd w:id="144"/>
+    <w:bookmarkStart w:id="146" w:name="ref-leinonen2011"/>
     <w:p>
       <w:pPr>
         <w:pStyle w:val="Bibliography"/>
@@ -7630,7 +7656,7 @@
       <w:r>
         <w:t xml:space="preserve"> </w:t>
       </w:r>
-      <w:hyperlink r:id="rId144">
+      <w:hyperlink r:id="rId145">
         <w:r>
           <w:rPr>
             <w:rStyle w:val="Hyperlink"/>
@@ -7642,8 +7668,8 @@
         <w:t xml:space="preserve">.</w:t>
       </w:r>
     </w:p>
-    <w:bookmarkEnd w:id="145"/>
-    <w:bookmarkStart w:id="147" w:name="ref-li2026"/>
+    <w:bookmarkEnd w:id="146"/>
+    <w:bookmarkStart w:id="148" w:name="ref-li2026"/>
     <w:p>
       <w:pPr>
         <w:pStyle w:val="Bibliography"/>
@@ -7685,7 +7711,7 @@
       <w:r>
         <w:t xml:space="preserve"> </w:t>
       </w:r>
-      <w:hyperlink r:id="rId146">
+      <w:hyperlink r:id="rId147">
         <w:r>
           <w:rPr>
             <w:rStyle w:val="Hyperlink"/>
@@ -7697,8 +7723,8 @@
         <w:t xml:space="preserve">.</w:t>
       </w:r>
     </w:p>
-    <w:bookmarkEnd w:id="147"/>
-    <w:bookmarkStart w:id="149" w:name="ref-liao2014"/>
+    <w:bookmarkEnd w:id="148"/>
+    <w:bookmarkStart w:id="150" w:name="ref-liao2014"/>
     <w:p>
       <w:pPr>
         <w:pStyle w:val="Bibliography"/>
@@ -7731,7 +7757,7 @@
       <w:r>
         <w:t xml:space="preserve"> </w:t>
       </w:r>
-      <w:hyperlink r:id="rId148">
+      <w:hyperlink r:id="rId149">
         <w:r>
           <w:rPr>
             <w:rStyle w:val="Hyperlink"/>
@@ -7743,8 +7769,8 @@
         <w:t xml:space="preserve">.</w:t>
       </w:r>
     </w:p>
-    <w:bookmarkEnd w:id="149"/>
-    <w:bookmarkStart w:id="151" w:name="ref-ma2014"/>
+    <w:bookmarkEnd w:id="150"/>
+    <w:bookmarkStart w:id="152" w:name="ref-ma2014"/>
     <w:p>
       <w:pPr>
         <w:pStyle w:val="Bibliography"/>
@@ -7777,7 +7803,7 @@
       <w:r>
         <w:t xml:space="preserve"> </w:t>
       </w:r>
-      <w:hyperlink r:id="rId150">
+      <w:hyperlink r:id="rId151">
         <w:r>
           <w:rPr>
             <w:rStyle w:val="Hyperlink"/>
@@ -7789,8 +7815,8 @@
         <w:t xml:space="preserve">.</w:t>
       </w:r>
     </w:p>
-    <w:bookmarkEnd w:id="151"/>
-    <w:bookmarkStart w:id="152" w:name="ref-meyers2017"/>
+    <w:bookmarkEnd w:id="152"/>
+    <w:bookmarkStart w:id="153" w:name="ref-meyers2017"/>
     <w:p>
       <w:pPr>
         <w:pStyle w:val="Bibliography"/>
@@ -7880,8 +7906,8 @@
         <w:t xml:space="preserve">13 (1): e1006171.</w:t>
       </w:r>
     </w:p>
-    <w:bookmarkEnd w:id="152"/>
-    <w:bookmarkStart w:id="153" w:name="ref-moody2010"/>
+    <w:bookmarkEnd w:id="153"/>
+    <w:bookmarkStart w:id="154" w:name="ref-moody2010"/>
     <w:p>
       <w:pPr>
         <w:pStyle w:val="Bibliography"/>
@@ -7912,8 +7938,8 @@
         <w:t xml:space="preserve">10 (8): 550–60.</w:t>
       </w:r>
     </w:p>
-    <w:bookmarkEnd w:id="153"/>
-    <w:bookmarkStart w:id="155" w:name="ref-morgan2024"/>
+    <w:bookmarkEnd w:id="154"/>
+    <w:bookmarkStart w:id="156" w:name="ref-morgan2024"/>
     <w:p>
       <w:pPr>
         <w:pStyle w:val="Bibliography"/>
@@ -7964,7 +7990,7 @@
       <w:r>
         <w:t xml:space="preserve"> </w:t>
       </w:r>
-      <w:hyperlink r:id="rId154">
+      <w:hyperlink r:id="rId155">
         <w:r>
           <w:rPr>
             <w:rStyle w:val="Hyperlink"/>
@@ -7976,8 +8002,8 @@
         <w:t xml:space="preserve">.</w:t>
       </w:r>
     </w:p>
-    <w:bookmarkEnd w:id="155"/>
-    <w:bookmarkStart w:id="156" w:name="ref-nunes2018"/>
+    <w:bookmarkEnd w:id="156"/>
+    <w:bookmarkStart w:id="157" w:name="ref-nunes2018"/>
     <w:p>
       <w:pPr>
         <w:pStyle w:val="Bibliography"/>
@@ -8008,8 +8034,8 @@
         <w:t xml:space="preserve">73 (suppl 1): e489s.</w:t>
       </w:r>
     </w:p>
-    <w:bookmarkEnd w:id="156"/>
-    <w:bookmarkStart w:id="158" w:name="ref-oh2026"/>
+    <w:bookmarkEnd w:id="157"/>
+    <w:bookmarkStart w:id="159" w:name="ref-oh2026"/>
     <w:p>
       <w:pPr>
         <w:pStyle w:val="Bibliography"/>
@@ -8042,7 +8068,7 @@
       <w:r>
         <w:t xml:space="preserve"> </w:t>
       </w:r>
-      <w:hyperlink r:id="rId157">
+      <w:hyperlink r:id="rId158">
         <w:r>
           <w:rPr>
             <w:rStyle w:val="Hyperlink"/>
@@ -8054,8 +8080,8 @@
         <w:t xml:space="preserve">.</w:t>
       </w:r>
     </w:p>
-    <w:bookmarkEnd w:id="158"/>
-    <w:bookmarkStart w:id="159" w:name="ref-orth2006"/>
+    <w:bookmarkEnd w:id="159"/>
+    <w:bookmarkStart w:id="160" w:name="ref-orth2006"/>
     <w:p>
       <w:pPr>
         <w:pStyle w:val="Bibliography"/>
@@ -8086,8 +8112,8 @@
         <w:t xml:space="preserve">18 (6): 362–74.</w:t>
       </w:r>
     </w:p>
-    <w:bookmarkEnd w:id="159"/>
-    <w:bookmarkStart w:id="161" w:name="ref-purdie2005"/>
+    <w:bookmarkEnd w:id="160"/>
+    <w:bookmarkStart w:id="162" w:name="ref-purdie2005"/>
     <w:p>
       <w:pPr>
         <w:pStyle w:val="Bibliography"/>
@@ -8120,7 +8146,7 @@
       <w:r>
         <w:t xml:space="preserve"> </w:t>
       </w:r>
-      <w:hyperlink r:id="rId160">
+      <w:hyperlink r:id="rId161">
         <w:r>
           <w:rPr>
             <w:rStyle w:val="Hyperlink"/>
@@ -8132,8 +8158,8 @@
         <w:t xml:space="preserve">.</w:t>
       </w:r>
     </w:p>
-    <w:bookmarkEnd w:id="161"/>
-    <w:bookmarkStart w:id="163" w:name="ref-ramoz2002"/>
+    <w:bookmarkEnd w:id="162"/>
+    <w:bookmarkStart w:id="164" w:name="ref-ramoz2002"/>
     <w:p>
       <w:pPr>
         <w:pStyle w:val="Bibliography"/>
@@ -8166,7 +8192,7 @@
       <w:r>
         <w:t xml:space="preserve"> </w:t>
       </w:r>
-      <w:hyperlink r:id="rId162">
+      <w:hyperlink r:id="rId163">
         <w:r>
           <w:rPr>
             <w:rStyle w:val="Hyperlink"/>
@@ -8178,8 +8204,8 @@
         <w:t xml:space="preserve">.</w:t>
       </w:r>
     </w:p>
-    <w:bookmarkEnd w:id="163"/>
-    <w:bookmarkStart w:id="165" w:name="ref-rehm2022"/>
+    <w:bookmarkEnd w:id="164"/>
+    <w:bookmarkStart w:id="166" w:name="ref-rehm2022"/>
     <w:p>
       <w:pPr>
         <w:pStyle w:val="Bibliography"/>
@@ -8212,7 +8238,7 @@
       <w:r>
         <w:t xml:space="preserve"> </w:t>
       </w:r>
-      <w:hyperlink r:id="rId164">
+      <w:hyperlink r:id="rId165">
         <w:r>
           <w:rPr>
             <w:rStyle w:val="Hyperlink"/>
@@ -8224,8 +8250,8 @@
         <w:t xml:space="preserve">.</w:t>
       </w:r>
     </w:p>
-    <w:bookmarkEnd w:id="165"/>
-    <w:bookmarkStart w:id="167" w:name="ref-rollison2021"/>
+    <w:bookmarkEnd w:id="166"/>
+    <w:bookmarkStart w:id="168" w:name="ref-rollison2021"/>
     <w:p>
       <w:pPr>
         <w:pStyle w:val="Bibliography"/>
@@ -8258,7 +8284,7 @@
       <w:r>
         <w:t xml:space="preserve"> </w:t>
       </w:r>
-      <w:hyperlink r:id="rId166">
+      <w:hyperlink r:id="rId167">
         <w:r>
           <w:rPr>
             <w:rStyle w:val="Hyperlink"/>
@@ -8270,8 +8296,8 @@
         <w:t xml:space="preserve">.</w:t>
       </w:r>
     </w:p>
-    <w:bookmarkEnd w:id="167"/>
-    <w:bookmarkStart w:id="169" w:name="ref-rollison2019sites"/>
+    <w:bookmarkEnd w:id="168"/>
+    <w:bookmarkStart w:id="170" w:name="ref-rollison2019sites"/>
     <w:p>
       <w:pPr>
         <w:pStyle w:val="Bibliography"/>
@@ -8304,7 +8330,7 @@
       <w:r>
         <w:t xml:space="preserve"> </w:t>
       </w:r>
-      <w:hyperlink r:id="rId168">
+      <w:hyperlink r:id="rId169">
         <w:r>
           <w:rPr>
             <w:rStyle w:val="Hyperlink"/>
@@ -8316,8 +8342,8 @@
         <w:t xml:space="preserve">.</w:t>
       </w:r>
     </w:p>
-    <w:bookmarkEnd w:id="169"/>
-    <w:bookmarkStart w:id="171" w:name="ref-rollison2019"/>
+    <w:bookmarkEnd w:id="170"/>
+    <w:bookmarkStart w:id="172" w:name="ref-rollison2019"/>
     <w:p>
       <w:pPr>
         <w:pStyle w:val="Bibliography"/>
@@ -8350,7 +8376,7 @@
       <w:r>
         <w:t xml:space="preserve"> </w:t>
       </w:r>
-      <w:hyperlink r:id="rId170">
+      <w:hyperlink r:id="rId171">
         <w:r>
           <w:rPr>
             <w:rStyle w:val="Hyperlink"/>
@@ -8362,8 +8388,8 @@
         <w:t xml:space="preserve">.</w:t>
       </w:r>
     </w:p>
-    <w:bookmarkEnd w:id="171"/>
-    <w:bookmarkStart w:id="173" w:name="ref-saeidian2023"/>
+    <w:bookmarkEnd w:id="172"/>
+    <w:bookmarkStart w:id="174" w:name="ref-saeidian2023"/>
     <w:p>
       <w:pPr>
         <w:pStyle w:val="Bibliography"/>
@@ -8438,7 +8464,7 @@
       <w:r>
         <w:t xml:space="preserve"> </w:t>
       </w:r>
-      <w:hyperlink r:id="rId172">
+      <w:hyperlink r:id="rId173">
         <w:r>
           <w:rPr>
             <w:rStyle w:val="Hyperlink"/>
@@ -8450,8 +8476,8 @@
         <w:t xml:space="preserve">.</w:t>
       </w:r>
     </w:p>
-    <w:bookmarkEnd w:id="173"/>
-    <w:bookmarkStart w:id="175" w:name="ref-selitsky2020"/>
+    <w:bookmarkEnd w:id="174"/>
+    <w:bookmarkStart w:id="176" w:name="ref-selitsky2020"/>
     <w:p>
       <w:pPr>
         <w:pStyle w:val="Bibliography"/>
@@ -8502,7 +8528,7 @@
       <w:r>
         <w:t xml:space="preserve"> </w:t>
       </w:r>
-      <w:hyperlink r:id="rId174">
+      <w:hyperlink r:id="rId175">
         <w:r>
           <w:rPr>
             <w:rStyle w:val="Hyperlink"/>
@@ -8514,8 +8540,8 @@
         <w:t xml:space="preserve">.</w:t>
       </w:r>
     </w:p>
-    <w:bookmarkEnd w:id="175"/>
-    <w:bookmarkStart w:id="177" w:name="ref-shenpv2026"/>
+    <w:bookmarkEnd w:id="176"/>
+    <w:bookmarkStart w:id="178" w:name="ref-shenpv2026"/>
     <w:p>
       <w:pPr>
         <w:pStyle w:val="Bibliography"/>
@@ -8545,7 +8571,7 @@
       <w:r>
         <w:t xml:space="preserve"> </w:t>
       </w:r>
-      <w:hyperlink r:id="rId176">
+      <w:hyperlink r:id="rId177">
         <w:r>
           <w:rPr>
             <w:rStyle w:val="Hyperlink"/>
@@ -8557,8 +8583,8 @@
         <w:t xml:space="preserve">.</w:t>
       </w:r>
     </w:p>
-    <w:bookmarkEnd w:id="177"/>
-    <w:bookmarkStart w:id="179" w:name="ref-shen2016"/>
+    <w:bookmarkEnd w:id="178"/>
+    <w:bookmarkStart w:id="180" w:name="ref-shen2016"/>
     <w:p>
       <w:pPr>
         <w:pStyle w:val="Bibliography"/>
@@ -8609,7 +8635,7 @@
       <w:r>
         <w:t xml:space="preserve"> </w:t>
       </w:r>
-      <w:hyperlink r:id="rId178">
+      <w:hyperlink r:id="rId179">
         <w:r>
           <w:rPr>
             <w:rStyle w:val="Hyperlink"/>
@@ -8621,8 +8647,8 @@
         <w:t xml:space="preserve">.</w:t>
       </w:r>
     </w:p>
-    <w:bookmarkEnd w:id="179"/>
-    <w:bookmarkStart w:id="181" w:name="ref-son2025"/>
+    <w:bookmarkEnd w:id="180"/>
+    <w:bookmarkStart w:id="182" w:name="ref-son2025"/>
     <w:p>
       <w:pPr>
         <w:pStyle w:val="Bibliography"/>
@@ -8655,7 +8681,7 @@
       <w:r>
         <w:t xml:space="preserve"> </w:t>
       </w:r>
-      <w:hyperlink r:id="rId180">
+      <w:hyperlink r:id="rId181">
         <w:r>
           <w:rPr>
             <w:rStyle w:val="Hyperlink"/>
@@ -8667,8 +8693,8 @@
         <w:t xml:space="preserve">.</w:t>
       </w:r>
     </w:p>
-    <w:bookmarkEnd w:id="181"/>
-    <w:bookmarkStart w:id="183" w:name="ref-strickley2019"/>
+    <w:bookmarkEnd w:id="182"/>
+    <w:bookmarkStart w:id="184" w:name="ref-strickley2019"/>
     <w:p>
       <w:pPr>
         <w:pStyle w:val="Bibliography"/>
@@ -8701,7 +8727,7 @@
       <w:r>
         <w:t xml:space="preserve"> </w:t>
       </w:r>
-      <w:hyperlink r:id="rId182">
+      <w:hyperlink r:id="rId183">
         <w:r>
           <w:rPr>
             <w:rStyle w:val="Hyperlink"/>
@@ -8713,8 +8739,8 @@
         <w:t xml:space="preserve">.</w:t>
       </w:r>
     </w:p>
-    <w:bookmarkEnd w:id="183"/>
-    <w:bookmarkStart w:id="185" w:name="ref-strickley2021"/>
+    <w:bookmarkEnd w:id="184"/>
+    <w:bookmarkStart w:id="186" w:name="ref-strickley2021"/>
     <w:p>
       <w:pPr>
         <w:pStyle w:val="Bibliography"/>
@@ -8747,7 +8773,7 @@
       <w:r>
         <w:t xml:space="preserve"> </w:t>
       </w:r>
-      <w:hyperlink r:id="rId184">
+      <w:hyperlink r:id="rId185">
         <w:r>
           <w:rPr>
             <w:rStyle w:val="Hyperlink"/>
@@ -8759,8 +8785,8 @@
         <w:t xml:space="preserve">.</w:t>
       </w:r>
     </w:p>
-    <w:bookmarkEnd w:id="185"/>
-    <w:bookmarkStart w:id="186" w:name="ref-uberoi2016"/>
+    <w:bookmarkEnd w:id="186"/>
+    <w:bookmarkStart w:id="187" w:name="ref-uberoi2016"/>
     <w:p>
       <w:pPr>
         <w:pStyle w:val="Bibliography"/>
@@ -8791,8 +8817,8 @@
         <w:t xml:space="preserve">12 (5): e1005664.</w:t>
       </w:r>
     </w:p>
-    <w:bookmarkEnd w:id="186"/>
-    <w:bookmarkStart w:id="188" w:name="ref-vandoorslaer2017"/>
+    <w:bookmarkEnd w:id="187"/>
+    <w:bookmarkStart w:id="189" w:name="ref-vandoorslaer2017"/>
     <w:p>
       <w:pPr>
         <w:pStyle w:val="Bibliography"/>
@@ -8834,7 +8860,7 @@
       <w:r>
         <w:t xml:space="preserve"> </w:t>
       </w:r>
-      <w:hyperlink r:id="rId187">
+      <w:hyperlink r:id="rId188">
         <w:r>
           <w:rPr>
             <w:rStyle w:val="Hyperlink"/>
@@ -8846,8 +8872,8 @@
         <w:t xml:space="preserve">.</w:t>
       </w:r>
     </w:p>
-    <w:bookmarkEnd w:id="188"/>
-    <w:bookmarkStart w:id="190" w:name="ref-vandiver2021"/>
+    <w:bookmarkEnd w:id="189"/>
+    <w:bookmarkStart w:id="191" w:name="ref-vandiver2021"/>
     <w:p>
       <w:pPr>
         <w:pStyle w:val="Bibliography"/>
@@ -8892,7 +8918,7 @@
       <w:r>
         <w:t xml:space="preserve"> </w:t>
       </w:r>
-      <w:hyperlink r:id="rId189">
+      <w:hyperlink r:id="rId190">
         <w:r>
           <w:rPr>
             <w:rStyle w:val="Hyperlink"/>
@@ -8904,8 +8930,8 @@
         <w:t xml:space="preserve">.</w:t>
       </w:r>
     </w:p>
-    <w:bookmarkEnd w:id="190"/>
-    <w:bookmarkStart w:id="192" w:name="ref-viarisio2018"/>
+    <w:bookmarkEnd w:id="191"/>
+    <w:bookmarkStart w:id="193" w:name="ref-viarisio2018"/>
     <w:p>
       <w:pPr>
         <w:pStyle w:val="Bibliography"/>
@@ -8950,7 +8976,7 @@
       <w:r>
         <w:t xml:space="preserve"> </w:t>
       </w:r>
-      <w:hyperlink r:id="rId191">
+      <w:hyperlink r:id="rId192">
         <w:r>
           <w:rPr>
             <w:rStyle w:val="Hyperlink"/>
@@ -8962,8 +8988,8 @@
         <w:t xml:space="preserve">.</w:t>
       </w:r>
     </w:p>
-    <w:bookmarkEnd w:id="192"/>
-    <w:bookmarkStart w:id="193" w:name="ref-devilliers2004"/>
+    <w:bookmarkEnd w:id="193"/>
+    <w:bookmarkStart w:id="194" w:name="ref-devilliers2004"/>
     <w:p>
       <w:pPr>
         <w:pStyle w:val="Bibliography"/>
@@ -8994,8 +9020,8 @@
         <w:t xml:space="preserve">324 (1): 17–27.</w:t>
       </w:r>
     </w:p>
-    <w:bookmarkEnd w:id="193"/>
-    <w:bookmarkStart w:id="194" w:name="ref-wallace2012"/>
+    <w:bookmarkEnd w:id="194"/>
+    <w:bookmarkStart w:id="195" w:name="ref-wallace2012"/>
     <w:p>
       <w:pPr>
         <w:pStyle w:val="Bibliography"/>
@@ -9080,8 +9106,8 @@
         <w:t xml:space="preserve">8 (7): e1002807.</w:t>
       </w:r>
     </w:p>
-    <w:bookmarkEnd w:id="194"/>
-    <w:bookmarkStart w:id="196" w:name="ref-weissenborn2012"/>
+    <w:bookmarkEnd w:id="195"/>
+    <w:bookmarkStart w:id="197" w:name="ref-weissenborn2012"/>
     <w:p>
       <w:pPr>
         <w:pStyle w:val="Bibliography"/>
@@ -9126,7 +9152,7 @@
       <w:r>
         <w:t xml:space="preserve"> </w:t>
       </w:r>
-      <w:hyperlink r:id="rId195">
+      <w:hyperlink r:id="rId196">
         <w:r>
           <w:rPr>
             <w:rStyle w:val="Hyperlink"/>
@@ -9138,8 +9164,8 @@
         <w:t xml:space="preserve">.</w:t>
       </w:r>
     </w:p>
-    <w:bookmarkEnd w:id="196"/>
-    <w:bookmarkStart w:id="198" w:name="ref-wenande2025"/>
+    <w:bookmarkEnd w:id="197"/>
+    <w:bookmarkStart w:id="199" w:name="ref-wenande2025"/>
     <w:p>
       <w:pPr>
         <w:pStyle w:val="Bibliography"/>
@@ -9184,7 +9210,7 @@
       <w:r>
         <w:t xml:space="preserve"> </w:t>
       </w:r>
-      <w:hyperlink r:id="rId197">
+      <w:hyperlink r:id="rId198">
         <w:r>
           <w:rPr>
             <w:rStyle w:val="Hyperlink"/>
@@ -9196,8 +9222,8 @@
         <w:t xml:space="preserve">.</w:t>
       </w:r>
     </w:p>
-    <w:bookmarkEnd w:id="198"/>
-    <w:bookmarkStart w:id="200" w:name="ref-wood2019"/>
+    <w:bookmarkEnd w:id="199"/>
+    <w:bookmarkStart w:id="201" w:name="ref-wood2019"/>
     <w:p>
       <w:pPr>
         <w:pStyle w:val="Bibliography"/>
@@ -9239,7 +9265,7 @@
       <w:r>
         <w:t xml:space="preserve"> </w:t>
       </w:r>
-      <w:hyperlink r:id="rId199">
+      <w:hyperlink r:id="rId200">
         <w:r>
           <w:rPr>
             <w:rStyle w:val="Hyperlink"/>
@@ -9251,8 +9277,8 @@
         <w:t xml:space="preserve">.</w:t>
       </w:r>
     </w:p>
-    <w:bookmarkEnd w:id="200"/>
-    <w:bookmarkStart w:id="201" w:name="ref-yasumizu2021"/>
+    <w:bookmarkEnd w:id="201"/>
+    <w:bookmarkStart w:id="202" w:name="ref-yasumizu2021"/>
     <w:p>
       <w:pPr>
         <w:pStyle w:val="Bibliography"/>
@@ -9301,10 +9327,10 @@
         <w:t xml:space="preserve">37 (10): 1465–67.</w:t>
       </w:r>
     </w:p>
-    <w:bookmarkEnd w:id="201"/>
     <w:bookmarkEnd w:id="202"/>
     <w:bookmarkEnd w:id="203"/>
-    <w:bookmarkStart w:id="217" w:name="supplementary-material"/>
+    <w:bookmarkEnd w:id="204"/>
+    <w:bookmarkStart w:id="218" w:name="supplementary-material"/>
     <w:p>
       <w:pPr>
         <w:pStyle w:val="Heading1"/>
@@ -9326,7 +9352,7 @@
       <w:tr>
         <w:tc>
           <w:tcPr/>
-          <w:bookmarkStart w:id="207" w:name="suppfig-depth"/>
+          <w:bookmarkStart w:id="208" w:name="suppfig-depth"/>
           <w:p>
             <w:pPr>
               <w:pStyle w:val="Compact"/>
@@ -9337,18 +9363,18 @@
                 <wp:inline>
                   <wp:extent cx="5943600" cy="3714749"/>
                   <wp:effectExtent b="0" l="0" r="0" t="0"/>
-                  <wp:docPr descr="" title="" id="205" name="Picture"/>
+                  <wp:docPr descr="" title="" id="206" name="Picture"/>
                   <a:graphic>
                     <a:graphicData uri="http://schemas.openxmlformats.org/drawingml/2006/picture">
                       <pic:pic>
                         <pic:nvPicPr>
-                          <pic:cNvPr descr="figureS1.png" id="206" name="Picture"/>
+                          <pic:cNvPr descr="figureS1.png" id="207" name="Picture"/>
                           <pic:cNvPicPr>
                             <a:picLocks noChangeArrowheads="1" noChangeAspect="1"/>
                           </pic:cNvPicPr>
                         </pic:nvPicPr>
                         <pic:blipFill>
-                          <a:blip r:embed="rId204"/>
+                          <a:blip r:embed="rId205"/>
                           <a:stretch>
                             <a:fillRect/>
                           </a:stretch>
@@ -9405,7 +9431,7 @@
               <w:t xml:space="preserve">is not produced by differences in sequencing depth: the tiers that reach the floor do so at every depth, and the tiers that do not never reach it, however deeply sequenced. Point size is proportional to the number of libraries in each tier × bin.</w:t>
             </w:r>
           </w:p>
-          <w:bookmarkEnd w:id="207"/>
+          <w:bookmarkEnd w:id="208"/>
         </w:tc>
       </w:tr>
     </w:tbl>
@@ -9430,7 +9456,7 @@
       <w:tr>
         <w:tc>
           <w:tcPr/>
-          <w:bookmarkStart w:id="208" w:name="supptbl-types"/>
+          <w:bookmarkStart w:id="209" w:name="supptbl-types"/>
           <w:tbl>
             <w:tblPr>
               <w:tblStyle w:val="Table"/>
@@ -12621,7 +12647,7 @@
               <w:t xml:space="preserve">, at the level of HPV genus.</w:t>
             </w:r>
           </w:p>
-          <w:bookmarkEnd w:id="208"/>
+          <w:bookmarkEnd w:id="209"/>
         </w:tc>
       </w:tr>
     </w:tbl>
@@ -12646,7 +12672,7 @@
       <w:tr>
         <w:tc>
           <w:tcPr/>
-          <w:bookmarkStart w:id="209" w:name="supptbl-productive"/>
+          <w:bookmarkStart w:id="210" w:name="supptbl-productive"/>
           <w:tbl>
             <w:tblPr>
               <w:tblStyle w:val="Table"/>
@@ -13333,7 +13359,7 @@
               <w:t xml:space="preserve">).</w:t>
             </w:r>
           </w:p>
-          <w:bookmarkEnd w:id="209"/>
+          <w:bookmarkEnd w:id="210"/>
         </w:tc>
       </w:tr>
     </w:tbl>
@@ -13358,7 +13384,7 @@
       <w:tr>
         <w:tc>
           <w:tcPr/>
-          <w:bookmarkStart w:id="210" w:name="supptbl-bayes"/>
+          <w:bookmarkStart w:id="211" w:name="supptbl-bayes"/>
           <w:tbl>
             <w:tblPr>
               <w:tblStyle w:val="Table"/>
@@ -13938,7 +13964,7 @@
               <w:t xml:space="preserve">(3) prior gives an even larger posterior OR, 14,515 [3,961, 77,562], confirming robustness). Sequencing depth is modelled per 10-fold (log₁₀) change in library size.</w:t>
             </w:r>
           </w:p>
-          <w:bookmarkEnd w:id="210"/>
+          <w:bookmarkEnd w:id="211"/>
         </w:tc>
       </w:tr>
     </w:tbl>
@@ -13963,7 +13989,7 @@
       <w:tr>
         <w:tc>
           <w:tcPr/>
-          <w:bookmarkStart w:id="211" w:name="supptbl-cin"/>
+          <w:bookmarkStart w:id="212" w:name="supptbl-cin"/>
           <w:tbl>
             <w:tblPr>
               <w:tblStyle w:val="Table"/>
@@ -14344,7 +14370,7 @@
               <w:t xml:space="preserve">= 0.0038). Retaining them is therefore the conservative analytical choice: the small floor-level excess of neoplasia over skin reported in the main text is an upper bound. Virus–host junction calling supports the same reading from an independent direction: the members of this set that carry enough viral reads to test are integration-positive, whereas the cutaneous-neoplasia libraries outside it are not. Integration is the expected state of mucosal HPV16 in carcinoma and is not a property of the cutaneous reservoir, so the assignment of these libraries to a mucosal origin rests on genome state as well as on type.</w:t>
             </w:r>
           </w:p>
-          <w:bookmarkEnd w:id="211"/>
+          <w:bookmarkEnd w:id="212"/>
         </w:tc>
       </w:tr>
     </w:tbl>
@@ -14369,7 +14395,7 @@
       <w:tr>
         <w:tc>
           <w:tcPr/>
-          <w:bookmarkStart w:id="212" w:name="supptbl-chem"/>
+          <w:bookmarkStart w:id="213" w:name="supptbl-chem"/>
           <w:tbl>
             <w:tblPr>
               <w:tblStyle w:val="Table"/>
@@ -15380,7 +15406,7 @@
               <w:t xml:space="preserve">= 7.2×10⁻¹²) and yields no above-floor library in either tier.</w:t>
             </w:r>
           </w:p>
-          <w:bookmarkEnd w:id="212"/>
+          <w:bookmarkEnd w:id="213"/>
         </w:tc>
       </w:tr>
     </w:tbl>
@@ -15405,7 +15431,7 @@
       <w:tr>
         <w:tc>
           <w:tcPr/>
-          <w:bookmarkStart w:id="213" w:name="supptbl-trace"/>
+          <w:bookmarkStart w:id="214" w:name="supptbl-trace"/>
           <w:tbl>
             <w:tblPr>
               <w:tblStyle w:val="Table"/>
@@ -18079,7 +18105,7 @@
               <w:t xml:space="preserve">, from HPV type to HPV genus.</w:t>
             </w:r>
           </w:p>
-          <w:bookmarkEnd w:id="213"/>
+          <w:bookmarkEnd w:id="214"/>
         </w:tc>
       </w:tr>
     </w:tbl>
@@ -18104,7 +18130,7 @@
       <w:tr>
         <w:tc>
           <w:tcPr/>
-          <w:bookmarkStart w:id="214" w:name="supptbl-coinf"/>
+          <w:bookmarkStart w:id="215" w:name="supptbl-coinf"/>
           <w:tbl>
             <w:tblPr>
               <w:tblStyle w:val="Table"/>
@@ -20283,11 +20309,11 @@
               <w:t xml:space="preserve">, where 14 HPV11 and 13 HPV42 calls are distributed over 15 libraries. Requiring both partners to clear a stricter bar (breadth ≥ 0.70 and depth ≥ 5× for each) leaves 9 libraries from 3 donors: one condyloma lesion (CA_1) and two peri-lesional specimens (CON_1, CON_3). Their dominance relation is asymmetric but not cleanly so. HPV11 is the deeper type in all five condyloma lesions, exceeding HPV42 48- to 4,100-fold in the three with a strong HPV11 signal (CA_1, CA_4, CA_5) and 2- to 4-fold in the other two; in peri-lesional mucosa HPV42 is the deeper type in CON_1 and CON_3, the two specimens where it is unambiguous (955× versus 138×, and 3,816× versus 9×, i.e. 7-fold and 410-fold), whereas in CON_2, CON_4 and CON_5, where HPV42 barely clears the assignment threshold, HPV11 remains the deeper type. Whether that reflects a genuine tissue difference in which type predominates, or merely that HPV42 clears the threshold only where it happens to be abundant, cannot be settled from three donors of one study: it is a hypothesis the data motivate, not a result they support.</w:t>
             </w:r>
           </w:p>
-          <w:bookmarkEnd w:id="214"/>
+          <w:bookmarkEnd w:id="215"/>
         </w:tc>
       </w:tr>
     </w:tbl>
-    <w:bookmarkStart w:id="216" w:name="sec-s-crosstalk"/>
+    <w:bookmarkStart w:id="217" w:name="sec-s-crosstalk"/>
     <w:p>
       <w:pPr>
         <w:pStyle w:val="Heading2"/>
@@ -20517,7 +20543,7 @@
       <w:tr>
         <w:tc>
           <w:tcPr/>
-          <w:bookmarkStart w:id="215" w:name="supptbl-e2"/>
+          <w:bookmarkStart w:id="216" w:name="supptbl-e2"/>
           <w:tbl>
             <w:tblPr>
               <w:tblStyle w:val="Table"/>
@@ -21045,12 +21071,12 @@
               <w:t xml:space="preserve">against RefSeq papillomavirus open reading frames, and scored for whether E2 is present given that E1 is present. The comparison that matters is between the two right-hand columns and the two left-hand ones. Across all contigs, E2 recovery tracks assembly quality rather than biology: it is lowest in cervical CIN (79.3%) and cervical carcinoma (83.6%), which are also the arms with the shortest contigs, and highest in the vaginal and gut metagenomes, which assemble best. Once the question is restricted to near-complete contigs (≥7 kb), where E2 presence can actually be assessed, every category converges on 100%, and cervical carcinoma, in which integration and E2 disruption are the rule, returns 99.3% against 99.9% for skin. That convergence is not a biological result. An integrated genome cannot assemble across the virus-host junction, so conditioning on completeness selects episomal genomes in every category, and the statistic is structurally incapable of detecting the event it was built to detect. This table is reported because the inference is an inviting one to draw from a public contig catalogue, and because it bounds what the DNA axis can contribute: presence of a papillomavirus in such a catalogue is presence of a detectable L1, and carries no information about the state of the genome (Discussion).</w:t>
             </w:r>
           </w:p>
-          <w:bookmarkEnd w:id="215"/>
+          <w:bookmarkEnd w:id="216"/>
         </w:tc>
       </w:tr>
     </w:tbl>
-    <w:bookmarkEnd w:id="216"/>
     <w:bookmarkEnd w:id="217"/>
+    <w:bookmarkEnd w:id="218"/>
     <w:sectPr>
       <w:headerReference r:id="rId9" w:type="default"/>
       <w:pgSz w:h="15840" w:w="12240"/>

</xml_diff>

<commit_message>
figure S2: enlarge the axis labels
The 66 rotated type labels were set at 6 pt and were hard to read. The panel is
about 10.8 in wide, so each column has roughly 11.8 pt of horizontal space and a
rotated label collides only above about 9 pt. Raised to 8.5, which keeps a
margin, with the tier labels to 9.5 and the cell counts to 3 so the axis does not
end up out of scale with the rest of the figure. Height goes from 6.2 to 6.8 in
for the taller label band.

Checked for collisions after rendering: all 66 type names are separate and
legible, including the long provisional names such as HPV-mTVMBSFc09nr.

Co-Authored-By: Claude Opus 5 (1M context) <noreply@anthropic.com>
</commit_message>
<xml_diff>
--- a/manuscript/manuscript.docx
+++ b/manuscript/manuscript.docx
@@ -9561,7 +9561,7 @@
             <w:r>
               <w:drawing>
                 <wp:inline>
-                  <wp:extent cx="5943600" cy="2729653"/>
+                  <wp:extent cx="5943600" cy="2993813"/>
                   <wp:effectExtent b="0" l="0" r="0" t="0"/>
                   <wp:docPr descr="" title="" id="213" name="Picture"/>
                   <a:graphic>
@@ -9582,7 +9582,7 @@
                         <pic:spPr bwMode="auto">
                           <a:xfrm>
                             <a:off x="0" y="0"/>
-                            <a:ext cx="5943600" cy="2729653"/>
+                            <a:ext cx="5943600" cy="2993813"/>
                           </a:xfrm>
                           <a:prstGeom prst="rect">
                             <a:avLst/>

</xml_diff>

<commit_message>
manuscript: re-render both versions after Alla Piirsoo's review edits
Co-Authored-By: Claude Opus 5.5 <noreply@anthropic.com>
</commit_message>
<xml_diff>
--- a/manuscript/manuscript.docx
+++ b/manuscript/manuscript.docx
@@ -39,7 +39,7 @@
         <w:pStyle w:val="Date"/>
       </w:pPr>
       <w:r>
-        <w:t xml:space="preserve">2026-08-28</w:t>
+        <w:t xml:space="preserve">2026-10-13</w:t>
       </w:r>
     </w:p>
     <w:bookmarkStart w:id="20" w:name="abstract"/>
@@ -2852,19 +2852,7 @@
         <w:pStyle w:val="BodyText"/>
       </w:pPr>
       <w:r>
-        <w:t xml:space="preserve">The ratio was then read against a progression in which the answer is known independently. A cervical series (SRP252916) sequenced HPV16-positive normal epithelium, high-grade squamous intraepithelial lesion (HSIL) and squamous carcinoma, six cases per arm under one rRNA-depleted protocol, alongside six HPV-negative normal controls; the arms are the submitting study’s, and the tissue and the progression are ones the marker was not developed on. The HPV-negative controls returned no HPV of any type, and across the three positive arms the median ratio rises monotonically with grade. On the log</w:t>
-      </w:r>
-      <w:r>
-        <w:rPr>
-          <w:vertAlign w:val="subscript"/>
-        </w:rPr>
-        <w:t xml:space="preserve">2</w:t>
-      </w:r>
-      <w:r>
-        <w:t xml:space="preserve"> </w:t>
-      </w:r>
-      <w:r>
-        <w:t xml:space="preserve">scale of</w:t>
+        <w:t xml:space="preserve">The ratio was then read against a progression in which the answer is known independently. A cervical series (SRP252916) sequenced HPV16-positive normal epithelium, high-grade squamous intraepithelial lesion (HSIL) and squamous carcinoma, six cases per arm under one rRNA-depleted protocol, alongside six HPV-negative normal controls; the arms are the submitting study’s, and the tissue and the progression are ones the marker was not developed on. The HPV-negative controls returned no HPV of any type, and across the three positive arms the median ratio rises monotonically with grade. In</w:t>
       </w:r>
       <w:r>
         <w:t xml:space="preserve"> </w:t>
@@ -2881,7 +2869,7 @@
         <w:t xml:space="preserve"> </w:t>
       </w:r>
       <w:r>
-        <w:t xml:space="preserve">c it runs from -1.48 in normal epithelium (</w:t>
+        <w:t xml:space="preserve">c it runs from 0.36 in normal epithelium (</w:t>
       </w:r>
       <w:r>
         <w:rPr>
@@ -2894,7 +2882,7 @@
         <w:t xml:space="preserve"> </w:t>
       </w:r>
       <w:r>
-        <w:t xml:space="preserve">= 3) through -0.36 in HSIL (</w:t>
+        <w:t xml:space="preserve">= 3) through 0.78 in HSIL (</w:t>
       </w:r>
       <w:r>
         <w:rPr>
@@ -2907,7 +2895,7 @@
         <w:t xml:space="preserve"> </w:t>
       </w:r>
       <w:r>
-        <w:t xml:space="preserve">= 6) to 1.47 in carcinoma (</w:t>
+        <w:t xml:space="preserve">= 6) to 2.77 in carcinoma (</w:t>
       </w:r>
       <w:r>
         <w:rPr>
@@ -2920,7 +2908,7 @@
         <w:t xml:space="preserve"> </w:t>
       </w:r>
       <w:r>
-        <w:t xml:space="preserve">= 6), which is a shift of roughly eightfold in the ratio itself, in the direction integration predicts. Late transcription tracks the same axis without being part of the criterion: the libraries called episomal carry abundant L1, while those with a disrupted ratio carry almost none. The binary call is the weaker readout at this size, separating the carcinoma and lesion arms from normal epithelium (2 and 2 of six against 0 of 3) but not from each other, and the normal-epithelium arm is thin: two of its six libraries yielded no HPV reads and a third carried two. The gradient, not the threshold, is what this series supports.</w:t>
+        <w:t xml:space="preserve">= 6), a shift of roughly eightfold, in the direction integration predicts. Late transcription tracks the same axis without being part of the criterion: the libraries called episomal carry abundant L1, while those with a disrupted ratio carry almost none. The binary call is the weaker readout at this size, separating the carcinoma and lesion arms from normal epithelium (2 and 2 of six against 0 of 3) but not from each other, and the normal-epithelium arm is thin: two of its six libraries yielded no HPV reads and a third carried two. The gradient, not the threshold, is what this series supports.</w:t>
       </w:r>
     </w:p>
     <w:tbl>
@@ -6040,7 +6028,7 @@
         </w:numPr>
       </w:pPr>
       <w:r>
-        <w:t xml:space="preserve">Institute of Technology, University of Tartu, Tartu, Estonia</w:t>
+        <w:t xml:space="preserve">Institute of Bioengineering, University of Tartu, Tartu, Estonia</w:t>
       </w:r>
     </w:p>
     <w:p>
@@ -6084,7 +6072,7 @@
       </w:r>
     </w:p>
     <w:bookmarkEnd w:id="74"/>
-    <w:bookmarkStart w:id="76" w:name="orcids"/>
+    <w:bookmarkStart w:id="77" w:name="orcids"/>
     <w:p>
       <w:pPr>
         <w:pStyle w:val="Heading2"/>
@@ -6117,8 +6105,19 @@
         <w:pStyle w:val="BodyText"/>
       </w:pPr>
       <w:r>
-        <w:t xml:space="preserve">Alla Piirsoo: [to be completed]</w:t>
-      </w:r>
+        <w:t xml:space="preserve">Alla Piirsoo:</w:t>
+      </w:r>
+      <w:r>
+        <w:t xml:space="preserve"> </w:t>
+      </w:r>
+      <w:hyperlink r:id="rId76">
+        <w:r>
+          <w:rPr>
+            <w:rStyle w:val="Hyperlink"/>
+          </w:rPr>
+          <w:t xml:space="preserve">https://orcid.org/0000-0001-6843-7127</w:t>
+        </w:r>
+      </w:hyperlink>
     </w:p>
     <w:p>
       <w:pPr>
@@ -6128,8 +6127,8 @@
         <w:t xml:space="preserve">Marko Piirsoo: [to be completed]</w:t>
       </w:r>
     </w:p>
-    <w:bookmarkEnd w:id="76"/>
-    <w:bookmarkStart w:id="77" w:name="ethics-statement"/>
+    <w:bookmarkEnd w:id="77"/>
+    <w:bookmarkStart w:id="78" w:name="ethics-statement"/>
     <w:p>
       <w:pPr>
         <w:pStyle w:val="Heading2"/>
@@ -6146,8 +6145,8 @@
         <w:t xml:space="preserve">This study analyzed only publicly archived, de-identified human sequencing data retrieved from the NCBI Sequence Read Archive, and generated no new human or animal material. Institutional review board approval and informed consent were therefore not required for the work reported here. Ethical approval and participant consent for the primary studies were the responsibility of their submitting investigators and are recorded in the corresponding BioProject entries.</w:t>
       </w:r>
     </w:p>
-    <w:bookmarkEnd w:id="77"/>
-    <w:bookmarkStart w:id="80" w:name="data-availability-statement"/>
+    <w:bookmarkEnd w:id="78"/>
+    <w:bookmarkStart w:id="81" w:name="data-availability-statement"/>
     <w:p>
       <w:pPr>
         <w:pStyle w:val="Heading2"/>
@@ -6166,7 +6165,7 @@
       <w:r>
         <w:t xml:space="preserve"> </w:t>
       </w:r>
-      <w:hyperlink r:id="rId78">
+      <w:hyperlink r:id="rId79">
         <w:r>
           <w:rPr>
             <w:rStyle w:val="Hyperlink"/>
@@ -6180,7 +6179,7 @@
       <w:r>
         <w:t xml:space="preserve"> </w:t>
       </w:r>
-      <w:hyperlink r:id="rId79">
+      <w:hyperlink r:id="rId80">
         <w:r>
           <w:rPr>
             <w:rStyle w:val="Hyperlink"/>
@@ -6192,8 +6191,8 @@
         <w:t xml:space="preserve">) and NCBI RefSeq. No new sequencing data were generated.</w:t>
       </w:r>
     </w:p>
-    <w:bookmarkEnd w:id="80"/>
-    <w:bookmarkStart w:id="81" w:name="conflict-of-interest"/>
+    <w:bookmarkEnd w:id="81"/>
+    <w:bookmarkStart w:id="82" w:name="conflict-of-interest"/>
     <w:p>
       <w:pPr>
         <w:pStyle w:val="Heading2"/>
@@ -6210,8 +6209,8 @@
         <w:t xml:space="preserve">The authors state no conflict of interest.</w:t>
       </w:r>
     </w:p>
-    <w:bookmarkEnd w:id="81"/>
-    <w:bookmarkStart w:id="82" w:name="acknowledgments"/>
+    <w:bookmarkEnd w:id="82"/>
+    <w:bookmarkStart w:id="83" w:name="acknowledgments"/>
     <w:p>
       <w:pPr>
         <w:pStyle w:val="Heading2"/>
@@ -6244,8 +6243,8 @@
         <w:t xml:space="preserve">The computations were performed on the High Performance Computing Center of the University of Tartu. We thank the submitting investigators of the studies re-analyzed here, whose deposition of raw sequencing data to public archives made this work possible.</w:t>
       </w:r>
     </w:p>
-    <w:bookmarkEnd w:id="82"/>
-    <w:bookmarkStart w:id="83" w:name="author-contributions-statement"/>
+    <w:bookmarkEnd w:id="83"/>
+    <w:bookmarkStart w:id="84" w:name="author-contributions-statement"/>
     <w:p>
       <w:pPr>
         <w:pStyle w:val="Heading2"/>
@@ -6259,11 +6258,11 @@
         <w:pStyle w:val="FirstParagraph"/>
       </w:pPr>
       <w:r>
-        <w:t xml:space="preserve">[To be completed, CRediT-compliant.] Conceptualization: ; Data Curation: ; Formal Analysis: ; Funding Acquisition: ; Investigation: ; Methodology: ; Project Administration: ; Resources: ; Software: ; Supervision: ; Validation: ; Visualization: ; Writing - Original Draft Preparation: ; Writing - Review and Editing: .</w:t>
-      </w:r>
-    </w:p>
-    <w:bookmarkEnd w:id="83"/>
-    <w:bookmarkStart w:id="224" w:name="references"/>
+        <w:t xml:space="preserve">[To be completed, CRediT-compliant.] Conceptualization: AP; Data Curation: ; Formal Analysis: ; Funding Acquisition: ; Investigation: ; Methodology: ; Project Administration: ; Resources: ; Software: ; Supervision: ; Validation: AP; Visualization: ; Writing - Original Draft Preparation: ; Writing - Review and Editing: AP.</w:t>
+      </w:r>
+    </w:p>
+    <w:bookmarkEnd w:id="84"/>
+    <w:bookmarkStart w:id="225" w:name="references"/>
     <w:p>
       <w:pPr>
         <w:pStyle w:val="Heading2"/>
@@ -6272,8 +6271,8 @@
         <w:t xml:space="preserve">References</w:t>
       </w:r>
     </w:p>
-    <w:bookmarkStart w:id="223" w:name="refs"/>
-    <w:bookmarkStart w:id="85" w:name="ref-adey2013"/>
+    <w:bookmarkStart w:id="224" w:name="refs"/>
+    <w:bookmarkStart w:id="86" w:name="ref-adey2013"/>
     <w:p>
       <w:pPr>
         <w:pStyle w:val="Bibliography"/>
@@ -6318,7 +6317,7 @@
       <w:r>
         <w:t xml:space="preserve"> </w:t>
       </w:r>
-      <w:hyperlink r:id="rId84">
+      <w:hyperlink r:id="rId85">
         <w:r>
           <w:rPr>
             <w:rStyle w:val="Hyperlink"/>
@@ -6330,8 +6329,8 @@
         <w:t xml:space="preserve">.</w:t>
       </w:r>
     </w:p>
-    <w:bookmarkEnd w:id="85"/>
-    <w:bookmarkStart w:id="87" w:name="ref-antonsson2000"/>
+    <w:bookmarkEnd w:id="86"/>
+    <w:bookmarkStart w:id="88" w:name="ref-antonsson2000"/>
     <w:p>
       <w:pPr>
         <w:pStyle w:val="Bibliography"/>
@@ -6364,7 +6363,7 @@
       <w:r>
         <w:t xml:space="preserve"> </w:t>
       </w:r>
-      <w:hyperlink r:id="rId86">
+      <w:hyperlink r:id="rId87">
         <w:r>
           <w:rPr>
             <w:rStyle w:val="Hyperlink"/>
@@ -6376,8 +6375,8 @@
         <w:t xml:space="preserve">.</w:t>
       </w:r>
     </w:p>
-    <w:bookmarkEnd w:id="87"/>
-    <w:bookmarkStart w:id="89" w:name="ref-arron2011"/>
+    <w:bookmarkEnd w:id="88"/>
+    <w:bookmarkStart w:id="90" w:name="ref-arron2011"/>
     <w:p>
       <w:pPr>
         <w:pStyle w:val="Bibliography"/>
@@ -6410,7 +6409,7 @@
       <w:r>
         <w:t xml:space="preserve"> </w:t>
       </w:r>
-      <w:hyperlink r:id="rId88">
+      <w:hyperlink r:id="rId89">
         <w:r>
           <w:rPr>
             <w:rStyle w:val="Hyperlink"/>
@@ -6422,8 +6421,8 @@
         <w:t xml:space="preserve">.</w:t>
       </w:r>
     </w:p>
-    <w:bookmarkEnd w:id="89"/>
-    <w:bookmarkStart w:id="91" w:name="ref-arroyomuhr2021"/>
+    <w:bookmarkEnd w:id="90"/>
+    <w:bookmarkStart w:id="92" w:name="ref-arroyomuhr2021"/>
     <w:p>
       <w:pPr>
         <w:pStyle w:val="Bibliography"/>
@@ -6456,7 +6455,7 @@
       <w:r>
         <w:t xml:space="preserve"> </w:t>
       </w:r>
-      <w:hyperlink r:id="rId90">
+      <w:hyperlink r:id="rId91">
         <w:r>
           <w:rPr>
             <w:rStyle w:val="Hyperlink"/>
@@ -6468,8 +6467,8 @@
         <w:t xml:space="preserve">.</w:t>
       </w:r>
     </w:p>
-    <w:bookmarkEnd w:id="91"/>
-    <w:bookmarkStart w:id="93" w:name="ref-asplund2019"/>
+    <w:bookmarkEnd w:id="92"/>
+    <w:bookmarkStart w:id="94" w:name="ref-asplund2019"/>
     <w:p>
       <w:pPr>
         <w:pStyle w:val="Bibliography"/>
@@ -6502,7 +6501,7 @@
       <w:r>
         <w:t xml:space="preserve"> </w:t>
       </w:r>
-      <w:hyperlink r:id="rId92">
+      <w:hyperlink r:id="rId93">
         <w:r>
           <w:rPr>
             <w:rStyle w:val="Hyperlink"/>
@@ -6514,8 +6513,8 @@
         <w:t xml:space="preserve">.</w:t>
       </w:r>
     </w:p>
-    <w:bookmarkEnd w:id="93"/>
-    <w:bookmarkStart w:id="95" w:name="ref-bhargava2025"/>
+    <w:bookmarkEnd w:id="94"/>
+    <w:bookmarkStart w:id="96" w:name="ref-bhargava2025"/>
     <w:p>
       <w:pPr>
         <w:pStyle w:val="Bibliography"/>
@@ -6560,7 +6559,7 @@
       <w:r>
         <w:t xml:space="preserve"> </w:t>
       </w:r>
-      <w:hyperlink r:id="rId94">
+      <w:hyperlink r:id="rId95">
         <w:r>
           <w:rPr>
             <w:rStyle w:val="Hyperlink"/>
@@ -6572,8 +6571,8 @@
         <w:t xml:space="preserve">.</w:t>
       </w:r>
     </w:p>
-    <w:bookmarkEnd w:id="95"/>
-    <w:bookmarkStart w:id="96" w:name="ref-borgogna2014"/>
+    <w:bookmarkEnd w:id="96"/>
+    <w:bookmarkStart w:id="97" w:name="ref-borgogna2014"/>
     <w:p>
       <w:pPr>
         <w:pStyle w:val="Bibliography"/>
@@ -6615,8 +6614,8 @@
         <w:t xml:space="preserve">27: 1101–15.</w:t>
       </w:r>
     </w:p>
-    <w:bookmarkEnd w:id="96"/>
-    <w:bookmarkStart w:id="98" w:name="ref-borgogna2018"/>
+    <w:bookmarkEnd w:id="97"/>
+    <w:bookmarkStart w:id="99" w:name="ref-borgogna2018"/>
     <w:p>
       <w:pPr>
         <w:pStyle w:val="Bibliography"/>
@@ -6666,7 +6665,7 @@
       <w:r>
         <w:t xml:space="preserve"> </w:t>
       </w:r>
-      <w:hyperlink r:id="rId97">
+      <w:hyperlink r:id="rId98">
         <w:r>
           <w:rPr>
             <w:rStyle w:val="Hyperlink"/>
@@ -6678,8 +6677,8 @@
         <w:t xml:space="preserve">.</w:t>
       </w:r>
     </w:p>
-    <w:bookmarkEnd w:id="98"/>
-    <w:bookmarkStart w:id="100" w:name="ref-boulet2009"/>
+    <w:bookmarkEnd w:id="99"/>
+    <w:bookmarkStart w:id="101" w:name="ref-boulet2009"/>
     <w:p>
       <w:pPr>
         <w:pStyle w:val="Bibliography"/>
@@ -6747,7 +6746,7 @@
       <w:r>
         <w:t xml:space="preserve"> </w:t>
       </w:r>
-      <w:hyperlink r:id="rId99">
+      <w:hyperlink r:id="rId100">
         <w:r>
           <w:rPr>
             <w:rStyle w:val="Hyperlink"/>
@@ -6759,8 +6758,8 @@
         <w:t xml:space="preserve">.</w:t>
       </w:r>
     </w:p>
-    <w:bookmarkEnd w:id="100"/>
-    <w:bookmarkStart w:id="102" w:name="ref-bzhalava2014"/>
+    <w:bookmarkEnd w:id="101"/>
+    <w:bookmarkStart w:id="103" w:name="ref-bzhalava2014"/>
     <w:p>
       <w:pPr>
         <w:pStyle w:val="Bibliography"/>
@@ -6793,7 +6792,7 @@
       <w:r>
         <w:t xml:space="preserve"> </w:t>
       </w:r>
-      <w:hyperlink r:id="rId101">
+      <w:hyperlink r:id="rId102">
         <w:r>
           <w:rPr>
             <w:rStyle w:val="Hyperlink"/>
@@ -6805,8 +6804,8 @@
         <w:t xml:space="preserve">.</w:t>
       </w:r>
     </w:p>
-    <w:bookmarkEnd w:id="102"/>
-    <w:bookmarkStart w:id="103" w:name="ref-bzhalava2015"/>
+    <w:bookmarkEnd w:id="103"/>
+    <w:bookmarkStart w:id="104" w:name="ref-bzhalava2015"/>
     <w:p>
       <w:pPr>
         <w:pStyle w:val="Bibliography"/>
@@ -6837,8 +6836,8 @@
         <w:t xml:space="preserve">476: 341–44.</w:t>
       </w:r>
     </w:p>
-    <w:bookmarkEnd w:id="103"/>
-    <w:bookmarkStart w:id="105" w:name="ref-cantalupo2015"/>
+    <w:bookmarkEnd w:id="104"/>
+    <w:bookmarkStart w:id="106" w:name="ref-cantalupo2015"/>
     <w:p>
       <w:pPr>
         <w:pStyle w:val="Bibliography"/>
@@ -6892,7 +6891,7 @@
       <w:r>
         <w:t xml:space="preserve"> </w:t>
       </w:r>
-      <w:hyperlink r:id="rId104">
+      <w:hyperlink r:id="rId105">
         <w:r>
           <w:rPr>
             <w:rStyle w:val="Hyperlink"/>
@@ -6904,8 +6903,8 @@
         <w:t xml:space="preserve">.</w:t>
       </w:r>
     </w:p>
-    <w:bookmarkEnd w:id="105"/>
-    <w:bookmarkStart w:id="107" w:name="ref-cantalupo2019"/>
+    <w:bookmarkEnd w:id="106"/>
+    <w:bookmarkStart w:id="108" w:name="ref-cantalupo2019"/>
     <w:p>
       <w:pPr>
         <w:pStyle w:val="Bibliography"/>
@@ -6950,7 +6949,7 @@
       <w:r>
         <w:t xml:space="preserve"> </w:t>
       </w:r>
-      <w:hyperlink r:id="rId106">
+      <w:hyperlink r:id="rId107">
         <w:r>
           <w:rPr>
             <w:rStyle w:val="Hyperlink"/>
@@ -6962,8 +6961,8 @@
         <w:t xml:space="preserve">.</w:t>
       </w:r>
     </w:p>
-    <w:bookmarkEnd w:id="107"/>
-    <w:bookmarkStart w:id="109" w:name="ref-chen2018"/>
+    <w:bookmarkEnd w:id="108"/>
+    <w:bookmarkStart w:id="110" w:name="ref-chen2018"/>
     <w:p>
       <w:pPr>
         <w:pStyle w:val="Bibliography"/>
@@ -7008,7 +7007,7 @@
       <w:r>
         <w:t xml:space="preserve"> </w:t>
       </w:r>
-      <w:hyperlink r:id="rId108">
+      <w:hyperlink r:id="rId109">
         <w:r>
           <w:rPr>
             <w:rStyle w:val="Hyperlink"/>
@@ -7020,8 +7019,8 @@
         <w:t xml:space="preserve">.</w:t>
       </w:r>
     </w:p>
-    <w:bookmarkEnd w:id="109"/>
-    <w:bookmarkStart w:id="111" w:name="ref-cheung2008"/>
+    <w:bookmarkEnd w:id="110"/>
+    <w:bookmarkStart w:id="112" w:name="ref-cheung2008"/>
     <w:p>
       <w:pPr>
         <w:pStyle w:val="Bibliography"/>
@@ -7054,7 +7053,7 @@
       <w:r>
         <w:t xml:space="preserve"> </w:t>
       </w:r>
-      <w:hyperlink r:id="rId110">
+      <w:hyperlink r:id="rId111">
         <w:r>
           <w:rPr>
             <w:rStyle w:val="Hyperlink"/>
@@ -7066,8 +7065,8 @@
         <w:t xml:space="preserve">.</w:t>
       </w:r>
     </w:p>
-    <w:bookmarkEnd w:id="111"/>
-    <w:bookmarkStart w:id="113" w:name="ref-chikhi2024"/>
+    <w:bookmarkEnd w:id="112"/>
+    <w:bookmarkStart w:id="114" w:name="ref-chikhi2024"/>
     <w:p>
       <w:pPr>
         <w:pStyle w:val="Bibliography"/>
@@ -7097,7 +7096,7 @@
       <w:r>
         <w:t xml:space="preserve"> </w:t>
       </w:r>
-      <w:hyperlink r:id="rId112">
+      <w:hyperlink r:id="rId113">
         <w:r>
           <w:rPr>
             <w:rStyle w:val="Hyperlink"/>
@@ -7109,8 +7108,8 @@
         <w:t xml:space="preserve">.</w:t>
       </w:r>
     </w:p>
-    <w:bookmarkEnd w:id="113"/>
-    <w:bookmarkStart w:id="115" w:name="ref-choi2018"/>
+    <w:bookmarkEnd w:id="114"/>
+    <w:bookmarkStart w:id="116" w:name="ref-choi2018"/>
     <w:p>
       <w:pPr>
         <w:pStyle w:val="Bibliography"/>
@@ -7182,7 +7181,7 @@
       <w:r>
         <w:t xml:space="preserve"> </w:t>
       </w:r>
-      <w:hyperlink r:id="rId114">
+      <w:hyperlink r:id="rId115">
         <w:r>
           <w:rPr>
             <w:rStyle w:val="Hyperlink"/>
@@ -7194,8 +7193,8 @@
         <w:t xml:space="preserve">.</w:t>
       </w:r>
     </w:p>
-    <w:bookmarkEnd w:id="115"/>
-    <w:bookmarkStart w:id="117" w:name="ref-collins2009"/>
+    <w:bookmarkEnd w:id="116"/>
+    <w:bookmarkStart w:id="118" w:name="ref-collins2009"/>
     <w:p>
       <w:pPr>
         <w:pStyle w:val="Bibliography"/>
@@ -7240,7 +7239,7 @@
       <w:r>
         <w:t xml:space="preserve"> </w:t>
       </w:r>
-      <w:hyperlink r:id="rId116">
+      <w:hyperlink r:id="rId117">
         <w:r>
           <w:rPr>
             <w:rStyle w:val="Hyperlink"/>
@@ -7252,8 +7251,8 @@
         <w:t xml:space="preserve">.</w:t>
       </w:r>
     </w:p>
-    <w:bookmarkEnd w:id="117"/>
-    <w:bookmarkStart w:id="119" w:name="ref-danecek2021"/>
+    <w:bookmarkEnd w:id="118"/>
+    <w:bookmarkStart w:id="120" w:name="ref-danecek2021"/>
     <w:p>
       <w:pPr>
         <w:pStyle w:val="Bibliography"/>
@@ -7307,7 +7306,7 @@
       <w:r>
         <w:t xml:space="preserve"> </w:t>
       </w:r>
-      <w:hyperlink r:id="rId118">
+      <w:hyperlink r:id="rId119">
         <w:r>
           <w:rPr>
             <w:rStyle w:val="Hyperlink"/>
@@ -7319,8 +7318,8 @@
         <w:t xml:space="preserve">.</w:t>
       </w:r>
     </w:p>
-    <w:bookmarkEnd w:id="119"/>
-    <w:bookmarkStart w:id="121" w:name="ref-devitt2019"/>
+    <w:bookmarkEnd w:id="120"/>
+    <w:bookmarkStart w:id="122" w:name="ref-devitt2019"/>
     <w:p>
       <w:pPr>
         <w:pStyle w:val="Bibliography"/>
@@ -7377,7 +7376,7 @@
       <w:r>
         <w:t xml:space="preserve"> </w:t>
       </w:r>
-      <w:hyperlink r:id="rId120">
+      <w:hyperlink r:id="rId121">
         <w:r>
           <w:rPr>
             <w:rStyle w:val="Hyperlink"/>
@@ -7389,8 +7388,8 @@
         <w:t xml:space="preserve">.</w:t>
       </w:r>
     </w:p>
-    <w:bookmarkEnd w:id="121"/>
-    <w:bookmarkStart w:id="123" w:name="ref-ditommaso2017"/>
+    <w:bookmarkEnd w:id="122"/>
+    <w:bookmarkStart w:id="124" w:name="ref-ditommaso2017"/>
     <w:p>
       <w:pPr>
         <w:pStyle w:val="Bibliography"/>
@@ -7423,7 +7422,7 @@
       <w:r>
         <w:t xml:space="preserve"> </w:t>
       </w:r>
-      <w:hyperlink r:id="rId122">
+      <w:hyperlink r:id="rId123">
         <w:r>
           <w:rPr>
             <w:rStyle w:val="Hyperlink"/>
@@ -7435,8 +7434,8 @@
         <w:t xml:space="preserve">.</w:t>
       </w:r>
     </w:p>
-    <w:bookmarkEnd w:id="123"/>
-    <w:bookmarkStart w:id="125" w:name="ref-dobin2013"/>
+    <w:bookmarkEnd w:id="124"/>
+    <w:bookmarkStart w:id="126" w:name="ref-dobin2013"/>
     <w:p>
       <w:pPr>
         <w:pStyle w:val="Bibliography"/>
@@ -7487,7 +7486,7 @@
       <w:r>
         <w:t xml:space="preserve"> </w:t>
       </w:r>
-      <w:hyperlink r:id="rId124">
+      <w:hyperlink r:id="rId125">
         <w:r>
           <w:rPr>
             <w:rStyle w:val="Hyperlink"/>
@@ -7499,8 +7498,8 @@
         <w:t xml:space="preserve">.</w:t>
       </w:r>
     </w:p>
-    <w:bookmarkEnd w:id="125"/>
-    <w:bookmarkStart w:id="126" w:name="ref-doorbar2023"/>
+    <w:bookmarkEnd w:id="126"/>
+    <w:bookmarkStart w:id="127" w:name="ref-doorbar2023"/>
     <w:p>
       <w:pPr>
         <w:pStyle w:val="Bibliography"/>
@@ -7531,8 +7530,8 @@
         <w:t xml:space="preserve">16: 200268.</w:t>
       </w:r>
     </w:p>
-    <w:bookmarkEnd w:id="126"/>
-    <w:bookmarkStart w:id="127" w:name="ref-doorbar2012"/>
+    <w:bookmarkEnd w:id="127"/>
+    <w:bookmarkStart w:id="128" w:name="ref-doorbar2012"/>
     <w:p>
       <w:pPr>
         <w:pStyle w:val="Bibliography"/>
@@ -7563,8 +7562,8 @@
         <w:t xml:space="preserve">30 (Suppl 5): F55–70.</w:t>
       </w:r>
     </w:p>
-    <w:bookmarkEnd w:id="127"/>
-    <w:bookmarkStart w:id="128" w:name="ref-dorfer2021"/>
+    <w:bookmarkEnd w:id="128"/>
+    <w:bookmarkStart w:id="129" w:name="ref-dorfer2021"/>
     <w:p>
       <w:pPr>
         <w:pStyle w:val="Bibliography"/>
@@ -7604,8 +7603,8 @@
         <w:t xml:space="preserve">21 (2): 525–39.</w:t>
       </w:r>
     </w:p>
-    <w:bookmarkEnd w:id="128"/>
-    <w:bookmarkStart w:id="130" w:name="ref-edgar2022"/>
+    <w:bookmarkEnd w:id="129"/>
+    <w:bookmarkStart w:id="131" w:name="ref-edgar2022"/>
     <w:p>
       <w:pPr>
         <w:pStyle w:val="Bibliography"/>
@@ -7638,7 +7637,7 @@
       <w:r>
         <w:t xml:space="preserve"> </w:t>
       </w:r>
-      <w:hyperlink r:id="rId129">
+      <w:hyperlink r:id="rId130">
         <w:r>
           <w:rPr>
             <w:rStyle w:val="Hyperlink"/>
@@ -7650,8 +7649,8 @@
         <w:t xml:space="preserve">.</w:t>
       </w:r>
     </w:p>
-    <w:bookmarkEnd w:id="130"/>
-    <w:bookmarkStart w:id="131" w:name="ref-egawa2017"/>
+    <w:bookmarkEnd w:id="131"/>
+    <w:bookmarkStart w:id="132" w:name="ref-egawa2017"/>
     <w:p>
       <w:pPr>
         <w:pStyle w:val="Bibliography"/>
@@ -7682,8 +7681,8 @@
         <w:t xml:space="preserve">231: 119–27.</w:t>
       </w:r>
     </w:p>
-    <w:bookmarkEnd w:id="131"/>
-    <w:bookmarkStart w:id="133" w:name="ref-fan2023"/>
+    <w:bookmarkEnd w:id="132"/>
+    <w:bookmarkStart w:id="134" w:name="ref-fan2023"/>
     <w:p>
       <w:pPr>
         <w:pStyle w:val="Bibliography"/>
@@ -7728,7 +7727,7 @@
       <w:r>
         <w:t xml:space="preserve"> </w:t>
       </w:r>
-      <w:hyperlink r:id="rId132">
+      <w:hyperlink r:id="rId133">
         <w:r>
           <w:rPr>
             <w:rStyle w:val="Hyperlink"/>
@@ -7740,8 +7739,8 @@
         <w:t xml:space="preserve">.</w:t>
       </w:r>
     </w:p>
-    <w:bookmarkEnd w:id="133"/>
-    <w:bookmarkStart w:id="135" w:name="ref-fisher2015"/>
+    <w:bookmarkEnd w:id="134"/>
+    <w:bookmarkStart w:id="136" w:name="ref-fisher2015"/>
     <w:p>
       <w:pPr>
         <w:pStyle w:val="Bibliography"/>
@@ -7780,7 +7779,7 @@
       <w:r>
         <w:t xml:space="preserve"> </w:t>
       </w:r>
-      <w:hyperlink r:id="rId134">
+      <w:hyperlink r:id="rId135">
         <w:r>
           <w:rPr>
             <w:rStyle w:val="Hyperlink"/>
@@ -7792,8 +7791,8 @@
         <w:t xml:space="preserve">.</w:t>
       </w:r>
     </w:p>
-    <w:bookmarkEnd w:id="135"/>
-    <w:bookmarkStart w:id="136" w:name="ref-foulongne2012"/>
+    <w:bookmarkEnd w:id="136"/>
+    <w:bookmarkStart w:id="137" w:name="ref-foulongne2012"/>
     <w:p>
       <w:pPr>
         <w:pStyle w:val="Bibliography"/>
@@ -7836,8 +7835,8 @@
         <w:t xml:space="preserve">7 (6): e38499.</w:t>
       </w:r>
     </w:p>
-    <w:bookmarkEnd w:id="136"/>
-    <w:bookmarkStart w:id="138" w:name="ref-fujimoto2019"/>
+    <w:bookmarkEnd w:id="137"/>
+    <w:bookmarkStart w:id="139" w:name="ref-fujimoto2019"/>
     <w:p>
       <w:pPr>
         <w:pStyle w:val="Bibliography"/>
@@ -7900,7 +7899,7 @@
       <w:r>
         <w:t xml:space="preserve"> </w:t>
       </w:r>
-      <w:hyperlink r:id="rId137">
+      <w:hyperlink r:id="rId138">
         <w:r>
           <w:rPr>
             <w:rStyle w:val="Hyperlink"/>
@@ -7912,8 +7911,8 @@
         <w:t xml:space="preserve">.</w:t>
       </w:r>
     </w:p>
-    <w:bookmarkEnd w:id="138"/>
-    <w:bookmarkStart w:id="140" w:name="ref-gihawi2023"/>
+    <w:bookmarkEnd w:id="139"/>
+    <w:bookmarkStart w:id="141" w:name="ref-gihawi2023"/>
     <w:p>
       <w:pPr>
         <w:pStyle w:val="Bibliography"/>
@@ -7946,7 +7945,7 @@
       <w:r>
         <w:t xml:space="preserve"> </w:t>
       </w:r>
-      <w:hyperlink r:id="rId139">
+      <w:hyperlink r:id="rId140">
         <w:r>
           <w:rPr>
             <w:rStyle w:val="Hyperlink"/>
@@ -7958,8 +7957,8 @@
         <w:t xml:space="preserve">.</w:t>
       </w:r>
     </w:p>
-    <w:bookmarkEnd w:id="140"/>
-    <w:bookmarkStart w:id="142" w:name="ref-rstanarm"/>
+    <w:bookmarkEnd w:id="141"/>
+    <w:bookmarkStart w:id="143" w:name="ref-rstanarm"/>
     <w:p>
       <w:pPr>
         <w:pStyle w:val="Bibliography"/>
@@ -8032,7 +8031,7 @@
       <w:r>
         <w:t xml:space="preserve"> </w:t>
       </w:r>
-      <w:hyperlink r:id="rId141">
+      <w:hyperlink r:id="rId142">
         <w:r>
           <w:rPr>
             <w:rStyle w:val="Hyperlink"/>
@@ -8044,8 +8043,8 @@
         <w:t xml:space="preserve">.</w:t>
       </w:r>
     </w:p>
-    <w:bookmarkEnd w:id="142"/>
-    <w:bookmarkStart w:id="143" w:name="ref-graham2017"/>
+    <w:bookmarkEnd w:id="143"/>
+    <w:bookmarkStart w:id="144" w:name="ref-graham2017"/>
     <w:p>
       <w:pPr>
         <w:pStyle w:val="Bibliography"/>
@@ -8076,8 +8075,8 @@
         <w:t xml:space="preserve">131 (17): 2201–21.</w:t>
       </w:r>
     </w:p>
-    <w:bookmarkEnd w:id="143"/>
-    <w:bookmarkStart w:id="144" w:name="ref-howley2015"/>
+    <w:bookmarkEnd w:id="144"/>
+    <w:bookmarkStart w:id="145" w:name="ref-howley2015"/>
     <w:p>
       <w:pPr>
         <w:pStyle w:val="Bibliography"/>
@@ -8108,8 +8107,8 @@
         <w:t xml:space="preserve">479-480: 290–96.</w:t>
       </w:r>
     </w:p>
-    <w:bookmarkEnd w:id="144"/>
-    <w:bookmarkStart w:id="146" w:name="ref-hultin2019"/>
+    <w:bookmarkEnd w:id="145"/>
+    <w:bookmarkStart w:id="147" w:name="ref-hultin2019"/>
     <w:p>
       <w:pPr>
         <w:pStyle w:val="Bibliography"/>
@@ -8151,7 +8150,7 @@
       <w:r>
         <w:t xml:space="preserve"> </w:t>
       </w:r>
-      <w:hyperlink r:id="rId145">
+      <w:hyperlink r:id="rId146">
         <w:r>
           <w:rPr>
             <w:rStyle w:val="Hyperlink"/>
@@ -8163,8 +8162,8 @@
         <w:t xml:space="preserve">.</w:t>
       </w:r>
     </w:p>
-    <w:bookmarkEnd w:id="146"/>
-    <w:bookmarkStart w:id="147" w:name="ref-johansson2013"/>
+    <w:bookmarkEnd w:id="147"/>
+    <w:bookmarkStart w:id="148" w:name="ref-johansson2013"/>
     <w:p>
       <w:pPr>
         <w:pStyle w:val="Bibliography"/>
@@ -8195,8 +8194,8 @@
         <w:t xml:space="preserve">11: 239–51.</w:t>
       </w:r>
     </w:p>
-    <w:bookmarkEnd w:id="147"/>
-    <w:bookmarkStart w:id="148" w:name="ref-dejong2018a"/>
+    <w:bookmarkEnd w:id="148"/>
+    <w:bookmarkStart w:id="149" w:name="ref-dejong2018a"/>
     <w:p>
       <w:pPr>
         <w:pStyle w:val="Bibliography"/>
@@ -8227,8 +8226,8 @@
         <w:t xml:space="preserve">9: 1222.</w:t>
       </w:r>
     </w:p>
-    <w:bookmarkEnd w:id="148"/>
-    <w:bookmarkStart w:id="150" w:name="ref-dejong2018b"/>
+    <w:bookmarkEnd w:id="149"/>
+    <w:bookmarkStart w:id="151" w:name="ref-dejong2018b"/>
     <w:p>
       <w:pPr>
         <w:pStyle w:val="Bibliography"/>
@@ -8296,7 +8295,7 @@
       <w:r>
         <w:t xml:space="preserve"> </w:t>
       </w:r>
-      <w:hyperlink r:id="rId149">
+      <w:hyperlink r:id="rId150">
         <w:r>
           <w:rPr>
             <w:rStyle w:val="Hyperlink"/>
@@ -8308,8 +8307,8 @@
         <w:t xml:space="preserve">.</w:t>
       </w:r>
     </w:p>
-    <w:bookmarkEnd w:id="150"/>
-    <w:bookmarkStart w:id="152" w:name="ref-kazemian2015"/>
+    <w:bookmarkEnd w:id="151"/>
+    <w:bookmarkStart w:id="153" w:name="ref-kazemian2015"/>
     <w:p>
       <w:pPr>
         <w:pStyle w:val="Bibliography"/>
@@ -8363,7 +8362,7 @@
       <w:r>
         <w:t xml:space="preserve"> </w:t>
       </w:r>
-      <w:hyperlink r:id="rId151">
+      <w:hyperlink r:id="rId152">
         <w:r>
           <w:rPr>
             <w:rStyle w:val="Hyperlink"/>
@@ -8375,8 +8374,8 @@
         <w:t xml:space="preserve">.</w:t>
       </w:r>
     </w:p>
-    <w:bookmarkEnd w:id="152"/>
-    <w:bookmarkStart w:id="153" w:name="ref-klymenko2017"/>
+    <w:bookmarkEnd w:id="153"/>
+    <w:bookmarkStart w:id="154" w:name="ref-klymenko2017"/>
     <w:p>
       <w:pPr>
         <w:pStyle w:val="Bibliography"/>
@@ -8416,8 +8415,8 @@
         <w:t xml:space="preserve">91 (24): e01001–17.</w:t>
       </w:r>
     </w:p>
-    <w:bookmarkEnd w:id="153"/>
-    <w:bookmarkStart w:id="155" w:name="ref-lambert2021"/>
+    <w:bookmarkEnd w:id="154"/>
+    <w:bookmarkStart w:id="156" w:name="ref-lambert2021"/>
     <w:p>
       <w:pPr>
         <w:pStyle w:val="Bibliography"/>
@@ -8450,7 +8449,7 @@
       <w:r>
         <w:t xml:space="preserve"> </w:t>
       </w:r>
-      <w:hyperlink r:id="rId154">
+      <w:hyperlink r:id="rId155">
         <w:r>
           <w:rPr>
             <w:rStyle w:val="Hyperlink"/>
@@ -8462,8 +8461,8 @@
         <w:t xml:space="preserve">.</w:t>
       </w:r>
     </w:p>
-    <w:bookmarkEnd w:id="155"/>
-    <w:bookmarkStart w:id="156" w:name="ref-lazarczyk2008"/>
+    <w:bookmarkEnd w:id="156"/>
+    <w:bookmarkStart w:id="157" w:name="ref-lazarczyk2008"/>
     <w:p>
       <w:pPr>
         <w:pStyle w:val="Bibliography"/>
@@ -8503,8 +8502,8 @@
         <w:t xml:space="preserve">205 (1): 35–42.</w:t>
       </w:r>
     </w:p>
-    <w:bookmarkEnd w:id="156"/>
-    <w:bookmarkStart w:id="158" w:name="ref-leiendecker2023"/>
+    <w:bookmarkEnd w:id="157"/>
+    <w:bookmarkStart w:id="159" w:name="ref-leiendecker2023"/>
     <w:p>
       <w:pPr>
         <w:pStyle w:val="Bibliography"/>
@@ -8546,7 +8545,7 @@
       <w:r>
         <w:t xml:space="preserve"> </w:t>
       </w:r>
-      <w:hyperlink r:id="rId157">
+      <w:hyperlink r:id="rId158">
         <w:r>
           <w:rPr>
             <w:rStyle w:val="Hyperlink"/>
@@ -8558,8 +8557,8 @@
         <w:t xml:space="preserve">.</w:t>
       </w:r>
     </w:p>
-    <w:bookmarkEnd w:id="158"/>
-    <w:bookmarkStart w:id="160" w:name="ref-leinonen2011"/>
+    <w:bookmarkEnd w:id="159"/>
+    <w:bookmarkStart w:id="161" w:name="ref-leinonen2011"/>
     <w:p>
       <w:pPr>
         <w:pStyle w:val="Bibliography"/>
@@ -8601,7 +8600,7 @@
       <w:r>
         <w:t xml:space="preserve"> </w:t>
       </w:r>
-      <w:hyperlink r:id="rId159">
+      <w:hyperlink r:id="rId160">
         <w:r>
           <w:rPr>
             <w:rStyle w:val="Hyperlink"/>
@@ -8613,8 +8612,8 @@
         <w:t xml:space="preserve">.</w:t>
       </w:r>
     </w:p>
-    <w:bookmarkEnd w:id="160"/>
-    <w:bookmarkStart w:id="162" w:name="ref-li2026"/>
+    <w:bookmarkEnd w:id="161"/>
+    <w:bookmarkStart w:id="163" w:name="ref-li2026"/>
     <w:p>
       <w:pPr>
         <w:pStyle w:val="Bibliography"/>
@@ -8656,7 +8655,7 @@
       <w:r>
         <w:t xml:space="preserve"> </w:t>
       </w:r>
-      <w:hyperlink r:id="rId161">
+      <w:hyperlink r:id="rId162">
         <w:r>
           <w:rPr>
             <w:rStyle w:val="Hyperlink"/>
@@ -8668,8 +8667,8 @@
         <w:t xml:space="preserve">.</w:t>
       </w:r>
     </w:p>
-    <w:bookmarkEnd w:id="162"/>
-    <w:bookmarkStart w:id="164" w:name="ref-liao2014"/>
+    <w:bookmarkEnd w:id="163"/>
+    <w:bookmarkStart w:id="165" w:name="ref-liao2014"/>
     <w:p>
       <w:pPr>
         <w:pStyle w:val="Bibliography"/>
@@ -8702,7 +8701,7 @@
       <w:r>
         <w:t xml:space="preserve"> </w:t>
       </w:r>
-      <w:hyperlink r:id="rId163">
+      <w:hyperlink r:id="rId164">
         <w:r>
           <w:rPr>
             <w:rStyle w:val="Hyperlink"/>
@@ -8714,8 +8713,8 @@
         <w:t xml:space="preserve">.</w:t>
       </w:r>
     </w:p>
-    <w:bookmarkEnd w:id="164"/>
-    <w:bookmarkStart w:id="166" w:name="ref-ma2014"/>
+    <w:bookmarkEnd w:id="165"/>
+    <w:bookmarkStart w:id="167" w:name="ref-ma2014"/>
     <w:p>
       <w:pPr>
         <w:pStyle w:val="Bibliography"/>
@@ -8748,7 +8747,7 @@
       <w:r>
         <w:t xml:space="preserve"> </w:t>
       </w:r>
-      <w:hyperlink r:id="rId165">
+      <w:hyperlink r:id="rId166">
         <w:r>
           <w:rPr>
             <w:rStyle w:val="Hyperlink"/>
@@ -8760,8 +8759,8 @@
         <w:t xml:space="preserve">.</w:t>
       </w:r>
     </w:p>
-    <w:bookmarkEnd w:id="166"/>
-    <w:bookmarkStart w:id="167" w:name="ref-meyers2017"/>
+    <w:bookmarkEnd w:id="167"/>
+    <w:bookmarkStart w:id="168" w:name="ref-meyers2017"/>
     <w:p>
       <w:pPr>
         <w:pStyle w:val="Bibliography"/>
@@ -8851,8 +8850,8 @@
         <w:t xml:space="preserve">13 (1): e1006171.</w:t>
       </w:r>
     </w:p>
-    <w:bookmarkEnd w:id="167"/>
-    <w:bookmarkStart w:id="168" w:name="ref-moody2010"/>
+    <w:bookmarkEnd w:id="168"/>
+    <w:bookmarkStart w:id="169" w:name="ref-moody2010"/>
     <w:p>
       <w:pPr>
         <w:pStyle w:val="Bibliography"/>
@@ -8883,8 +8882,8 @@
         <w:t xml:space="preserve">10 (8): 550–60.</w:t>
       </w:r>
     </w:p>
-    <w:bookmarkEnd w:id="168"/>
-    <w:bookmarkStart w:id="170" w:name="ref-morgan2024"/>
+    <w:bookmarkEnd w:id="169"/>
+    <w:bookmarkStart w:id="171" w:name="ref-morgan2024"/>
     <w:p>
       <w:pPr>
         <w:pStyle w:val="Bibliography"/>
@@ -8935,7 +8934,7 @@
       <w:r>
         <w:t xml:space="preserve"> </w:t>
       </w:r>
-      <w:hyperlink r:id="rId169">
+      <w:hyperlink r:id="rId170">
         <w:r>
           <w:rPr>
             <w:rStyle w:val="Hyperlink"/>
@@ -8947,8 +8946,8 @@
         <w:t xml:space="preserve">.</w:t>
       </w:r>
     </w:p>
-    <w:bookmarkEnd w:id="170"/>
-    <w:bookmarkStart w:id="172" w:name="ref-niller2011"/>
+    <w:bookmarkEnd w:id="171"/>
+    <w:bookmarkStart w:id="173" w:name="ref-niller2011"/>
     <w:p>
       <w:pPr>
         <w:pStyle w:val="Bibliography"/>
@@ -8981,7 +8980,7 @@
       <w:r>
         <w:t xml:space="preserve"> </w:t>
       </w:r>
-      <w:hyperlink r:id="rId171">
+      <w:hyperlink r:id="rId172">
         <w:r>
           <w:rPr>
             <w:rStyle w:val="Hyperlink"/>
@@ -8993,8 +8992,8 @@
         <w:t xml:space="preserve">.</w:t>
       </w:r>
     </w:p>
-    <w:bookmarkEnd w:id="172"/>
-    <w:bookmarkStart w:id="173" w:name="ref-nunes2018"/>
+    <w:bookmarkEnd w:id="173"/>
+    <w:bookmarkStart w:id="174" w:name="ref-nunes2018"/>
     <w:p>
       <w:pPr>
         <w:pStyle w:val="Bibliography"/>
@@ -9025,8 +9024,8 @@
         <w:t xml:space="preserve">73 (suppl 1): e489s.</w:t>
       </w:r>
     </w:p>
-    <w:bookmarkEnd w:id="173"/>
-    <w:bookmarkStart w:id="175" w:name="ref-oh2026"/>
+    <w:bookmarkEnd w:id="174"/>
+    <w:bookmarkStart w:id="176" w:name="ref-oh2026"/>
     <w:p>
       <w:pPr>
         <w:pStyle w:val="Bibliography"/>
@@ -9059,7 +9058,7 @@
       <w:r>
         <w:t xml:space="preserve"> </w:t>
       </w:r>
-      <w:hyperlink r:id="rId174">
+      <w:hyperlink r:id="rId175">
         <w:r>
           <w:rPr>
             <w:rStyle w:val="Hyperlink"/>
@@ -9071,8 +9070,8 @@
         <w:t xml:space="preserve">.</w:t>
       </w:r>
     </w:p>
-    <w:bookmarkEnd w:id="175"/>
-    <w:bookmarkStart w:id="176" w:name="ref-orth2006"/>
+    <w:bookmarkEnd w:id="176"/>
+    <w:bookmarkStart w:id="177" w:name="ref-orth2006"/>
     <w:p>
       <w:pPr>
         <w:pStyle w:val="Bibliography"/>
@@ -9103,8 +9102,8 @@
         <w:t xml:space="preserve">18 (6): 362–74.</w:t>
       </w:r>
     </w:p>
-    <w:bookmarkEnd w:id="176"/>
-    <w:bookmarkStart w:id="178" w:name="ref-purdie2005"/>
+    <w:bookmarkEnd w:id="177"/>
+    <w:bookmarkStart w:id="179" w:name="ref-purdie2005"/>
     <w:p>
       <w:pPr>
         <w:pStyle w:val="Bibliography"/>
@@ -9137,7 +9136,7 @@
       <w:r>
         <w:t xml:space="preserve"> </w:t>
       </w:r>
-      <w:hyperlink r:id="rId177">
+      <w:hyperlink r:id="rId178">
         <w:r>
           <w:rPr>
             <w:rStyle w:val="Hyperlink"/>
@@ -9149,8 +9148,8 @@
         <w:t xml:space="preserve">.</w:t>
       </w:r>
     </w:p>
-    <w:bookmarkEnd w:id="178"/>
-    <w:bookmarkStart w:id="180" w:name="ref-ramoz2002"/>
+    <w:bookmarkEnd w:id="179"/>
+    <w:bookmarkStart w:id="181" w:name="ref-ramoz2002"/>
     <w:p>
       <w:pPr>
         <w:pStyle w:val="Bibliography"/>
@@ -9183,7 +9182,7 @@
       <w:r>
         <w:t xml:space="preserve"> </w:t>
       </w:r>
-      <w:hyperlink r:id="rId179">
+      <w:hyperlink r:id="rId180">
         <w:r>
           <w:rPr>
             <w:rStyle w:val="Hyperlink"/>
@@ -9195,8 +9194,8 @@
         <w:t xml:space="preserve">.</w:t>
       </w:r>
     </w:p>
-    <w:bookmarkEnd w:id="180"/>
-    <w:bookmarkStart w:id="182" w:name="ref-rehm2022"/>
+    <w:bookmarkEnd w:id="181"/>
+    <w:bookmarkStart w:id="183" w:name="ref-rehm2022"/>
     <w:p>
       <w:pPr>
         <w:pStyle w:val="Bibliography"/>
@@ -9229,7 +9228,7 @@
       <w:r>
         <w:t xml:space="preserve"> </w:t>
       </w:r>
-      <w:hyperlink r:id="rId181">
+      <w:hyperlink r:id="rId182">
         <w:r>
           <w:rPr>
             <w:rStyle w:val="Hyperlink"/>
@@ -9241,8 +9240,8 @@
         <w:t xml:space="preserve">.</w:t>
       </w:r>
     </w:p>
-    <w:bookmarkEnd w:id="182"/>
-    <w:bookmarkStart w:id="184" w:name="ref-rollison2021"/>
+    <w:bookmarkEnd w:id="183"/>
+    <w:bookmarkStart w:id="185" w:name="ref-rollison2021"/>
     <w:p>
       <w:pPr>
         <w:pStyle w:val="Bibliography"/>
@@ -9275,7 +9274,7 @@
       <w:r>
         <w:t xml:space="preserve"> </w:t>
       </w:r>
-      <w:hyperlink r:id="rId183">
+      <w:hyperlink r:id="rId184">
         <w:r>
           <w:rPr>
             <w:rStyle w:val="Hyperlink"/>
@@ -9287,8 +9286,8 @@
         <w:t xml:space="preserve">.</w:t>
       </w:r>
     </w:p>
-    <w:bookmarkEnd w:id="184"/>
-    <w:bookmarkStart w:id="186" w:name="ref-rollison2019sites"/>
+    <w:bookmarkEnd w:id="185"/>
+    <w:bookmarkStart w:id="187" w:name="ref-rollison2019sites"/>
     <w:p>
       <w:pPr>
         <w:pStyle w:val="Bibliography"/>
@@ -9321,7 +9320,7 @@
       <w:r>
         <w:t xml:space="preserve"> </w:t>
       </w:r>
-      <w:hyperlink r:id="rId185">
+      <w:hyperlink r:id="rId186">
         <w:r>
           <w:rPr>
             <w:rStyle w:val="Hyperlink"/>
@@ -9333,8 +9332,8 @@
         <w:t xml:space="preserve">.</w:t>
       </w:r>
     </w:p>
-    <w:bookmarkEnd w:id="186"/>
-    <w:bookmarkStart w:id="188" w:name="ref-rollison2019"/>
+    <w:bookmarkEnd w:id="187"/>
+    <w:bookmarkStart w:id="189" w:name="ref-rollison2019"/>
     <w:p>
       <w:pPr>
         <w:pStyle w:val="Bibliography"/>
@@ -9367,7 +9366,7 @@
       <w:r>
         <w:t xml:space="preserve"> </w:t>
       </w:r>
-      <w:hyperlink r:id="rId187">
+      <w:hyperlink r:id="rId188">
         <w:r>
           <w:rPr>
             <w:rStyle w:val="Hyperlink"/>
@@ -9379,8 +9378,8 @@
         <w:t xml:space="preserve">.</w:t>
       </w:r>
     </w:p>
-    <w:bookmarkEnd w:id="188"/>
-    <w:bookmarkStart w:id="190" w:name="ref-saeidian2023"/>
+    <w:bookmarkEnd w:id="189"/>
+    <w:bookmarkStart w:id="191" w:name="ref-saeidian2023"/>
     <w:p>
       <w:pPr>
         <w:pStyle w:val="Bibliography"/>
@@ -9455,7 +9454,7 @@
       <w:r>
         <w:t xml:space="preserve"> </w:t>
       </w:r>
-      <w:hyperlink r:id="rId189">
+      <w:hyperlink r:id="rId190">
         <w:r>
           <w:rPr>
             <w:rStyle w:val="Hyperlink"/>
@@ -9467,8 +9466,8 @@
         <w:t xml:space="preserve">.</w:t>
       </w:r>
     </w:p>
-    <w:bookmarkEnd w:id="190"/>
-    <w:bookmarkStart w:id="192" w:name="ref-selitsky2020"/>
+    <w:bookmarkEnd w:id="191"/>
+    <w:bookmarkStart w:id="193" w:name="ref-selitsky2020"/>
     <w:p>
       <w:pPr>
         <w:pStyle w:val="Bibliography"/>
@@ -9519,7 +9518,7 @@
       <w:r>
         <w:t xml:space="preserve"> </w:t>
       </w:r>
-      <w:hyperlink r:id="rId191">
+      <w:hyperlink r:id="rId192">
         <w:r>
           <w:rPr>
             <w:rStyle w:val="Hyperlink"/>
@@ -9531,8 +9530,8 @@
         <w:t xml:space="preserve">.</w:t>
       </w:r>
     </w:p>
-    <w:bookmarkEnd w:id="192"/>
-    <w:bookmarkStart w:id="194" w:name="ref-shenpv2026"/>
+    <w:bookmarkEnd w:id="193"/>
+    <w:bookmarkStart w:id="195" w:name="ref-shenpv2026"/>
     <w:p>
       <w:pPr>
         <w:pStyle w:val="Bibliography"/>
@@ -9562,7 +9561,7 @@
       <w:r>
         <w:t xml:space="preserve"> </w:t>
       </w:r>
-      <w:hyperlink r:id="rId193">
+      <w:hyperlink r:id="rId194">
         <w:r>
           <w:rPr>
             <w:rStyle w:val="Hyperlink"/>
@@ -9574,8 +9573,8 @@
         <w:t xml:space="preserve">.</w:t>
       </w:r>
     </w:p>
-    <w:bookmarkEnd w:id="194"/>
-    <w:bookmarkStart w:id="196" w:name="ref-shen2016"/>
+    <w:bookmarkEnd w:id="195"/>
+    <w:bookmarkStart w:id="197" w:name="ref-shen2016"/>
     <w:p>
       <w:pPr>
         <w:pStyle w:val="Bibliography"/>
@@ -9626,7 +9625,7 @@
       <w:r>
         <w:t xml:space="preserve"> </w:t>
       </w:r>
-      <w:hyperlink r:id="rId195">
+      <w:hyperlink r:id="rId196">
         <w:r>
           <w:rPr>
             <w:rStyle w:val="Hyperlink"/>
@@ -9638,8 +9637,8 @@
         <w:t xml:space="preserve">.</w:t>
       </w:r>
     </w:p>
-    <w:bookmarkEnd w:id="196"/>
-    <w:bookmarkStart w:id="198" w:name="ref-son2025"/>
+    <w:bookmarkEnd w:id="197"/>
+    <w:bookmarkStart w:id="199" w:name="ref-son2025"/>
     <w:p>
       <w:pPr>
         <w:pStyle w:val="Bibliography"/>
@@ -9672,7 +9671,7 @@
       <w:r>
         <w:t xml:space="preserve"> </w:t>
       </w:r>
-      <w:hyperlink r:id="rId197">
+      <w:hyperlink r:id="rId198">
         <w:r>
           <w:rPr>
             <w:rStyle w:val="Hyperlink"/>
@@ -9684,8 +9683,8 @@
         <w:t xml:space="preserve">.</w:t>
       </w:r>
     </w:p>
-    <w:bookmarkEnd w:id="198"/>
-    <w:bookmarkStart w:id="200" w:name="ref-strickley2019"/>
+    <w:bookmarkEnd w:id="199"/>
+    <w:bookmarkStart w:id="201" w:name="ref-strickley2019"/>
     <w:p>
       <w:pPr>
         <w:pStyle w:val="Bibliography"/>
@@ -9718,7 +9717,7 @@
       <w:r>
         <w:t xml:space="preserve"> </w:t>
       </w:r>
-      <w:hyperlink r:id="rId199">
+      <w:hyperlink r:id="rId200">
         <w:r>
           <w:rPr>
             <w:rStyle w:val="Hyperlink"/>
@@ -9730,8 +9729,8 @@
         <w:t xml:space="preserve">.</w:t>
       </w:r>
     </w:p>
-    <w:bookmarkEnd w:id="200"/>
-    <w:bookmarkStart w:id="202" w:name="ref-strickley2021"/>
+    <w:bookmarkEnd w:id="201"/>
+    <w:bookmarkStart w:id="203" w:name="ref-strickley2021"/>
     <w:p>
       <w:pPr>
         <w:pStyle w:val="Bibliography"/>
@@ -9764,7 +9763,7 @@
       <w:r>
         <w:t xml:space="preserve"> </w:t>
       </w:r>
-      <w:hyperlink r:id="rId201">
+      <w:hyperlink r:id="rId202">
         <w:r>
           <w:rPr>
             <w:rStyle w:val="Hyperlink"/>
@@ -9776,8 +9775,8 @@
         <w:t xml:space="preserve">.</w:t>
       </w:r>
     </w:p>
-    <w:bookmarkEnd w:id="202"/>
-    <w:bookmarkStart w:id="203" w:name="ref-uberoi2016"/>
+    <w:bookmarkEnd w:id="203"/>
+    <w:bookmarkStart w:id="204" w:name="ref-uberoi2016"/>
     <w:p>
       <w:pPr>
         <w:pStyle w:val="Bibliography"/>
@@ -9808,8 +9807,8 @@
         <w:t xml:space="preserve">12 (5): e1005664.</w:t>
       </w:r>
     </w:p>
-    <w:bookmarkEnd w:id="203"/>
-    <w:bookmarkStart w:id="205" w:name="ref-vandoorslaer2017"/>
+    <w:bookmarkEnd w:id="204"/>
+    <w:bookmarkStart w:id="206" w:name="ref-vandoorslaer2017"/>
     <w:p>
       <w:pPr>
         <w:pStyle w:val="Bibliography"/>
@@ -9851,7 +9850,7 @@
       <w:r>
         <w:t xml:space="preserve"> </w:t>
       </w:r>
-      <w:hyperlink r:id="rId204">
+      <w:hyperlink r:id="rId205">
         <w:r>
           <w:rPr>
             <w:rStyle w:val="Hyperlink"/>
@@ -9863,8 +9862,8 @@
         <w:t xml:space="preserve">.</w:t>
       </w:r>
     </w:p>
-    <w:bookmarkEnd w:id="205"/>
-    <w:bookmarkStart w:id="207" w:name="ref-vandiver2021"/>
+    <w:bookmarkEnd w:id="206"/>
+    <w:bookmarkStart w:id="208" w:name="ref-vandiver2021"/>
     <w:p>
       <w:pPr>
         <w:pStyle w:val="Bibliography"/>
@@ -9909,7 +9908,7 @@
       <w:r>
         <w:t xml:space="preserve"> </w:t>
       </w:r>
-      <w:hyperlink r:id="rId206">
+      <w:hyperlink r:id="rId207">
         <w:r>
           <w:rPr>
             <w:rStyle w:val="Hyperlink"/>
@@ -9921,8 +9920,8 @@
         <w:t xml:space="preserve">.</w:t>
       </w:r>
     </w:p>
-    <w:bookmarkEnd w:id="207"/>
-    <w:bookmarkStart w:id="209" w:name="ref-viarisio2018"/>
+    <w:bookmarkEnd w:id="208"/>
+    <w:bookmarkStart w:id="210" w:name="ref-viarisio2018"/>
     <w:p>
       <w:pPr>
         <w:pStyle w:val="Bibliography"/>
@@ -9967,7 +9966,7 @@
       <w:r>
         <w:t xml:space="preserve"> </w:t>
       </w:r>
-      <w:hyperlink r:id="rId208">
+      <w:hyperlink r:id="rId209">
         <w:r>
           <w:rPr>
             <w:rStyle w:val="Hyperlink"/>
@@ -9979,8 +9978,8 @@
         <w:t xml:space="preserve">.</w:t>
       </w:r>
     </w:p>
-    <w:bookmarkEnd w:id="209"/>
-    <w:bookmarkStart w:id="210" w:name="ref-devilliers2004"/>
+    <w:bookmarkEnd w:id="210"/>
+    <w:bookmarkStart w:id="211" w:name="ref-devilliers2004"/>
     <w:p>
       <w:pPr>
         <w:pStyle w:val="Bibliography"/>
@@ -10011,8 +10010,8 @@
         <w:t xml:space="preserve">324 (1): 17–27.</w:t>
       </w:r>
     </w:p>
-    <w:bookmarkEnd w:id="210"/>
-    <w:bookmarkStart w:id="211" w:name="ref-wallace2012"/>
+    <w:bookmarkEnd w:id="211"/>
+    <w:bookmarkStart w:id="212" w:name="ref-wallace2012"/>
     <w:p>
       <w:pPr>
         <w:pStyle w:val="Bibliography"/>
@@ -10097,8 +10096,8 @@
         <w:t xml:space="preserve">8 (7): e1002807.</w:t>
       </w:r>
     </w:p>
-    <w:bookmarkEnd w:id="211"/>
-    <w:bookmarkStart w:id="213" w:name="ref-weissenborn2005"/>
+    <w:bookmarkEnd w:id="212"/>
+    <w:bookmarkStart w:id="214" w:name="ref-weissenborn2005"/>
     <w:p>
       <w:pPr>
         <w:pStyle w:val="Bibliography"/>
@@ -10140,7 +10139,7 @@
       <w:r>
         <w:t xml:space="preserve"> </w:t>
       </w:r>
-      <w:hyperlink r:id="rId212">
+      <w:hyperlink r:id="rId213">
         <w:r>
           <w:rPr>
             <w:rStyle w:val="Hyperlink"/>
@@ -10152,8 +10151,8 @@
         <w:t xml:space="preserve">.</w:t>
       </w:r>
     </w:p>
-    <w:bookmarkEnd w:id="213"/>
-    <w:bookmarkStart w:id="215" w:name="ref-weissenborn2012"/>
+    <w:bookmarkEnd w:id="214"/>
+    <w:bookmarkStart w:id="216" w:name="ref-weissenborn2012"/>
     <w:p>
       <w:pPr>
         <w:pStyle w:val="Bibliography"/>
@@ -10198,7 +10197,7 @@
       <w:r>
         <w:t xml:space="preserve"> </w:t>
       </w:r>
-      <w:hyperlink r:id="rId214">
+      <w:hyperlink r:id="rId215">
         <w:r>
           <w:rPr>
             <w:rStyle w:val="Hyperlink"/>
@@ -10210,8 +10209,8 @@
         <w:t xml:space="preserve">.</w:t>
       </w:r>
     </w:p>
-    <w:bookmarkEnd w:id="215"/>
-    <w:bookmarkStart w:id="217" w:name="ref-wenande2025"/>
+    <w:bookmarkEnd w:id="216"/>
+    <w:bookmarkStart w:id="218" w:name="ref-wenande2025"/>
     <w:p>
       <w:pPr>
         <w:pStyle w:val="Bibliography"/>
@@ -10256,7 +10255,7 @@
       <w:r>
         <w:t xml:space="preserve"> </w:t>
       </w:r>
-      <w:hyperlink r:id="rId216">
+      <w:hyperlink r:id="rId217">
         <w:r>
           <w:rPr>
             <w:rStyle w:val="Hyperlink"/>
@@ -10268,8 +10267,8 @@
         <w:t xml:space="preserve">.</w:t>
       </w:r>
     </w:p>
-    <w:bookmarkEnd w:id="217"/>
-    <w:bookmarkStart w:id="219" w:name="ref-wood2019"/>
+    <w:bookmarkEnd w:id="218"/>
+    <w:bookmarkStart w:id="220" w:name="ref-wood2019"/>
     <w:p>
       <w:pPr>
         <w:pStyle w:val="Bibliography"/>
@@ -10311,7 +10310,7 @@
       <w:r>
         <w:t xml:space="preserve"> </w:t>
       </w:r>
-      <w:hyperlink r:id="rId218">
+      <w:hyperlink r:id="rId219">
         <w:r>
           <w:rPr>
             <w:rStyle w:val="Hyperlink"/>
@@ -10323,8 +10322,8 @@
         <w:t xml:space="preserve">.</w:t>
       </w:r>
     </w:p>
-    <w:bookmarkEnd w:id="219"/>
-    <w:bookmarkStart w:id="220" w:name="ref-yasumizu2021"/>
+    <w:bookmarkEnd w:id="220"/>
+    <w:bookmarkStart w:id="221" w:name="ref-yasumizu2021"/>
     <w:p>
       <w:pPr>
         <w:pStyle w:val="Bibliography"/>
@@ -10373,8 +10372,8 @@
         <w:t xml:space="preserve">37 (10): 1465–67.</w:t>
       </w:r>
     </w:p>
-    <w:bookmarkEnd w:id="220"/>
-    <w:bookmarkStart w:id="222" w:name="ref-you2004"/>
+    <w:bookmarkEnd w:id="221"/>
+    <w:bookmarkStart w:id="223" w:name="ref-you2004"/>
     <w:p>
       <w:pPr>
         <w:pStyle w:val="Bibliography"/>
@@ -10443,7 +10442,7 @@
       <w:r>
         <w:t xml:space="preserve"> </w:t>
       </w:r>
-      <w:hyperlink r:id="rId221">
+      <w:hyperlink r:id="rId222">
         <w:r>
           <w:rPr>
             <w:rStyle w:val="Hyperlink"/>
@@ -10455,10 +10454,10 @@
         <w:t xml:space="preserve">.</w:t>
       </w:r>
     </w:p>
-    <w:bookmarkEnd w:id="222"/>
     <w:bookmarkEnd w:id="223"/>
     <w:bookmarkEnd w:id="224"/>
-    <w:bookmarkStart w:id="255" w:name="supplementary-material"/>
+    <w:bookmarkEnd w:id="225"/>
+    <w:bookmarkStart w:id="256" w:name="supplementary-material"/>
     <w:p>
       <w:pPr>
         <w:pStyle w:val="Heading1"/>
@@ -10467,7 +10466,7 @@
         <w:t xml:space="preserve">Supplementary Material</w:t>
       </w:r>
     </w:p>
-    <w:bookmarkStart w:id="252" w:name="supplementary-figures-and-tables"/>
+    <w:bookmarkStart w:id="253" w:name="supplementary-figures-and-tables"/>
     <w:p>
       <w:pPr>
         <w:pStyle w:val="Heading2"/>
@@ -10489,7 +10488,7 @@
       <w:tr>
         <w:tc>
           <w:tcPr/>
-          <w:bookmarkStart w:id="228" w:name="suppfig-depth"/>
+          <w:bookmarkStart w:id="229" w:name="suppfig-depth"/>
           <w:p>
             <w:pPr>
               <w:pStyle w:val="Compact"/>
@@ -10500,18 +10499,18 @@
                 <wp:inline>
                   <wp:extent cx="5943600" cy="3714749"/>
                   <wp:effectExtent b="0" l="0" r="0" t="0"/>
-                  <wp:docPr descr="" title="" id="226" name="Picture"/>
+                  <wp:docPr descr="" title="" id="227" name="Picture"/>
                   <a:graphic>
                     <a:graphicData uri="http://schemas.openxmlformats.org/drawingml/2006/picture">
                       <pic:pic>
                         <pic:nvPicPr>
-                          <pic:cNvPr descr="figureS1.png" id="227" name="Picture"/>
+                          <pic:cNvPr descr="figureS1.png" id="228" name="Picture"/>
                           <pic:cNvPicPr>
                             <a:picLocks noChangeArrowheads="1" noChangeAspect="1"/>
                           </pic:cNvPicPr>
                         </pic:nvPicPr>
                         <pic:blipFill>
-                          <a:blip r:embed="rId225"/>
+                          <a:blip r:embed="rId226"/>
                           <a:stretch>
                             <a:fillRect/>
                           </a:stretch>
@@ -10568,7 +10567,7 @@
               <w:t xml:space="preserve">is not produced by differences in sequencing depth: the groups that reach the floor do so at every depth, and the groups that do not never reach it, however deeply sequenced. Point size is proportional to the number of libraries in each group × bin.</w:t>
             </w:r>
           </w:p>
-          <w:bookmarkEnd w:id="228"/>
+          <w:bookmarkEnd w:id="229"/>
         </w:tc>
       </w:tr>
     </w:tbl>
@@ -10593,7 +10592,7 @@
       <w:tr>
         <w:tc>
           <w:tcPr/>
-          <w:bookmarkStart w:id="232" w:name="suppfig-trace"/>
+          <w:bookmarkStart w:id="233" w:name="suppfig-trace"/>
           <w:p>
             <w:pPr>
               <w:pStyle w:val="Compact"/>
@@ -10604,18 +10603,18 @@
                 <wp:inline>
                   <wp:extent cx="5943600" cy="3302000"/>
                   <wp:effectExtent b="0" l="0" r="0" t="0"/>
-                  <wp:docPr descr="" title="" id="230" name="Picture"/>
+                  <wp:docPr descr="" title="" id="231" name="Picture"/>
                   <a:graphic>
                     <a:graphicData uri="http://schemas.openxmlformats.org/drawingml/2006/picture">
                       <pic:pic>
                         <pic:nvPicPr>
-                          <pic:cNvPr descr="figureS2.png" id="231" name="Picture"/>
+                          <pic:cNvPr descr="figureS2.png" id="232" name="Picture"/>
                           <pic:cNvPicPr>
                             <a:picLocks noChangeArrowheads="1" noChangeAspect="1"/>
                           </pic:cNvPicPr>
                         </pic:nvPicPr>
                         <pic:blipFill>
-                          <a:blip r:embed="rId229"/>
+                          <a:blip r:embed="rId230"/>
                           <a:stretch>
                             <a:fillRect/>
                           </a:stretch>
@@ -10684,7 +10683,7 @@
               <w:t xml:space="preserve">= 54), split into three exclusive classes from the per-gene read counts the pipeline already writes: libraries with no reads on any HPV gene, libraries with gene-mapped reads that do not reach the productive threshold, and productive libraries (L1 ≥ 3 reads). Cell-line and engineered libraries are excluded throughout. The classes are assigned in that order of precedence, so a library appears in exactly one. The residual sample group with no recorded site is not in the denominator: the claim is about skin and neoplasia. Of the 57 gene-mapped but non-productive trace libraries, 52 carry early-gene reads with the late program absent and 5 carry only L2 reads below the productive bar; the median late-read fraction across the whole trace is 0, against 0.367 in the controls, which is the differentiation-coupled capsid burst the controls are there to show.</w:t>
             </w:r>
           </w:p>
-          <w:bookmarkEnd w:id="232"/>
+          <w:bookmarkEnd w:id="233"/>
         </w:tc>
       </w:tr>
     </w:tbl>
@@ -10709,7 +10708,7 @@
       <w:tr>
         <w:tc>
           <w:tcPr/>
-          <w:bookmarkStart w:id="236" w:name="suppfig-types"/>
+          <w:bookmarkStart w:id="237" w:name="suppfig-types"/>
           <w:p>
             <w:pPr>
               <w:pStyle w:val="Compact"/>
@@ -10720,18 +10719,18 @@
                 <wp:inline>
                   <wp:extent cx="5943600" cy="2993813"/>
                   <wp:effectExtent b="0" l="0" r="0" t="0"/>
-                  <wp:docPr descr="" title="" id="234" name="Picture"/>
+                  <wp:docPr descr="" title="" id="235" name="Picture"/>
                   <a:graphic>
                     <a:graphicData uri="http://schemas.openxmlformats.org/drawingml/2006/picture">
                       <pic:pic>
                         <pic:nvPicPr>
-                          <pic:cNvPr descr="figureS3.png" id="235" name="Picture"/>
+                          <pic:cNvPr descr="figureS3.png" id="236" name="Picture"/>
                           <pic:cNvPicPr>
                             <a:picLocks noChangeArrowheads="1" noChangeAspect="1"/>
                           </pic:cNvPicPr>
                         </pic:nvPicPr>
                         <pic:blipFill>
-                          <a:blip r:embed="rId233"/>
+                          <a:blip r:embed="rId234"/>
                           <a:stretch>
                             <a:fillRect/>
                           </a:stretch>
@@ -10866,7 +10865,7 @@
               <w:t xml:space="preserve">collapses both panels from type to genus.</w:t>
             </w:r>
           </w:p>
-          <w:bookmarkEnd w:id="236"/>
+          <w:bookmarkEnd w:id="237"/>
         </w:tc>
       </w:tr>
     </w:tbl>
@@ -10891,7 +10890,7 @@
       <w:tr>
         <w:tc>
           <w:tcPr/>
-          <w:bookmarkStart w:id="240" w:name="suppfig-reservoir-gut"/>
+          <w:bookmarkStart w:id="241" w:name="suppfig-reservoir-gut"/>
           <w:p>
             <w:pPr>
               <w:pStyle w:val="Compact"/>
@@ -10902,18 +10901,18 @@
                 <wp:inline>
                   <wp:extent cx="5943600" cy="4302034"/>
                   <wp:effectExtent b="0" l="0" r="0" t="0"/>
-                  <wp:docPr descr="" title="" id="238" name="Picture"/>
+                  <wp:docPr descr="" title="" id="239" name="Picture"/>
                   <a:graphic>
                     <a:graphicData uri="http://schemas.openxmlformats.org/drawingml/2006/picture">
                       <pic:pic>
                         <pic:nvPicPr>
-                          <pic:cNvPr descr="figureS4.png" id="239" name="Picture"/>
+                          <pic:cNvPr descr="figureS4.png" id="240" name="Picture"/>
                           <pic:cNvPicPr>
                             <a:picLocks noChangeArrowheads="1" noChangeAspect="1"/>
                           </pic:cNvPicPr>
                         </pic:nvPicPr>
                         <pic:blipFill>
-                          <a:blip r:embed="rId237"/>
+                          <a:blip r:embed="rId238"/>
                           <a:stretch>
                             <a:fillRect/>
                           </a:stretch>
@@ -11053,7 +11052,7 @@
               <w:t xml:space="preserve">to be read as biology: the identical procedure applied to vaginal libraries recovers an overwhelmingly alpha mucosal niche, which assembly noise could not produce. Only skin is carried into the main figure, since the paper’s subject is skin. Its composition is a mixture of mucosal alpha (30.5%) and cutaneous beta (34.9%), and its commonest types interleave the two (HPV16, HPV6 and HPV56 with HPV24, HPV124 and HPV37), which is the expected signature of a collection route that crosses perianal skin rather than of papillomavirus carriage in the gut; the same pattern is seen independently in rectal-swab cohorts. Read that way the site is a useful control, since it shows the catalog recovering the genus of whatever epithelium the sampling route touches, and its novel-cluster fraction (9.6%) sits with skin’s (14.5%) rather than with the vaginal site’s (0.2%), as expected if its beta/gamma content is cutaneous in origin.</w:t>
             </w:r>
           </w:p>
-          <w:bookmarkEnd w:id="240"/>
+          <w:bookmarkEnd w:id="241"/>
         </w:tc>
       </w:tr>
     </w:tbl>
@@ -11078,7 +11077,7 @@
       <w:tr>
         <w:tc>
           <w:tcPr/>
-          <w:bookmarkStart w:id="244" w:name="suppfig-bayes"/>
+          <w:bookmarkStart w:id="245" w:name="suppfig-bayes"/>
           <w:p>
             <w:pPr>
               <w:pStyle w:val="Compact"/>
@@ -11089,18 +11088,18 @@
                 <wp:inline>
                   <wp:extent cx="5943600" cy="2905759"/>
                   <wp:effectExtent b="0" l="0" r="0" t="0"/>
-                  <wp:docPr descr="" title="" id="242" name="Picture"/>
+                  <wp:docPr descr="" title="" id="243" name="Picture"/>
                   <a:graphic>
                     <a:graphicData uri="http://schemas.openxmlformats.org/drawingml/2006/picture">
                       <pic:pic>
                         <pic:nvPicPr>
-                          <pic:cNvPr descr="figureS5.png" id="243" name="Picture"/>
+                          <pic:cNvPr descr="figureS5.png" id="244" name="Picture"/>
                           <pic:cNvPicPr>
                             <a:picLocks noChangeArrowheads="1" noChangeAspect="1"/>
                           </pic:cNvPicPr>
                         </pic:nvPicPr>
                         <pic:blipFill>
-                          <a:blip r:embed="rId241"/>
+                          <a:blip r:embed="rId242"/>
                           <a:stretch>
                             <a:fillRect/>
                           </a:stretch>
@@ -11178,7 +11177,7 @@
               <w:t xml:space="preserve">(3) row is the prior-sensitivity refit of the contrast immediately above it, reported in that table’s caption rather than as a row of its own, and it sits further from 1 rather than nearer, which is what makes the productive-controls gap a finding rather than an artifact of the Normal prior. The axis spans five orders of magnitude because that contrast genuinely does.</w:t>
             </w:r>
           </w:p>
-          <w:bookmarkEnd w:id="244"/>
+          <w:bookmarkEnd w:id="245"/>
         </w:tc>
       </w:tr>
     </w:tbl>
@@ -11203,7 +11202,7 @@
       <w:tr>
         <w:tc>
           <w:tcPr/>
-          <w:bookmarkStart w:id="245" w:name="supptbl-types"/>
+          <w:bookmarkStart w:id="246" w:name="supptbl-types"/>
           <w:tbl>
             <w:tblPr>
               <w:tblStyle w:val="Table"/>
@@ -13983,7 +13982,7 @@
               <w:t xml:space="preserve">, at the level of HPV genus.</w:t>
             </w:r>
           </w:p>
-          <w:bookmarkEnd w:id="245"/>
+          <w:bookmarkEnd w:id="246"/>
         </w:tc>
       </w:tr>
     </w:tbl>
@@ -14008,7 +14007,7 @@
       <w:tr>
         <w:tc>
           <w:tcPr/>
-          <w:bookmarkStart w:id="246" w:name="supptbl-productive"/>
+          <w:bookmarkStart w:id="247" w:name="supptbl-productive"/>
           <w:tbl>
             <w:tblPr>
               <w:tblStyle w:val="Table"/>
@@ -14695,7 +14694,7 @@
               <w:t xml:space="preserve">).</w:t>
             </w:r>
           </w:p>
-          <w:bookmarkEnd w:id="246"/>
+          <w:bookmarkEnd w:id="247"/>
         </w:tc>
       </w:tr>
     </w:tbl>
@@ -14720,7 +14719,7 @@
       <w:tr>
         <w:tc>
           <w:tcPr/>
-          <w:bookmarkStart w:id="247" w:name="supptbl-bayes"/>
+          <w:bookmarkStart w:id="248" w:name="supptbl-bayes"/>
           <w:tbl>
             <w:tblPr>
               <w:tblStyle w:val="Table"/>
@@ -15300,7 +15299,7 @@
               <w:t xml:space="preserve">(3) prior gives an even larger posterior OR, 14,515 [3,961, 77,562], confirming robustness). Sequencing depth is modeled per 10-fold (log₁₀) change in library size.</w:t>
             </w:r>
           </w:p>
-          <w:bookmarkEnd w:id="247"/>
+          <w:bookmarkEnd w:id="248"/>
         </w:tc>
       </w:tr>
     </w:tbl>
@@ -15325,7 +15324,7 @@
       <w:tr>
         <w:tc>
           <w:tcPr/>
-          <w:bookmarkStart w:id="248" w:name="supptbl-cin"/>
+          <w:bookmarkStart w:id="249" w:name="supptbl-cin"/>
           <w:tbl>
             <w:tblPr>
               <w:tblStyle w:val="Table"/>
@@ -15706,7 +15705,7 @@
               <w:t xml:space="preserve">= 0.0038). Retaining them is therefore the conservative analytical choice: the small floor-level excess of neoplasia over skin reported in the main text is an upper bound. Virus–host junction calling supports the same reading from an independent direction: the members of this set that carry enough viral reads to test are integration-positive, whereas the cutaneous-neoplasia libraries outside it are not. Integration is the expected state of mucosal HPV16 in carcinoma and is not a property of the cutaneous reservoir, so the assignment of these libraries to a mucosal origin rests on genome state as well as on type.</w:t>
             </w:r>
           </w:p>
-          <w:bookmarkEnd w:id="248"/>
+          <w:bookmarkEnd w:id="249"/>
         </w:tc>
       </w:tr>
     </w:tbl>
@@ -15731,7 +15730,7 @@
       <w:tr>
         <w:tc>
           <w:tcPr/>
-          <w:bookmarkStart w:id="249" w:name="supptbl-chem"/>
+          <w:bookmarkStart w:id="250" w:name="supptbl-chem"/>
           <w:tbl>
             <w:tblPr>
               <w:tblStyle w:val="Table"/>
@@ -16649,7 +16648,7 @@
               <w:t xml:space="preserve">= 7.2×10⁻¹²) and yields no above-floor library in either group.</w:t>
             </w:r>
           </w:p>
-          <w:bookmarkEnd w:id="249"/>
+          <w:bookmarkEnd w:id="250"/>
         </w:tc>
       </w:tr>
     </w:tbl>
@@ -16674,7 +16673,7 @@
       <w:tr>
         <w:tc>
           <w:tcPr/>
-          <w:bookmarkStart w:id="250" w:name="supptbl-trace"/>
+          <w:bookmarkStart w:id="251" w:name="supptbl-trace"/>
           <w:tbl>
             <w:tblPr>
               <w:tblStyle w:val="Table"/>
@@ -19379,7 +19378,7 @@
               <w:t xml:space="preserve">, from HPV type to HPV genus.</w:t>
             </w:r>
           </w:p>
-          <w:bookmarkEnd w:id="250"/>
+          <w:bookmarkEnd w:id="251"/>
         </w:tc>
       </w:tr>
     </w:tbl>
@@ -19404,7 +19403,7 @@
       <w:tr>
         <w:tc>
           <w:tcPr/>
-          <w:bookmarkStart w:id="251" w:name="supptbl-coinf"/>
+          <w:bookmarkStart w:id="252" w:name="supptbl-coinf"/>
           <w:tbl>
             <w:tblPr>
               <w:tblStyle w:val="Table"/>
@@ -20921,12 +20920,12 @@
               <w:t xml:space="preserve">, which retains only uniquely-mapped reads, since STAR assigns MAPQ ≤ 3 to any read placing equally well on two references, so cross-mapping between similar types cannot manufacture a co-infection call: each type in a row is supported by reads that map to it and to nothing else. Three cautions govern how far the table can be read. First, the rows are not independent observations: 13 of the 26 come from the paired studies SRP314958 (RNA-seq) and SRP314961 (MeRIP-seq), which are condyloma lesions from 5 donors (CA_1 to CA_5), each sequenced as an RNA-seq library plus a MeRIP input and IP fraction, so rows sharing a donor carry near-identical read profiles. Second, the secondary types often sit close to the threshold: across all non-dominant calls the median depth is 9.0× and 39% fall below 5×, so which type is called second can depend on the library fraction, and in donor CA_2 the RNA-seq and MeRIP input fractions call HPV6 + HPV11 while the IP fraction of the same specimen calls HPV6 + HPV42. Third, the deepest type in a co-infected library typically dominates its partner, by a median of 45-fold (interquartile range 14 to 2,175), so most rows describe one established infection alongside a minor second type rather than two comparable ones. Where both partners are unambiguous the pairings are biologically coherent: two carcinoma and actinic-keratosis libraries whose SRA records carry no tissue field (ERR2274877, ERR1971044) carry the beta-types HPV96 and HPV182 together at 98–99% breadth and 61–245× depth, and an EV biopsy (SRR21205038) carries the beta-types HPV20 and HPV9 at 18,558× and 736×; both are two full genomes in one library, not a genome plus a fragment. The most frequent pairing in the study is HPV11 with HPV42: 8 libraries carry both, against 14 with HPV11 alone and 1 with HPV42 alone. Requiring both partners to clear a stricter bar (breadth ≥ 0.70 and depth ≥ 5× for each) leaves 3 libraries from 1 of those donors (CA_1). Their dominance relation is asymmetric: HPV11 is the deeper type in all five condyloma lesions, exceeding HPV42 48- to 4,100-fold in the three with a strong HPV11 signal (CA_1, CA_4, CA_5) and 2- to 4-fold in the other two, so HPV42 is the minor partner throughout and clears the assignment threshold only where it happens to be abundant. Whether the pairing is a genuine dual infection or an artifact of that sensitivity limit cannot be settled from five donors of one study: it is a hypothesis the data motivate, not a result they support.</w:t>
             </w:r>
           </w:p>
-          <w:bookmarkEnd w:id="251"/>
+          <w:bookmarkEnd w:id="252"/>
         </w:tc>
       </w:tr>
     </w:tbl>
-    <w:bookmarkEnd w:id="252"/>
-    <w:bookmarkStart w:id="254" w:name="sec-s-crosstalk"/>
+    <w:bookmarkEnd w:id="253"/>
+    <w:bookmarkStart w:id="255" w:name="sec-s-crosstalk"/>
     <w:p>
       <w:pPr>
         <w:pStyle w:val="Heading2"/>
@@ -21156,7 +21155,7 @@
       <w:tr>
         <w:tc>
           <w:tcPr/>
-          <w:bookmarkStart w:id="253" w:name="supptbl-e2"/>
+          <w:bookmarkStart w:id="254" w:name="supptbl-e2"/>
           <w:tbl>
             <w:tblPr>
               <w:tblStyle w:val="Table"/>
@@ -21684,12 +21683,12 @@
               <w:t xml:space="preserve">against RefSeq papillomavirus open reading frames, and scored for whether E2 is present given that E1 is present. The comparison that matters is between the two right-hand columns and the two left-hand ones. Across all contigs, E2 recovery tracks assembly quality rather than biology: it is lowest in cervical CIN (79.3%) and cervical carcinoma (83.6%), which are also the arms with the shortest contigs, and highest in the vaginal and gut metagenomes, which assemble best. Once the question is restricted to near-complete contigs (≥7 kb), where E2 presence can actually be assessed, every category converges on 100%, and cervical carcinoma, in which integration and E2 disruption are the rule, returns 99.3% against 99.9% for skin. That convergence is not a biological result. An integrated genome cannot assemble across the virus-host junction, so conditioning on completeness selects episomal genomes in every category, and the statistic is structurally incapable of detecting the event it was built to detect. This table is reported because the inference is an inviting one to draw from a public contig catalog, and because it bounds what the DNA axis can contribute: presence of a papillomavirus in such a catalog is presence of a detectable L1, and carries no information about the state of the genome (Discussion).</w:t>
             </w:r>
           </w:p>
-          <w:bookmarkEnd w:id="253"/>
+          <w:bookmarkEnd w:id="254"/>
         </w:tc>
       </w:tr>
     </w:tbl>
-    <w:bookmarkEnd w:id="254"/>
     <w:bookmarkEnd w:id="255"/>
+    <w:bookmarkEnd w:id="256"/>
     <w:sectPr>
       <w:headerReference r:id="rId9" w:type="default"/>
       <w:pgSz w:h="15840" w:w="12240"/>

</xml_diff>

<commit_message>
manuscript: apply internal review r1 and cut to the JID word limit
- Restore the log2 scale anchor for the Figure 1c medians and derive the
  normal-to-carcinoma fold change from the data (7.7).
- Hedge the mixed-genome-state sentence against biopsy admixture; add
  per-arm n to the Figure 1c caption.
- Discussion: drop the HPV2 sentence and the literature recap that repeats
  the Introduction; cite the 10,834 denominator for HPV8; merge the duplicated
  biopsy-dilution point; split the mechanism paragraph; copy-edits.
- Plain-language pass (ISO 24495) on the sentences changed this round.
- Add a draft Declaration of Generative AI Use.
- Retire the full-length version; only the scale fix goes into it.

Main text about 3,478 words (was 3,627).

Co-Authored-By: Claude Opus 5.5 <noreply@anthropic.com>
</commit_message>
<xml_diff>
--- a/manuscript/manuscript.docx
+++ b/manuscript/manuscript.docx
@@ -2869,7 +2869,19 @@
         <w:t xml:space="preserve"> </w:t>
       </w:r>
       <w:r>
-        <w:t xml:space="preserve">c it runs from 0.36 in normal epithelium (</w:t>
+        <w:t xml:space="preserve">c, plotted on the log</w:t>
+      </w:r>
+      <w:r>
+        <w:rPr>
+          <w:vertAlign w:val="subscript"/>
+        </w:rPr>
+        <w:t xml:space="preserve">2</w:t>
+      </w:r>
+      <w:r>
+        <w:t xml:space="preserve"> </w:t>
+      </w:r>
+      <w:r>
+        <w:t xml:space="preserve">scale, it runs from 0.36 in normal epithelium (</w:t>
       </w:r>
       <w:r>
         <w:rPr>
@@ -2908,7 +2920,7 @@
         <w:t xml:space="preserve"> </w:t>
       </w:r>
       <w:r>
-        <w:t xml:space="preserve">= 6), a shift of roughly eightfold, in the direction integration predicts. Late transcription tracks the same axis without being part of the criterion: the libraries called episomal carry abundant L1, while those with a disrupted ratio carry almost none. The binary call is the weaker readout at this size, separating the carcinoma and lesion arms from normal epithelium (2 and 2 of six against 0 of 3) but not from each other, and the normal-epithelium arm is thin: two of its six libraries yielded no HPV reads and a third carried two. The gradient, not the threshold, is what this series supports.</w:t>
+        <w:t xml:space="preserve">= 6), a 7.7-fold rise from normal epithelium to carcinoma, in the direction integration predicts. Late transcription tracks the same axis without being part of the criterion: the libraries called episomal carry abundant L1, while those with a disrupted ratio carry almost none. The binary call is the weaker readout at this size, separating the carcinoma and lesion arms from normal epithelium (2 and 2 of six against 0 of 3) but not from each other, and the normal-epithelium arm is thin: two of its six libraries yielded no HPV reads and a third carried two. The gradient, not the threshold, is what this series supports.</w:t>
       </w:r>
     </w:p>
     <w:tbl>
@@ -6262,17 +6274,35 @@
       </w:r>
     </w:p>
     <w:bookmarkEnd w:id="84"/>
-    <w:bookmarkStart w:id="225" w:name="references"/>
+    <w:bookmarkStart w:id="85" w:name="declaration-of-generative-ai-use"/>
     <w:p>
       <w:pPr>
         <w:pStyle w:val="Heading2"/>
       </w:pPr>
       <w:r>
+        <w:t xml:space="preserve">Declaration of Generative AI Use</w:t>
+      </w:r>
+    </w:p>
+    <w:p>
+      <w:pPr>
+        <w:pStyle w:val="FirstParagraph"/>
+      </w:pPr>
+      <w:r>
+        <w:t xml:space="preserve">During this work the authors used Claude (Anthropic) to assist with writing and debugging the analysis pipeline and statistical code, and with editing the manuscript text, and Microsoft Copilot to help draft review comments on the manuscript. The authors reviewed and edited all output and take full responsibility for the content of the publication.</w:t>
+      </w:r>
+    </w:p>
+    <w:bookmarkEnd w:id="85"/>
+    <w:bookmarkStart w:id="226" w:name="references"/>
+    <w:p>
+      <w:pPr>
+        <w:pStyle w:val="Heading2"/>
+      </w:pPr>
+      <w:r>
         <w:t xml:space="preserve">References</w:t>
       </w:r>
     </w:p>
-    <w:bookmarkStart w:id="224" w:name="refs"/>
-    <w:bookmarkStart w:id="86" w:name="ref-adey2013"/>
+    <w:bookmarkStart w:id="225" w:name="refs"/>
+    <w:bookmarkStart w:id="87" w:name="ref-adey2013"/>
     <w:p>
       <w:pPr>
         <w:pStyle w:val="Bibliography"/>
@@ -6317,7 +6347,7 @@
       <w:r>
         <w:t xml:space="preserve"> </w:t>
       </w:r>
-      <w:hyperlink r:id="rId85">
+      <w:hyperlink r:id="rId86">
         <w:r>
           <w:rPr>
             <w:rStyle w:val="Hyperlink"/>
@@ -6329,8 +6359,8 @@
         <w:t xml:space="preserve">.</w:t>
       </w:r>
     </w:p>
-    <w:bookmarkEnd w:id="86"/>
-    <w:bookmarkStart w:id="88" w:name="ref-antonsson2000"/>
+    <w:bookmarkEnd w:id="87"/>
+    <w:bookmarkStart w:id="89" w:name="ref-antonsson2000"/>
     <w:p>
       <w:pPr>
         <w:pStyle w:val="Bibliography"/>
@@ -6363,7 +6393,7 @@
       <w:r>
         <w:t xml:space="preserve"> </w:t>
       </w:r>
-      <w:hyperlink r:id="rId87">
+      <w:hyperlink r:id="rId88">
         <w:r>
           <w:rPr>
             <w:rStyle w:val="Hyperlink"/>
@@ -6375,8 +6405,8 @@
         <w:t xml:space="preserve">.</w:t>
       </w:r>
     </w:p>
-    <w:bookmarkEnd w:id="88"/>
-    <w:bookmarkStart w:id="90" w:name="ref-arron2011"/>
+    <w:bookmarkEnd w:id="89"/>
+    <w:bookmarkStart w:id="91" w:name="ref-arron2011"/>
     <w:p>
       <w:pPr>
         <w:pStyle w:val="Bibliography"/>
@@ -6409,7 +6439,7 @@
       <w:r>
         <w:t xml:space="preserve"> </w:t>
       </w:r>
-      <w:hyperlink r:id="rId89">
+      <w:hyperlink r:id="rId90">
         <w:r>
           <w:rPr>
             <w:rStyle w:val="Hyperlink"/>
@@ -6421,8 +6451,8 @@
         <w:t xml:space="preserve">.</w:t>
       </w:r>
     </w:p>
-    <w:bookmarkEnd w:id="90"/>
-    <w:bookmarkStart w:id="92" w:name="ref-arroyomuhr2021"/>
+    <w:bookmarkEnd w:id="91"/>
+    <w:bookmarkStart w:id="93" w:name="ref-arroyomuhr2021"/>
     <w:p>
       <w:pPr>
         <w:pStyle w:val="Bibliography"/>
@@ -6455,7 +6485,7 @@
       <w:r>
         <w:t xml:space="preserve"> </w:t>
       </w:r>
-      <w:hyperlink r:id="rId91">
+      <w:hyperlink r:id="rId92">
         <w:r>
           <w:rPr>
             <w:rStyle w:val="Hyperlink"/>
@@ -6467,8 +6497,8 @@
         <w:t xml:space="preserve">.</w:t>
       </w:r>
     </w:p>
-    <w:bookmarkEnd w:id="92"/>
-    <w:bookmarkStart w:id="94" w:name="ref-asplund2019"/>
+    <w:bookmarkEnd w:id="93"/>
+    <w:bookmarkStart w:id="95" w:name="ref-asplund2019"/>
     <w:p>
       <w:pPr>
         <w:pStyle w:val="Bibliography"/>
@@ -6501,7 +6531,7 @@
       <w:r>
         <w:t xml:space="preserve"> </w:t>
       </w:r>
-      <w:hyperlink r:id="rId93">
+      <w:hyperlink r:id="rId94">
         <w:r>
           <w:rPr>
             <w:rStyle w:val="Hyperlink"/>
@@ -6513,8 +6543,8 @@
         <w:t xml:space="preserve">.</w:t>
       </w:r>
     </w:p>
-    <w:bookmarkEnd w:id="94"/>
-    <w:bookmarkStart w:id="96" w:name="ref-bhargava2025"/>
+    <w:bookmarkEnd w:id="95"/>
+    <w:bookmarkStart w:id="97" w:name="ref-bhargava2025"/>
     <w:p>
       <w:pPr>
         <w:pStyle w:val="Bibliography"/>
@@ -6559,7 +6589,7 @@
       <w:r>
         <w:t xml:space="preserve"> </w:t>
       </w:r>
-      <w:hyperlink r:id="rId95">
+      <w:hyperlink r:id="rId96">
         <w:r>
           <w:rPr>
             <w:rStyle w:val="Hyperlink"/>
@@ -6571,8 +6601,8 @@
         <w:t xml:space="preserve">.</w:t>
       </w:r>
     </w:p>
-    <w:bookmarkEnd w:id="96"/>
-    <w:bookmarkStart w:id="97" w:name="ref-borgogna2014"/>
+    <w:bookmarkEnd w:id="97"/>
+    <w:bookmarkStart w:id="98" w:name="ref-borgogna2014"/>
     <w:p>
       <w:pPr>
         <w:pStyle w:val="Bibliography"/>
@@ -6614,8 +6644,8 @@
         <w:t xml:space="preserve">27: 1101–15.</w:t>
       </w:r>
     </w:p>
-    <w:bookmarkEnd w:id="97"/>
-    <w:bookmarkStart w:id="99" w:name="ref-borgogna2018"/>
+    <w:bookmarkEnd w:id="98"/>
+    <w:bookmarkStart w:id="100" w:name="ref-borgogna2018"/>
     <w:p>
       <w:pPr>
         <w:pStyle w:val="Bibliography"/>
@@ -6665,7 +6695,7 @@
       <w:r>
         <w:t xml:space="preserve"> </w:t>
       </w:r>
-      <w:hyperlink r:id="rId98">
+      <w:hyperlink r:id="rId99">
         <w:r>
           <w:rPr>
             <w:rStyle w:val="Hyperlink"/>
@@ -6677,8 +6707,8 @@
         <w:t xml:space="preserve">.</w:t>
       </w:r>
     </w:p>
-    <w:bookmarkEnd w:id="99"/>
-    <w:bookmarkStart w:id="101" w:name="ref-boulet2009"/>
+    <w:bookmarkEnd w:id="100"/>
+    <w:bookmarkStart w:id="102" w:name="ref-boulet2009"/>
     <w:p>
       <w:pPr>
         <w:pStyle w:val="Bibliography"/>
@@ -6746,7 +6776,7 @@
       <w:r>
         <w:t xml:space="preserve"> </w:t>
       </w:r>
-      <w:hyperlink r:id="rId100">
+      <w:hyperlink r:id="rId101">
         <w:r>
           <w:rPr>
             <w:rStyle w:val="Hyperlink"/>
@@ -6758,8 +6788,8 @@
         <w:t xml:space="preserve">.</w:t>
       </w:r>
     </w:p>
-    <w:bookmarkEnd w:id="101"/>
-    <w:bookmarkStart w:id="103" w:name="ref-bzhalava2014"/>
+    <w:bookmarkEnd w:id="102"/>
+    <w:bookmarkStart w:id="104" w:name="ref-bzhalava2014"/>
     <w:p>
       <w:pPr>
         <w:pStyle w:val="Bibliography"/>
@@ -6792,7 +6822,7 @@
       <w:r>
         <w:t xml:space="preserve"> </w:t>
       </w:r>
-      <w:hyperlink r:id="rId102">
+      <w:hyperlink r:id="rId103">
         <w:r>
           <w:rPr>
             <w:rStyle w:val="Hyperlink"/>
@@ -6804,8 +6834,8 @@
         <w:t xml:space="preserve">.</w:t>
       </w:r>
     </w:p>
-    <w:bookmarkEnd w:id="103"/>
-    <w:bookmarkStart w:id="104" w:name="ref-bzhalava2015"/>
+    <w:bookmarkEnd w:id="104"/>
+    <w:bookmarkStart w:id="105" w:name="ref-bzhalava2015"/>
     <w:p>
       <w:pPr>
         <w:pStyle w:val="Bibliography"/>
@@ -6836,8 +6866,8 @@
         <w:t xml:space="preserve">476: 341–44.</w:t>
       </w:r>
     </w:p>
-    <w:bookmarkEnd w:id="104"/>
-    <w:bookmarkStart w:id="106" w:name="ref-cantalupo2015"/>
+    <w:bookmarkEnd w:id="105"/>
+    <w:bookmarkStart w:id="107" w:name="ref-cantalupo2015"/>
     <w:p>
       <w:pPr>
         <w:pStyle w:val="Bibliography"/>
@@ -6891,7 +6921,7 @@
       <w:r>
         <w:t xml:space="preserve"> </w:t>
       </w:r>
-      <w:hyperlink r:id="rId105">
+      <w:hyperlink r:id="rId106">
         <w:r>
           <w:rPr>
             <w:rStyle w:val="Hyperlink"/>
@@ -6903,8 +6933,8 @@
         <w:t xml:space="preserve">.</w:t>
       </w:r>
     </w:p>
-    <w:bookmarkEnd w:id="106"/>
-    <w:bookmarkStart w:id="108" w:name="ref-cantalupo2019"/>
+    <w:bookmarkEnd w:id="107"/>
+    <w:bookmarkStart w:id="109" w:name="ref-cantalupo2019"/>
     <w:p>
       <w:pPr>
         <w:pStyle w:val="Bibliography"/>
@@ -6949,7 +6979,7 @@
       <w:r>
         <w:t xml:space="preserve"> </w:t>
       </w:r>
-      <w:hyperlink r:id="rId107">
+      <w:hyperlink r:id="rId108">
         <w:r>
           <w:rPr>
             <w:rStyle w:val="Hyperlink"/>
@@ -6961,8 +6991,8 @@
         <w:t xml:space="preserve">.</w:t>
       </w:r>
     </w:p>
-    <w:bookmarkEnd w:id="108"/>
-    <w:bookmarkStart w:id="110" w:name="ref-chen2018"/>
+    <w:bookmarkEnd w:id="109"/>
+    <w:bookmarkStart w:id="111" w:name="ref-chen2018"/>
     <w:p>
       <w:pPr>
         <w:pStyle w:val="Bibliography"/>
@@ -7007,7 +7037,7 @@
       <w:r>
         <w:t xml:space="preserve"> </w:t>
       </w:r>
-      <w:hyperlink r:id="rId109">
+      <w:hyperlink r:id="rId110">
         <w:r>
           <w:rPr>
             <w:rStyle w:val="Hyperlink"/>
@@ -7019,8 +7049,8 @@
         <w:t xml:space="preserve">.</w:t>
       </w:r>
     </w:p>
-    <w:bookmarkEnd w:id="110"/>
-    <w:bookmarkStart w:id="112" w:name="ref-cheung2008"/>
+    <w:bookmarkEnd w:id="111"/>
+    <w:bookmarkStart w:id="113" w:name="ref-cheung2008"/>
     <w:p>
       <w:pPr>
         <w:pStyle w:val="Bibliography"/>
@@ -7053,7 +7083,7 @@
       <w:r>
         <w:t xml:space="preserve"> </w:t>
       </w:r>
-      <w:hyperlink r:id="rId111">
+      <w:hyperlink r:id="rId112">
         <w:r>
           <w:rPr>
             <w:rStyle w:val="Hyperlink"/>
@@ -7065,8 +7095,8 @@
         <w:t xml:space="preserve">.</w:t>
       </w:r>
     </w:p>
-    <w:bookmarkEnd w:id="112"/>
-    <w:bookmarkStart w:id="114" w:name="ref-chikhi2024"/>
+    <w:bookmarkEnd w:id="113"/>
+    <w:bookmarkStart w:id="115" w:name="ref-chikhi2024"/>
     <w:p>
       <w:pPr>
         <w:pStyle w:val="Bibliography"/>
@@ -7096,7 +7126,7 @@
       <w:r>
         <w:t xml:space="preserve"> </w:t>
       </w:r>
-      <w:hyperlink r:id="rId113">
+      <w:hyperlink r:id="rId114">
         <w:r>
           <w:rPr>
             <w:rStyle w:val="Hyperlink"/>
@@ -7108,8 +7138,8 @@
         <w:t xml:space="preserve">.</w:t>
       </w:r>
     </w:p>
-    <w:bookmarkEnd w:id="114"/>
-    <w:bookmarkStart w:id="116" w:name="ref-choi2018"/>
+    <w:bookmarkEnd w:id="115"/>
+    <w:bookmarkStart w:id="117" w:name="ref-choi2018"/>
     <w:p>
       <w:pPr>
         <w:pStyle w:val="Bibliography"/>
@@ -7181,7 +7211,7 @@
       <w:r>
         <w:t xml:space="preserve"> </w:t>
       </w:r>
-      <w:hyperlink r:id="rId115">
+      <w:hyperlink r:id="rId116">
         <w:r>
           <w:rPr>
             <w:rStyle w:val="Hyperlink"/>
@@ -7193,8 +7223,8 @@
         <w:t xml:space="preserve">.</w:t>
       </w:r>
     </w:p>
-    <w:bookmarkEnd w:id="116"/>
-    <w:bookmarkStart w:id="118" w:name="ref-collins2009"/>
+    <w:bookmarkEnd w:id="117"/>
+    <w:bookmarkStart w:id="119" w:name="ref-collins2009"/>
     <w:p>
       <w:pPr>
         <w:pStyle w:val="Bibliography"/>
@@ -7239,7 +7269,7 @@
       <w:r>
         <w:t xml:space="preserve"> </w:t>
       </w:r>
-      <w:hyperlink r:id="rId117">
+      <w:hyperlink r:id="rId118">
         <w:r>
           <w:rPr>
             <w:rStyle w:val="Hyperlink"/>
@@ -7251,8 +7281,8 @@
         <w:t xml:space="preserve">.</w:t>
       </w:r>
     </w:p>
-    <w:bookmarkEnd w:id="118"/>
-    <w:bookmarkStart w:id="120" w:name="ref-danecek2021"/>
+    <w:bookmarkEnd w:id="119"/>
+    <w:bookmarkStart w:id="121" w:name="ref-danecek2021"/>
     <w:p>
       <w:pPr>
         <w:pStyle w:val="Bibliography"/>
@@ -7306,7 +7336,7 @@
       <w:r>
         <w:t xml:space="preserve"> </w:t>
       </w:r>
-      <w:hyperlink r:id="rId119">
+      <w:hyperlink r:id="rId120">
         <w:r>
           <w:rPr>
             <w:rStyle w:val="Hyperlink"/>
@@ -7318,8 +7348,8 @@
         <w:t xml:space="preserve">.</w:t>
       </w:r>
     </w:p>
-    <w:bookmarkEnd w:id="120"/>
-    <w:bookmarkStart w:id="122" w:name="ref-devitt2019"/>
+    <w:bookmarkEnd w:id="121"/>
+    <w:bookmarkStart w:id="123" w:name="ref-devitt2019"/>
     <w:p>
       <w:pPr>
         <w:pStyle w:val="Bibliography"/>
@@ -7376,7 +7406,7 @@
       <w:r>
         <w:t xml:space="preserve"> </w:t>
       </w:r>
-      <w:hyperlink r:id="rId121">
+      <w:hyperlink r:id="rId122">
         <w:r>
           <w:rPr>
             <w:rStyle w:val="Hyperlink"/>
@@ -7388,8 +7418,8 @@
         <w:t xml:space="preserve">.</w:t>
       </w:r>
     </w:p>
-    <w:bookmarkEnd w:id="122"/>
-    <w:bookmarkStart w:id="124" w:name="ref-ditommaso2017"/>
+    <w:bookmarkEnd w:id="123"/>
+    <w:bookmarkStart w:id="125" w:name="ref-ditommaso2017"/>
     <w:p>
       <w:pPr>
         <w:pStyle w:val="Bibliography"/>
@@ -7422,7 +7452,7 @@
       <w:r>
         <w:t xml:space="preserve"> </w:t>
       </w:r>
-      <w:hyperlink r:id="rId123">
+      <w:hyperlink r:id="rId124">
         <w:r>
           <w:rPr>
             <w:rStyle w:val="Hyperlink"/>
@@ -7434,8 +7464,8 @@
         <w:t xml:space="preserve">.</w:t>
       </w:r>
     </w:p>
-    <w:bookmarkEnd w:id="124"/>
-    <w:bookmarkStart w:id="126" w:name="ref-dobin2013"/>
+    <w:bookmarkEnd w:id="125"/>
+    <w:bookmarkStart w:id="127" w:name="ref-dobin2013"/>
     <w:p>
       <w:pPr>
         <w:pStyle w:val="Bibliography"/>
@@ -7486,7 +7516,7 @@
       <w:r>
         <w:t xml:space="preserve"> </w:t>
       </w:r>
-      <w:hyperlink r:id="rId125">
+      <w:hyperlink r:id="rId126">
         <w:r>
           <w:rPr>
             <w:rStyle w:val="Hyperlink"/>
@@ -7498,8 +7528,8 @@
         <w:t xml:space="preserve">.</w:t>
       </w:r>
     </w:p>
-    <w:bookmarkEnd w:id="126"/>
-    <w:bookmarkStart w:id="127" w:name="ref-doorbar2023"/>
+    <w:bookmarkEnd w:id="127"/>
+    <w:bookmarkStart w:id="128" w:name="ref-doorbar2023"/>
     <w:p>
       <w:pPr>
         <w:pStyle w:val="Bibliography"/>
@@ -7530,8 +7560,8 @@
         <w:t xml:space="preserve">16: 200268.</w:t>
       </w:r>
     </w:p>
-    <w:bookmarkEnd w:id="127"/>
-    <w:bookmarkStart w:id="128" w:name="ref-doorbar2012"/>
+    <w:bookmarkEnd w:id="128"/>
+    <w:bookmarkStart w:id="129" w:name="ref-doorbar2012"/>
     <w:p>
       <w:pPr>
         <w:pStyle w:val="Bibliography"/>
@@ -7562,8 +7592,8 @@
         <w:t xml:space="preserve">30 (Suppl 5): F55–70.</w:t>
       </w:r>
     </w:p>
-    <w:bookmarkEnd w:id="128"/>
-    <w:bookmarkStart w:id="129" w:name="ref-dorfer2021"/>
+    <w:bookmarkEnd w:id="129"/>
+    <w:bookmarkStart w:id="130" w:name="ref-dorfer2021"/>
     <w:p>
       <w:pPr>
         <w:pStyle w:val="Bibliography"/>
@@ -7603,8 +7633,8 @@
         <w:t xml:space="preserve">21 (2): 525–39.</w:t>
       </w:r>
     </w:p>
-    <w:bookmarkEnd w:id="129"/>
-    <w:bookmarkStart w:id="131" w:name="ref-edgar2022"/>
+    <w:bookmarkEnd w:id="130"/>
+    <w:bookmarkStart w:id="132" w:name="ref-edgar2022"/>
     <w:p>
       <w:pPr>
         <w:pStyle w:val="Bibliography"/>
@@ -7637,7 +7667,7 @@
       <w:r>
         <w:t xml:space="preserve"> </w:t>
       </w:r>
-      <w:hyperlink r:id="rId130">
+      <w:hyperlink r:id="rId131">
         <w:r>
           <w:rPr>
             <w:rStyle w:val="Hyperlink"/>
@@ -7649,8 +7679,8 @@
         <w:t xml:space="preserve">.</w:t>
       </w:r>
     </w:p>
-    <w:bookmarkEnd w:id="131"/>
-    <w:bookmarkStart w:id="132" w:name="ref-egawa2017"/>
+    <w:bookmarkEnd w:id="132"/>
+    <w:bookmarkStart w:id="133" w:name="ref-egawa2017"/>
     <w:p>
       <w:pPr>
         <w:pStyle w:val="Bibliography"/>
@@ -7681,8 +7711,8 @@
         <w:t xml:space="preserve">231: 119–27.</w:t>
       </w:r>
     </w:p>
-    <w:bookmarkEnd w:id="132"/>
-    <w:bookmarkStart w:id="134" w:name="ref-fan2023"/>
+    <w:bookmarkEnd w:id="133"/>
+    <w:bookmarkStart w:id="135" w:name="ref-fan2023"/>
     <w:p>
       <w:pPr>
         <w:pStyle w:val="Bibliography"/>
@@ -7727,7 +7757,7 @@
       <w:r>
         <w:t xml:space="preserve"> </w:t>
       </w:r>
-      <w:hyperlink r:id="rId133">
+      <w:hyperlink r:id="rId134">
         <w:r>
           <w:rPr>
             <w:rStyle w:val="Hyperlink"/>
@@ -7739,8 +7769,8 @@
         <w:t xml:space="preserve">.</w:t>
       </w:r>
     </w:p>
-    <w:bookmarkEnd w:id="134"/>
-    <w:bookmarkStart w:id="136" w:name="ref-fisher2015"/>
+    <w:bookmarkEnd w:id="135"/>
+    <w:bookmarkStart w:id="137" w:name="ref-fisher2015"/>
     <w:p>
       <w:pPr>
         <w:pStyle w:val="Bibliography"/>
@@ -7779,7 +7809,7 @@
       <w:r>
         <w:t xml:space="preserve"> </w:t>
       </w:r>
-      <w:hyperlink r:id="rId135">
+      <w:hyperlink r:id="rId136">
         <w:r>
           <w:rPr>
             <w:rStyle w:val="Hyperlink"/>
@@ -7791,8 +7821,8 @@
         <w:t xml:space="preserve">.</w:t>
       </w:r>
     </w:p>
-    <w:bookmarkEnd w:id="136"/>
-    <w:bookmarkStart w:id="137" w:name="ref-foulongne2012"/>
+    <w:bookmarkEnd w:id="137"/>
+    <w:bookmarkStart w:id="138" w:name="ref-foulongne2012"/>
     <w:p>
       <w:pPr>
         <w:pStyle w:val="Bibliography"/>
@@ -7835,8 +7865,8 @@
         <w:t xml:space="preserve">7 (6): e38499.</w:t>
       </w:r>
     </w:p>
-    <w:bookmarkEnd w:id="137"/>
-    <w:bookmarkStart w:id="139" w:name="ref-fujimoto2019"/>
+    <w:bookmarkEnd w:id="138"/>
+    <w:bookmarkStart w:id="140" w:name="ref-fujimoto2019"/>
     <w:p>
       <w:pPr>
         <w:pStyle w:val="Bibliography"/>
@@ -7899,7 +7929,7 @@
       <w:r>
         <w:t xml:space="preserve"> </w:t>
       </w:r>
-      <w:hyperlink r:id="rId138">
+      <w:hyperlink r:id="rId139">
         <w:r>
           <w:rPr>
             <w:rStyle w:val="Hyperlink"/>
@@ -7911,8 +7941,8 @@
         <w:t xml:space="preserve">.</w:t>
       </w:r>
     </w:p>
-    <w:bookmarkEnd w:id="139"/>
-    <w:bookmarkStart w:id="141" w:name="ref-gihawi2023"/>
+    <w:bookmarkEnd w:id="140"/>
+    <w:bookmarkStart w:id="142" w:name="ref-gihawi2023"/>
     <w:p>
       <w:pPr>
         <w:pStyle w:val="Bibliography"/>
@@ -7945,7 +7975,7 @@
       <w:r>
         <w:t xml:space="preserve"> </w:t>
       </w:r>
-      <w:hyperlink r:id="rId140">
+      <w:hyperlink r:id="rId141">
         <w:r>
           <w:rPr>
             <w:rStyle w:val="Hyperlink"/>
@@ -7957,8 +7987,8 @@
         <w:t xml:space="preserve">.</w:t>
       </w:r>
     </w:p>
-    <w:bookmarkEnd w:id="141"/>
-    <w:bookmarkStart w:id="143" w:name="ref-rstanarm"/>
+    <w:bookmarkEnd w:id="142"/>
+    <w:bookmarkStart w:id="144" w:name="ref-rstanarm"/>
     <w:p>
       <w:pPr>
         <w:pStyle w:val="Bibliography"/>
@@ -8031,7 +8061,7 @@
       <w:r>
         <w:t xml:space="preserve"> </w:t>
       </w:r>
-      <w:hyperlink r:id="rId142">
+      <w:hyperlink r:id="rId143">
         <w:r>
           <w:rPr>
             <w:rStyle w:val="Hyperlink"/>
@@ -8043,8 +8073,8 @@
         <w:t xml:space="preserve">.</w:t>
       </w:r>
     </w:p>
-    <w:bookmarkEnd w:id="143"/>
-    <w:bookmarkStart w:id="144" w:name="ref-graham2017"/>
+    <w:bookmarkEnd w:id="144"/>
+    <w:bookmarkStart w:id="145" w:name="ref-graham2017"/>
     <w:p>
       <w:pPr>
         <w:pStyle w:val="Bibliography"/>
@@ -8075,8 +8105,8 @@
         <w:t xml:space="preserve">131 (17): 2201–21.</w:t>
       </w:r>
     </w:p>
-    <w:bookmarkEnd w:id="144"/>
-    <w:bookmarkStart w:id="145" w:name="ref-howley2015"/>
+    <w:bookmarkEnd w:id="145"/>
+    <w:bookmarkStart w:id="146" w:name="ref-howley2015"/>
     <w:p>
       <w:pPr>
         <w:pStyle w:val="Bibliography"/>
@@ -8107,8 +8137,8 @@
         <w:t xml:space="preserve">479-480: 290–96.</w:t>
       </w:r>
     </w:p>
-    <w:bookmarkEnd w:id="145"/>
-    <w:bookmarkStart w:id="147" w:name="ref-hultin2019"/>
+    <w:bookmarkEnd w:id="146"/>
+    <w:bookmarkStart w:id="148" w:name="ref-hultin2019"/>
     <w:p>
       <w:pPr>
         <w:pStyle w:val="Bibliography"/>
@@ -8150,7 +8180,7 @@
       <w:r>
         <w:t xml:space="preserve"> </w:t>
       </w:r>
-      <w:hyperlink r:id="rId146">
+      <w:hyperlink r:id="rId147">
         <w:r>
           <w:rPr>
             <w:rStyle w:val="Hyperlink"/>
@@ -8162,8 +8192,8 @@
         <w:t xml:space="preserve">.</w:t>
       </w:r>
     </w:p>
-    <w:bookmarkEnd w:id="147"/>
-    <w:bookmarkStart w:id="148" w:name="ref-johansson2013"/>
+    <w:bookmarkEnd w:id="148"/>
+    <w:bookmarkStart w:id="149" w:name="ref-johansson2013"/>
     <w:p>
       <w:pPr>
         <w:pStyle w:val="Bibliography"/>
@@ -8194,8 +8224,8 @@
         <w:t xml:space="preserve">11: 239–51.</w:t>
       </w:r>
     </w:p>
-    <w:bookmarkEnd w:id="148"/>
-    <w:bookmarkStart w:id="149" w:name="ref-dejong2018a"/>
+    <w:bookmarkEnd w:id="149"/>
+    <w:bookmarkStart w:id="150" w:name="ref-dejong2018a"/>
     <w:p>
       <w:pPr>
         <w:pStyle w:val="Bibliography"/>
@@ -8226,8 +8256,8 @@
         <w:t xml:space="preserve">9: 1222.</w:t>
       </w:r>
     </w:p>
-    <w:bookmarkEnd w:id="149"/>
-    <w:bookmarkStart w:id="151" w:name="ref-dejong2018b"/>
+    <w:bookmarkEnd w:id="150"/>
+    <w:bookmarkStart w:id="152" w:name="ref-dejong2018b"/>
     <w:p>
       <w:pPr>
         <w:pStyle w:val="Bibliography"/>
@@ -8295,7 +8325,7 @@
       <w:r>
         <w:t xml:space="preserve"> </w:t>
       </w:r>
-      <w:hyperlink r:id="rId150">
+      <w:hyperlink r:id="rId151">
         <w:r>
           <w:rPr>
             <w:rStyle w:val="Hyperlink"/>
@@ -8307,8 +8337,8 @@
         <w:t xml:space="preserve">.</w:t>
       </w:r>
     </w:p>
-    <w:bookmarkEnd w:id="151"/>
-    <w:bookmarkStart w:id="153" w:name="ref-kazemian2015"/>
+    <w:bookmarkEnd w:id="152"/>
+    <w:bookmarkStart w:id="154" w:name="ref-kazemian2015"/>
     <w:p>
       <w:pPr>
         <w:pStyle w:val="Bibliography"/>
@@ -8362,7 +8392,7 @@
       <w:r>
         <w:t xml:space="preserve"> </w:t>
       </w:r>
-      <w:hyperlink r:id="rId152">
+      <w:hyperlink r:id="rId153">
         <w:r>
           <w:rPr>
             <w:rStyle w:val="Hyperlink"/>
@@ -8374,8 +8404,8 @@
         <w:t xml:space="preserve">.</w:t>
       </w:r>
     </w:p>
-    <w:bookmarkEnd w:id="153"/>
-    <w:bookmarkStart w:id="154" w:name="ref-klymenko2017"/>
+    <w:bookmarkEnd w:id="154"/>
+    <w:bookmarkStart w:id="155" w:name="ref-klymenko2017"/>
     <w:p>
       <w:pPr>
         <w:pStyle w:val="Bibliography"/>
@@ -8415,8 +8445,8 @@
         <w:t xml:space="preserve">91 (24): e01001–17.</w:t>
       </w:r>
     </w:p>
-    <w:bookmarkEnd w:id="154"/>
-    <w:bookmarkStart w:id="156" w:name="ref-lambert2021"/>
+    <w:bookmarkEnd w:id="155"/>
+    <w:bookmarkStart w:id="157" w:name="ref-lambert2021"/>
     <w:p>
       <w:pPr>
         <w:pStyle w:val="Bibliography"/>
@@ -8449,7 +8479,7 @@
       <w:r>
         <w:t xml:space="preserve"> </w:t>
       </w:r>
-      <w:hyperlink r:id="rId155">
+      <w:hyperlink r:id="rId156">
         <w:r>
           <w:rPr>
             <w:rStyle w:val="Hyperlink"/>
@@ -8461,8 +8491,8 @@
         <w:t xml:space="preserve">.</w:t>
       </w:r>
     </w:p>
-    <w:bookmarkEnd w:id="156"/>
-    <w:bookmarkStart w:id="157" w:name="ref-lazarczyk2008"/>
+    <w:bookmarkEnd w:id="157"/>
+    <w:bookmarkStart w:id="158" w:name="ref-lazarczyk2008"/>
     <w:p>
       <w:pPr>
         <w:pStyle w:val="Bibliography"/>
@@ -8502,8 +8532,8 @@
         <w:t xml:space="preserve">205 (1): 35–42.</w:t>
       </w:r>
     </w:p>
-    <w:bookmarkEnd w:id="157"/>
-    <w:bookmarkStart w:id="159" w:name="ref-leiendecker2023"/>
+    <w:bookmarkEnd w:id="158"/>
+    <w:bookmarkStart w:id="160" w:name="ref-leiendecker2023"/>
     <w:p>
       <w:pPr>
         <w:pStyle w:val="Bibliography"/>
@@ -8545,7 +8575,7 @@
       <w:r>
         <w:t xml:space="preserve"> </w:t>
       </w:r>
-      <w:hyperlink r:id="rId158">
+      <w:hyperlink r:id="rId159">
         <w:r>
           <w:rPr>
             <w:rStyle w:val="Hyperlink"/>
@@ -8557,8 +8587,8 @@
         <w:t xml:space="preserve">.</w:t>
       </w:r>
     </w:p>
-    <w:bookmarkEnd w:id="159"/>
-    <w:bookmarkStart w:id="161" w:name="ref-leinonen2011"/>
+    <w:bookmarkEnd w:id="160"/>
+    <w:bookmarkStart w:id="162" w:name="ref-leinonen2011"/>
     <w:p>
       <w:pPr>
         <w:pStyle w:val="Bibliography"/>
@@ -8600,7 +8630,7 @@
       <w:r>
         <w:t xml:space="preserve"> </w:t>
       </w:r>
-      <w:hyperlink r:id="rId160">
+      <w:hyperlink r:id="rId161">
         <w:r>
           <w:rPr>
             <w:rStyle w:val="Hyperlink"/>
@@ -8612,8 +8642,8 @@
         <w:t xml:space="preserve">.</w:t>
       </w:r>
     </w:p>
-    <w:bookmarkEnd w:id="161"/>
-    <w:bookmarkStart w:id="163" w:name="ref-li2026"/>
+    <w:bookmarkEnd w:id="162"/>
+    <w:bookmarkStart w:id="164" w:name="ref-li2026"/>
     <w:p>
       <w:pPr>
         <w:pStyle w:val="Bibliography"/>
@@ -8655,7 +8685,7 @@
       <w:r>
         <w:t xml:space="preserve"> </w:t>
       </w:r>
-      <w:hyperlink r:id="rId162">
+      <w:hyperlink r:id="rId163">
         <w:r>
           <w:rPr>
             <w:rStyle w:val="Hyperlink"/>
@@ -8667,8 +8697,8 @@
         <w:t xml:space="preserve">.</w:t>
       </w:r>
     </w:p>
-    <w:bookmarkEnd w:id="163"/>
-    <w:bookmarkStart w:id="165" w:name="ref-liao2014"/>
+    <w:bookmarkEnd w:id="164"/>
+    <w:bookmarkStart w:id="166" w:name="ref-liao2014"/>
     <w:p>
       <w:pPr>
         <w:pStyle w:val="Bibliography"/>
@@ -8701,7 +8731,7 @@
       <w:r>
         <w:t xml:space="preserve"> </w:t>
       </w:r>
-      <w:hyperlink r:id="rId164">
+      <w:hyperlink r:id="rId165">
         <w:r>
           <w:rPr>
             <w:rStyle w:val="Hyperlink"/>
@@ -8713,8 +8743,8 @@
         <w:t xml:space="preserve">.</w:t>
       </w:r>
     </w:p>
-    <w:bookmarkEnd w:id="165"/>
-    <w:bookmarkStart w:id="167" w:name="ref-ma2014"/>
+    <w:bookmarkEnd w:id="166"/>
+    <w:bookmarkStart w:id="168" w:name="ref-ma2014"/>
     <w:p>
       <w:pPr>
         <w:pStyle w:val="Bibliography"/>
@@ -8747,7 +8777,7 @@
       <w:r>
         <w:t xml:space="preserve"> </w:t>
       </w:r>
-      <w:hyperlink r:id="rId166">
+      <w:hyperlink r:id="rId167">
         <w:r>
           <w:rPr>
             <w:rStyle w:val="Hyperlink"/>
@@ -8759,8 +8789,8 @@
         <w:t xml:space="preserve">.</w:t>
       </w:r>
     </w:p>
-    <w:bookmarkEnd w:id="167"/>
-    <w:bookmarkStart w:id="168" w:name="ref-meyers2017"/>
+    <w:bookmarkEnd w:id="168"/>
+    <w:bookmarkStart w:id="169" w:name="ref-meyers2017"/>
     <w:p>
       <w:pPr>
         <w:pStyle w:val="Bibliography"/>
@@ -8850,8 +8880,8 @@
         <w:t xml:space="preserve">13 (1): e1006171.</w:t>
       </w:r>
     </w:p>
-    <w:bookmarkEnd w:id="168"/>
-    <w:bookmarkStart w:id="169" w:name="ref-moody2010"/>
+    <w:bookmarkEnd w:id="169"/>
+    <w:bookmarkStart w:id="170" w:name="ref-moody2010"/>
     <w:p>
       <w:pPr>
         <w:pStyle w:val="Bibliography"/>
@@ -8882,8 +8912,8 @@
         <w:t xml:space="preserve">10 (8): 550–60.</w:t>
       </w:r>
     </w:p>
-    <w:bookmarkEnd w:id="169"/>
-    <w:bookmarkStart w:id="171" w:name="ref-morgan2024"/>
+    <w:bookmarkEnd w:id="170"/>
+    <w:bookmarkStart w:id="172" w:name="ref-morgan2024"/>
     <w:p>
       <w:pPr>
         <w:pStyle w:val="Bibliography"/>
@@ -8934,7 +8964,7 @@
       <w:r>
         <w:t xml:space="preserve"> </w:t>
       </w:r>
-      <w:hyperlink r:id="rId170">
+      <w:hyperlink r:id="rId171">
         <w:r>
           <w:rPr>
             <w:rStyle w:val="Hyperlink"/>
@@ -8946,8 +8976,8 @@
         <w:t xml:space="preserve">.</w:t>
       </w:r>
     </w:p>
-    <w:bookmarkEnd w:id="171"/>
-    <w:bookmarkStart w:id="173" w:name="ref-niller2011"/>
+    <w:bookmarkEnd w:id="172"/>
+    <w:bookmarkStart w:id="174" w:name="ref-niller2011"/>
     <w:p>
       <w:pPr>
         <w:pStyle w:val="Bibliography"/>
@@ -8980,7 +9010,7 @@
       <w:r>
         <w:t xml:space="preserve"> </w:t>
       </w:r>
-      <w:hyperlink r:id="rId172">
+      <w:hyperlink r:id="rId173">
         <w:r>
           <w:rPr>
             <w:rStyle w:val="Hyperlink"/>
@@ -8992,8 +9022,8 @@
         <w:t xml:space="preserve">.</w:t>
       </w:r>
     </w:p>
-    <w:bookmarkEnd w:id="173"/>
-    <w:bookmarkStart w:id="174" w:name="ref-nunes2018"/>
+    <w:bookmarkEnd w:id="174"/>
+    <w:bookmarkStart w:id="175" w:name="ref-nunes2018"/>
     <w:p>
       <w:pPr>
         <w:pStyle w:val="Bibliography"/>
@@ -9024,8 +9054,8 @@
         <w:t xml:space="preserve">73 (suppl 1): e489s.</w:t>
       </w:r>
     </w:p>
-    <w:bookmarkEnd w:id="174"/>
-    <w:bookmarkStart w:id="176" w:name="ref-oh2026"/>
+    <w:bookmarkEnd w:id="175"/>
+    <w:bookmarkStart w:id="177" w:name="ref-oh2026"/>
     <w:p>
       <w:pPr>
         <w:pStyle w:val="Bibliography"/>
@@ -9058,7 +9088,7 @@
       <w:r>
         <w:t xml:space="preserve"> </w:t>
       </w:r>
-      <w:hyperlink r:id="rId175">
+      <w:hyperlink r:id="rId176">
         <w:r>
           <w:rPr>
             <w:rStyle w:val="Hyperlink"/>
@@ -9070,8 +9100,8 @@
         <w:t xml:space="preserve">.</w:t>
       </w:r>
     </w:p>
-    <w:bookmarkEnd w:id="176"/>
-    <w:bookmarkStart w:id="177" w:name="ref-orth2006"/>
+    <w:bookmarkEnd w:id="177"/>
+    <w:bookmarkStart w:id="178" w:name="ref-orth2006"/>
     <w:p>
       <w:pPr>
         <w:pStyle w:val="Bibliography"/>
@@ -9102,8 +9132,8 @@
         <w:t xml:space="preserve">18 (6): 362–74.</w:t>
       </w:r>
     </w:p>
-    <w:bookmarkEnd w:id="177"/>
-    <w:bookmarkStart w:id="179" w:name="ref-purdie2005"/>
+    <w:bookmarkEnd w:id="178"/>
+    <w:bookmarkStart w:id="180" w:name="ref-purdie2005"/>
     <w:p>
       <w:pPr>
         <w:pStyle w:val="Bibliography"/>
@@ -9136,7 +9166,7 @@
       <w:r>
         <w:t xml:space="preserve"> </w:t>
       </w:r>
-      <w:hyperlink r:id="rId178">
+      <w:hyperlink r:id="rId179">
         <w:r>
           <w:rPr>
             <w:rStyle w:val="Hyperlink"/>
@@ -9148,8 +9178,8 @@
         <w:t xml:space="preserve">.</w:t>
       </w:r>
     </w:p>
-    <w:bookmarkEnd w:id="179"/>
-    <w:bookmarkStart w:id="181" w:name="ref-ramoz2002"/>
+    <w:bookmarkEnd w:id="180"/>
+    <w:bookmarkStart w:id="182" w:name="ref-ramoz2002"/>
     <w:p>
       <w:pPr>
         <w:pStyle w:val="Bibliography"/>
@@ -9182,7 +9212,7 @@
       <w:r>
         <w:t xml:space="preserve"> </w:t>
       </w:r>
-      <w:hyperlink r:id="rId180">
+      <w:hyperlink r:id="rId181">
         <w:r>
           <w:rPr>
             <w:rStyle w:val="Hyperlink"/>
@@ -9194,8 +9224,8 @@
         <w:t xml:space="preserve">.</w:t>
       </w:r>
     </w:p>
-    <w:bookmarkEnd w:id="181"/>
-    <w:bookmarkStart w:id="183" w:name="ref-rehm2022"/>
+    <w:bookmarkEnd w:id="182"/>
+    <w:bookmarkStart w:id="184" w:name="ref-rehm2022"/>
     <w:p>
       <w:pPr>
         <w:pStyle w:val="Bibliography"/>
@@ -9228,7 +9258,7 @@
       <w:r>
         <w:t xml:space="preserve"> </w:t>
       </w:r>
-      <w:hyperlink r:id="rId182">
+      <w:hyperlink r:id="rId183">
         <w:r>
           <w:rPr>
             <w:rStyle w:val="Hyperlink"/>
@@ -9240,8 +9270,8 @@
         <w:t xml:space="preserve">.</w:t>
       </w:r>
     </w:p>
-    <w:bookmarkEnd w:id="183"/>
-    <w:bookmarkStart w:id="185" w:name="ref-rollison2021"/>
+    <w:bookmarkEnd w:id="184"/>
+    <w:bookmarkStart w:id="186" w:name="ref-rollison2021"/>
     <w:p>
       <w:pPr>
         <w:pStyle w:val="Bibliography"/>
@@ -9274,7 +9304,7 @@
       <w:r>
         <w:t xml:space="preserve"> </w:t>
       </w:r>
-      <w:hyperlink r:id="rId184">
+      <w:hyperlink r:id="rId185">
         <w:r>
           <w:rPr>
             <w:rStyle w:val="Hyperlink"/>
@@ -9286,8 +9316,8 @@
         <w:t xml:space="preserve">.</w:t>
       </w:r>
     </w:p>
-    <w:bookmarkEnd w:id="185"/>
-    <w:bookmarkStart w:id="187" w:name="ref-rollison2019sites"/>
+    <w:bookmarkEnd w:id="186"/>
+    <w:bookmarkStart w:id="188" w:name="ref-rollison2019sites"/>
     <w:p>
       <w:pPr>
         <w:pStyle w:val="Bibliography"/>
@@ -9320,7 +9350,7 @@
       <w:r>
         <w:t xml:space="preserve"> </w:t>
       </w:r>
-      <w:hyperlink r:id="rId186">
+      <w:hyperlink r:id="rId187">
         <w:r>
           <w:rPr>
             <w:rStyle w:val="Hyperlink"/>
@@ -9332,8 +9362,8 @@
         <w:t xml:space="preserve">.</w:t>
       </w:r>
     </w:p>
-    <w:bookmarkEnd w:id="187"/>
-    <w:bookmarkStart w:id="189" w:name="ref-rollison2019"/>
+    <w:bookmarkEnd w:id="188"/>
+    <w:bookmarkStart w:id="190" w:name="ref-rollison2019"/>
     <w:p>
       <w:pPr>
         <w:pStyle w:val="Bibliography"/>
@@ -9366,7 +9396,7 @@
       <w:r>
         <w:t xml:space="preserve"> </w:t>
       </w:r>
-      <w:hyperlink r:id="rId188">
+      <w:hyperlink r:id="rId189">
         <w:r>
           <w:rPr>
             <w:rStyle w:val="Hyperlink"/>
@@ -9378,8 +9408,8 @@
         <w:t xml:space="preserve">.</w:t>
       </w:r>
     </w:p>
-    <w:bookmarkEnd w:id="189"/>
-    <w:bookmarkStart w:id="191" w:name="ref-saeidian2023"/>
+    <w:bookmarkEnd w:id="190"/>
+    <w:bookmarkStart w:id="192" w:name="ref-saeidian2023"/>
     <w:p>
       <w:pPr>
         <w:pStyle w:val="Bibliography"/>
@@ -9454,7 +9484,7 @@
       <w:r>
         <w:t xml:space="preserve"> </w:t>
       </w:r>
-      <w:hyperlink r:id="rId190">
+      <w:hyperlink r:id="rId191">
         <w:r>
           <w:rPr>
             <w:rStyle w:val="Hyperlink"/>
@@ -9466,8 +9496,8 @@
         <w:t xml:space="preserve">.</w:t>
       </w:r>
     </w:p>
-    <w:bookmarkEnd w:id="191"/>
-    <w:bookmarkStart w:id="193" w:name="ref-selitsky2020"/>
+    <w:bookmarkEnd w:id="192"/>
+    <w:bookmarkStart w:id="194" w:name="ref-selitsky2020"/>
     <w:p>
       <w:pPr>
         <w:pStyle w:val="Bibliography"/>
@@ -9518,7 +9548,7 @@
       <w:r>
         <w:t xml:space="preserve"> </w:t>
       </w:r>
-      <w:hyperlink r:id="rId192">
+      <w:hyperlink r:id="rId193">
         <w:r>
           <w:rPr>
             <w:rStyle w:val="Hyperlink"/>
@@ -9530,8 +9560,8 @@
         <w:t xml:space="preserve">.</w:t>
       </w:r>
     </w:p>
-    <w:bookmarkEnd w:id="193"/>
-    <w:bookmarkStart w:id="195" w:name="ref-shenpv2026"/>
+    <w:bookmarkEnd w:id="194"/>
+    <w:bookmarkStart w:id="196" w:name="ref-shenpv2026"/>
     <w:p>
       <w:pPr>
         <w:pStyle w:val="Bibliography"/>
@@ -9561,7 +9591,7 @@
       <w:r>
         <w:t xml:space="preserve"> </w:t>
       </w:r>
-      <w:hyperlink r:id="rId194">
+      <w:hyperlink r:id="rId195">
         <w:r>
           <w:rPr>
             <w:rStyle w:val="Hyperlink"/>
@@ -9573,8 +9603,8 @@
         <w:t xml:space="preserve">.</w:t>
       </w:r>
     </w:p>
-    <w:bookmarkEnd w:id="195"/>
-    <w:bookmarkStart w:id="197" w:name="ref-shen2016"/>
+    <w:bookmarkEnd w:id="196"/>
+    <w:bookmarkStart w:id="198" w:name="ref-shen2016"/>
     <w:p>
       <w:pPr>
         <w:pStyle w:val="Bibliography"/>
@@ -9625,7 +9655,7 @@
       <w:r>
         <w:t xml:space="preserve"> </w:t>
       </w:r>
-      <w:hyperlink r:id="rId196">
+      <w:hyperlink r:id="rId197">
         <w:r>
           <w:rPr>
             <w:rStyle w:val="Hyperlink"/>
@@ -9637,8 +9667,8 @@
         <w:t xml:space="preserve">.</w:t>
       </w:r>
     </w:p>
-    <w:bookmarkEnd w:id="197"/>
-    <w:bookmarkStart w:id="199" w:name="ref-son2025"/>
+    <w:bookmarkEnd w:id="198"/>
+    <w:bookmarkStart w:id="200" w:name="ref-son2025"/>
     <w:p>
       <w:pPr>
         <w:pStyle w:val="Bibliography"/>
@@ -9671,7 +9701,7 @@
       <w:r>
         <w:t xml:space="preserve"> </w:t>
       </w:r>
-      <w:hyperlink r:id="rId198">
+      <w:hyperlink r:id="rId199">
         <w:r>
           <w:rPr>
             <w:rStyle w:val="Hyperlink"/>
@@ -9683,8 +9713,8 @@
         <w:t xml:space="preserve">.</w:t>
       </w:r>
     </w:p>
-    <w:bookmarkEnd w:id="199"/>
-    <w:bookmarkStart w:id="201" w:name="ref-strickley2019"/>
+    <w:bookmarkEnd w:id="200"/>
+    <w:bookmarkStart w:id="202" w:name="ref-strickley2019"/>
     <w:p>
       <w:pPr>
         <w:pStyle w:val="Bibliography"/>
@@ -9717,7 +9747,7 @@
       <w:r>
         <w:t xml:space="preserve"> </w:t>
       </w:r>
-      <w:hyperlink r:id="rId200">
+      <w:hyperlink r:id="rId201">
         <w:r>
           <w:rPr>
             <w:rStyle w:val="Hyperlink"/>
@@ -9729,8 +9759,8 @@
         <w:t xml:space="preserve">.</w:t>
       </w:r>
     </w:p>
-    <w:bookmarkEnd w:id="201"/>
-    <w:bookmarkStart w:id="203" w:name="ref-strickley2021"/>
+    <w:bookmarkEnd w:id="202"/>
+    <w:bookmarkStart w:id="204" w:name="ref-strickley2021"/>
     <w:p>
       <w:pPr>
         <w:pStyle w:val="Bibliography"/>
@@ -9763,7 +9793,7 @@
       <w:r>
         <w:t xml:space="preserve"> </w:t>
       </w:r>
-      <w:hyperlink r:id="rId202">
+      <w:hyperlink r:id="rId203">
         <w:r>
           <w:rPr>
             <w:rStyle w:val="Hyperlink"/>
@@ -9775,8 +9805,8 @@
         <w:t xml:space="preserve">.</w:t>
       </w:r>
     </w:p>
-    <w:bookmarkEnd w:id="203"/>
-    <w:bookmarkStart w:id="204" w:name="ref-uberoi2016"/>
+    <w:bookmarkEnd w:id="204"/>
+    <w:bookmarkStart w:id="205" w:name="ref-uberoi2016"/>
     <w:p>
       <w:pPr>
         <w:pStyle w:val="Bibliography"/>
@@ -9807,8 +9837,8 @@
         <w:t xml:space="preserve">12 (5): e1005664.</w:t>
       </w:r>
     </w:p>
-    <w:bookmarkEnd w:id="204"/>
-    <w:bookmarkStart w:id="206" w:name="ref-vandoorslaer2017"/>
+    <w:bookmarkEnd w:id="205"/>
+    <w:bookmarkStart w:id="207" w:name="ref-vandoorslaer2017"/>
     <w:p>
       <w:pPr>
         <w:pStyle w:val="Bibliography"/>
@@ -9850,7 +9880,7 @@
       <w:r>
         <w:t xml:space="preserve"> </w:t>
       </w:r>
-      <w:hyperlink r:id="rId205">
+      <w:hyperlink r:id="rId206">
         <w:r>
           <w:rPr>
             <w:rStyle w:val="Hyperlink"/>
@@ -9862,8 +9892,8 @@
         <w:t xml:space="preserve">.</w:t>
       </w:r>
     </w:p>
-    <w:bookmarkEnd w:id="206"/>
-    <w:bookmarkStart w:id="208" w:name="ref-vandiver2021"/>
+    <w:bookmarkEnd w:id="207"/>
+    <w:bookmarkStart w:id="209" w:name="ref-vandiver2021"/>
     <w:p>
       <w:pPr>
         <w:pStyle w:val="Bibliography"/>
@@ -9908,7 +9938,7 @@
       <w:r>
         <w:t xml:space="preserve"> </w:t>
       </w:r>
-      <w:hyperlink r:id="rId207">
+      <w:hyperlink r:id="rId208">
         <w:r>
           <w:rPr>
             <w:rStyle w:val="Hyperlink"/>
@@ -9920,8 +9950,8 @@
         <w:t xml:space="preserve">.</w:t>
       </w:r>
     </w:p>
-    <w:bookmarkEnd w:id="208"/>
-    <w:bookmarkStart w:id="210" w:name="ref-viarisio2018"/>
+    <w:bookmarkEnd w:id="209"/>
+    <w:bookmarkStart w:id="211" w:name="ref-viarisio2018"/>
     <w:p>
       <w:pPr>
         <w:pStyle w:val="Bibliography"/>
@@ -9966,7 +9996,7 @@
       <w:r>
         <w:t xml:space="preserve"> </w:t>
       </w:r>
-      <w:hyperlink r:id="rId209">
+      <w:hyperlink r:id="rId210">
         <w:r>
           <w:rPr>
             <w:rStyle w:val="Hyperlink"/>
@@ -9978,8 +10008,8 @@
         <w:t xml:space="preserve">.</w:t>
       </w:r>
     </w:p>
-    <w:bookmarkEnd w:id="210"/>
-    <w:bookmarkStart w:id="211" w:name="ref-devilliers2004"/>
+    <w:bookmarkEnd w:id="211"/>
+    <w:bookmarkStart w:id="212" w:name="ref-devilliers2004"/>
     <w:p>
       <w:pPr>
         <w:pStyle w:val="Bibliography"/>
@@ -10010,8 +10040,8 @@
         <w:t xml:space="preserve">324 (1): 17–27.</w:t>
       </w:r>
     </w:p>
-    <w:bookmarkEnd w:id="211"/>
-    <w:bookmarkStart w:id="212" w:name="ref-wallace2012"/>
+    <w:bookmarkEnd w:id="212"/>
+    <w:bookmarkStart w:id="213" w:name="ref-wallace2012"/>
     <w:p>
       <w:pPr>
         <w:pStyle w:val="Bibliography"/>
@@ -10096,8 +10126,8 @@
         <w:t xml:space="preserve">8 (7): e1002807.</w:t>
       </w:r>
     </w:p>
-    <w:bookmarkEnd w:id="212"/>
-    <w:bookmarkStart w:id="214" w:name="ref-weissenborn2005"/>
+    <w:bookmarkEnd w:id="213"/>
+    <w:bookmarkStart w:id="215" w:name="ref-weissenborn2005"/>
     <w:p>
       <w:pPr>
         <w:pStyle w:val="Bibliography"/>
@@ -10139,7 +10169,7 @@
       <w:r>
         <w:t xml:space="preserve"> </w:t>
       </w:r>
-      <w:hyperlink r:id="rId213">
+      <w:hyperlink r:id="rId214">
         <w:r>
           <w:rPr>
             <w:rStyle w:val="Hyperlink"/>
@@ -10151,8 +10181,8 @@
         <w:t xml:space="preserve">.</w:t>
       </w:r>
     </w:p>
-    <w:bookmarkEnd w:id="214"/>
-    <w:bookmarkStart w:id="216" w:name="ref-weissenborn2012"/>
+    <w:bookmarkEnd w:id="215"/>
+    <w:bookmarkStart w:id="217" w:name="ref-weissenborn2012"/>
     <w:p>
       <w:pPr>
         <w:pStyle w:val="Bibliography"/>
@@ -10197,7 +10227,7 @@
       <w:r>
         <w:t xml:space="preserve"> </w:t>
       </w:r>
-      <w:hyperlink r:id="rId215">
+      <w:hyperlink r:id="rId216">
         <w:r>
           <w:rPr>
             <w:rStyle w:val="Hyperlink"/>
@@ -10209,8 +10239,8 @@
         <w:t xml:space="preserve">.</w:t>
       </w:r>
     </w:p>
-    <w:bookmarkEnd w:id="216"/>
-    <w:bookmarkStart w:id="218" w:name="ref-wenande2025"/>
+    <w:bookmarkEnd w:id="217"/>
+    <w:bookmarkStart w:id="219" w:name="ref-wenande2025"/>
     <w:p>
       <w:pPr>
         <w:pStyle w:val="Bibliography"/>
@@ -10255,7 +10285,7 @@
       <w:r>
         <w:t xml:space="preserve"> </w:t>
       </w:r>
-      <w:hyperlink r:id="rId217">
+      <w:hyperlink r:id="rId218">
         <w:r>
           <w:rPr>
             <w:rStyle w:val="Hyperlink"/>
@@ -10267,8 +10297,8 @@
         <w:t xml:space="preserve">.</w:t>
       </w:r>
     </w:p>
-    <w:bookmarkEnd w:id="218"/>
-    <w:bookmarkStart w:id="220" w:name="ref-wood2019"/>
+    <w:bookmarkEnd w:id="219"/>
+    <w:bookmarkStart w:id="221" w:name="ref-wood2019"/>
     <w:p>
       <w:pPr>
         <w:pStyle w:val="Bibliography"/>
@@ -10310,7 +10340,7 @@
       <w:r>
         <w:t xml:space="preserve"> </w:t>
       </w:r>
-      <w:hyperlink r:id="rId219">
+      <w:hyperlink r:id="rId220">
         <w:r>
           <w:rPr>
             <w:rStyle w:val="Hyperlink"/>
@@ -10322,8 +10352,8 @@
         <w:t xml:space="preserve">.</w:t>
       </w:r>
     </w:p>
-    <w:bookmarkEnd w:id="220"/>
-    <w:bookmarkStart w:id="221" w:name="ref-yasumizu2021"/>
+    <w:bookmarkEnd w:id="221"/>
+    <w:bookmarkStart w:id="222" w:name="ref-yasumizu2021"/>
     <w:p>
       <w:pPr>
         <w:pStyle w:val="Bibliography"/>
@@ -10372,8 +10402,8 @@
         <w:t xml:space="preserve">37 (10): 1465–67.</w:t>
       </w:r>
     </w:p>
-    <w:bookmarkEnd w:id="221"/>
-    <w:bookmarkStart w:id="223" w:name="ref-you2004"/>
+    <w:bookmarkEnd w:id="222"/>
+    <w:bookmarkStart w:id="224" w:name="ref-you2004"/>
     <w:p>
       <w:pPr>
         <w:pStyle w:val="Bibliography"/>
@@ -10442,7 +10472,7 @@
       <w:r>
         <w:t xml:space="preserve"> </w:t>
       </w:r>
-      <w:hyperlink r:id="rId222">
+      <w:hyperlink r:id="rId223">
         <w:r>
           <w:rPr>
             <w:rStyle w:val="Hyperlink"/>
@@ -10454,10 +10484,10 @@
         <w:t xml:space="preserve">.</w:t>
       </w:r>
     </w:p>
-    <w:bookmarkEnd w:id="223"/>
     <w:bookmarkEnd w:id="224"/>
     <w:bookmarkEnd w:id="225"/>
-    <w:bookmarkStart w:id="256" w:name="supplementary-material"/>
+    <w:bookmarkEnd w:id="226"/>
+    <w:bookmarkStart w:id="257" w:name="supplementary-material"/>
     <w:p>
       <w:pPr>
         <w:pStyle w:val="Heading1"/>
@@ -10466,7 +10496,7 @@
         <w:t xml:space="preserve">Supplementary Material</w:t>
       </w:r>
     </w:p>
-    <w:bookmarkStart w:id="253" w:name="supplementary-figures-and-tables"/>
+    <w:bookmarkStart w:id="254" w:name="supplementary-figures-and-tables"/>
     <w:p>
       <w:pPr>
         <w:pStyle w:val="Heading2"/>
@@ -10488,7 +10518,7 @@
       <w:tr>
         <w:tc>
           <w:tcPr/>
-          <w:bookmarkStart w:id="229" w:name="suppfig-depth"/>
+          <w:bookmarkStart w:id="230" w:name="suppfig-depth"/>
           <w:p>
             <w:pPr>
               <w:pStyle w:val="Compact"/>
@@ -10499,18 +10529,18 @@
                 <wp:inline>
                   <wp:extent cx="5943600" cy="3714749"/>
                   <wp:effectExtent b="0" l="0" r="0" t="0"/>
-                  <wp:docPr descr="" title="" id="227" name="Picture"/>
+                  <wp:docPr descr="" title="" id="228" name="Picture"/>
                   <a:graphic>
                     <a:graphicData uri="http://schemas.openxmlformats.org/drawingml/2006/picture">
                       <pic:pic>
                         <pic:nvPicPr>
-                          <pic:cNvPr descr="figureS1.png" id="228" name="Picture"/>
+                          <pic:cNvPr descr="figureS1.png" id="229" name="Picture"/>
                           <pic:cNvPicPr>
                             <a:picLocks noChangeArrowheads="1" noChangeAspect="1"/>
                           </pic:cNvPicPr>
                         </pic:nvPicPr>
                         <pic:blipFill>
-                          <a:blip r:embed="rId226"/>
+                          <a:blip r:embed="rId227"/>
                           <a:stretch>
                             <a:fillRect/>
                           </a:stretch>
@@ -10567,7 +10597,7 @@
               <w:t xml:space="preserve">is not produced by differences in sequencing depth: the groups that reach the floor do so at every depth, and the groups that do not never reach it, however deeply sequenced. Point size is proportional to the number of libraries in each group × bin.</w:t>
             </w:r>
           </w:p>
-          <w:bookmarkEnd w:id="229"/>
+          <w:bookmarkEnd w:id="230"/>
         </w:tc>
       </w:tr>
     </w:tbl>
@@ -10592,7 +10622,7 @@
       <w:tr>
         <w:tc>
           <w:tcPr/>
-          <w:bookmarkStart w:id="233" w:name="suppfig-trace"/>
+          <w:bookmarkStart w:id="234" w:name="suppfig-trace"/>
           <w:p>
             <w:pPr>
               <w:pStyle w:val="Compact"/>
@@ -10603,18 +10633,18 @@
                 <wp:inline>
                   <wp:extent cx="5943600" cy="3302000"/>
                   <wp:effectExtent b="0" l="0" r="0" t="0"/>
-                  <wp:docPr descr="" title="" id="231" name="Picture"/>
+                  <wp:docPr descr="" title="" id="232" name="Picture"/>
                   <a:graphic>
                     <a:graphicData uri="http://schemas.openxmlformats.org/drawingml/2006/picture">
                       <pic:pic>
                         <pic:nvPicPr>
-                          <pic:cNvPr descr="figureS2.png" id="232" name="Picture"/>
+                          <pic:cNvPr descr="figureS2.png" id="233" name="Picture"/>
                           <pic:cNvPicPr>
                             <a:picLocks noChangeArrowheads="1" noChangeAspect="1"/>
                           </pic:cNvPicPr>
                         </pic:nvPicPr>
                         <pic:blipFill>
-                          <a:blip r:embed="rId230"/>
+                          <a:blip r:embed="rId231"/>
                           <a:stretch>
                             <a:fillRect/>
                           </a:stretch>
@@ -10683,7 +10713,7 @@
               <w:t xml:space="preserve">= 54), split into three exclusive classes from the per-gene read counts the pipeline already writes: libraries with no reads on any HPV gene, libraries with gene-mapped reads that do not reach the productive threshold, and productive libraries (L1 ≥ 3 reads). Cell-line and engineered libraries are excluded throughout. The classes are assigned in that order of precedence, so a library appears in exactly one. The residual sample group with no recorded site is not in the denominator: the claim is about skin and neoplasia. Of the 57 gene-mapped but non-productive trace libraries, 52 carry early-gene reads with the late program absent and 5 carry only L2 reads below the productive bar; the median late-read fraction across the whole trace is 0, against 0.367 in the controls, which is the differentiation-coupled capsid burst the controls are there to show.</w:t>
             </w:r>
           </w:p>
-          <w:bookmarkEnd w:id="233"/>
+          <w:bookmarkEnd w:id="234"/>
         </w:tc>
       </w:tr>
     </w:tbl>
@@ -10708,7 +10738,7 @@
       <w:tr>
         <w:tc>
           <w:tcPr/>
-          <w:bookmarkStart w:id="237" w:name="suppfig-types"/>
+          <w:bookmarkStart w:id="238" w:name="suppfig-types"/>
           <w:p>
             <w:pPr>
               <w:pStyle w:val="Compact"/>
@@ -10719,18 +10749,18 @@
                 <wp:inline>
                   <wp:extent cx="5943600" cy="2993813"/>
                   <wp:effectExtent b="0" l="0" r="0" t="0"/>
-                  <wp:docPr descr="" title="" id="235" name="Picture"/>
+                  <wp:docPr descr="" title="" id="236" name="Picture"/>
                   <a:graphic>
                     <a:graphicData uri="http://schemas.openxmlformats.org/drawingml/2006/picture">
                       <pic:pic>
                         <pic:nvPicPr>
-                          <pic:cNvPr descr="figureS3.png" id="236" name="Picture"/>
+                          <pic:cNvPr descr="figureS3.png" id="237" name="Picture"/>
                           <pic:cNvPicPr>
                             <a:picLocks noChangeArrowheads="1" noChangeAspect="1"/>
                           </pic:cNvPicPr>
                         </pic:nvPicPr>
                         <pic:blipFill>
-                          <a:blip r:embed="rId234"/>
+                          <a:blip r:embed="rId235"/>
                           <a:stretch>
                             <a:fillRect/>
                           </a:stretch>
@@ -10865,7 +10895,7 @@
               <w:t xml:space="preserve">collapses both panels from type to genus.</w:t>
             </w:r>
           </w:p>
-          <w:bookmarkEnd w:id="237"/>
+          <w:bookmarkEnd w:id="238"/>
         </w:tc>
       </w:tr>
     </w:tbl>
@@ -10890,7 +10920,7 @@
       <w:tr>
         <w:tc>
           <w:tcPr/>
-          <w:bookmarkStart w:id="241" w:name="suppfig-reservoir-gut"/>
+          <w:bookmarkStart w:id="242" w:name="suppfig-reservoir-gut"/>
           <w:p>
             <w:pPr>
               <w:pStyle w:val="Compact"/>
@@ -10901,18 +10931,18 @@
                 <wp:inline>
                   <wp:extent cx="5943600" cy="4302034"/>
                   <wp:effectExtent b="0" l="0" r="0" t="0"/>
-                  <wp:docPr descr="" title="" id="239" name="Picture"/>
+                  <wp:docPr descr="" title="" id="240" name="Picture"/>
                   <a:graphic>
                     <a:graphicData uri="http://schemas.openxmlformats.org/drawingml/2006/picture">
                       <pic:pic>
                         <pic:nvPicPr>
-                          <pic:cNvPr descr="figureS4.png" id="240" name="Picture"/>
+                          <pic:cNvPr descr="figureS4.png" id="241" name="Picture"/>
                           <pic:cNvPicPr>
                             <a:picLocks noChangeArrowheads="1" noChangeAspect="1"/>
                           </pic:cNvPicPr>
                         </pic:nvPicPr>
                         <pic:blipFill>
-                          <a:blip r:embed="rId238"/>
+                          <a:blip r:embed="rId239"/>
                           <a:stretch>
                             <a:fillRect/>
                           </a:stretch>
@@ -11052,7 +11082,7 @@
               <w:t xml:space="preserve">to be read as biology: the identical procedure applied to vaginal libraries recovers an overwhelmingly alpha mucosal niche, which assembly noise could not produce. Only skin is carried into the main figure, since the paper’s subject is skin. Its composition is a mixture of mucosal alpha (30.5%) and cutaneous beta (34.9%), and its commonest types interleave the two (HPV16, HPV6 and HPV56 with HPV24, HPV124 and HPV37), which is the expected signature of a collection route that crosses perianal skin rather than of papillomavirus carriage in the gut; the same pattern is seen independently in rectal-swab cohorts. Read that way the site is a useful control, since it shows the catalog recovering the genus of whatever epithelium the sampling route touches, and its novel-cluster fraction (9.6%) sits with skin’s (14.5%) rather than with the vaginal site’s (0.2%), as expected if its beta/gamma content is cutaneous in origin.</w:t>
             </w:r>
           </w:p>
-          <w:bookmarkEnd w:id="241"/>
+          <w:bookmarkEnd w:id="242"/>
         </w:tc>
       </w:tr>
     </w:tbl>
@@ -11077,7 +11107,7 @@
       <w:tr>
         <w:tc>
           <w:tcPr/>
-          <w:bookmarkStart w:id="245" w:name="suppfig-bayes"/>
+          <w:bookmarkStart w:id="246" w:name="suppfig-bayes"/>
           <w:p>
             <w:pPr>
               <w:pStyle w:val="Compact"/>
@@ -11088,18 +11118,18 @@
                 <wp:inline>
                   <wp:extent cx="5943600" cy="2905759"/>
                   <wp:effectExtent b="0" l="0" r="0" t="0"/>
-                  <wp:docPr descr="" title="" id="243" name="Picture"/>
+                  <wp:docPr descr="" title="" id="244" name="Picture"/>
                   <a:graphic>
                     <a:graphicData uri="http://schemas.openxmlformats.org/drawingml/2006/picture">
                       <pic:pic>
                         <pic:nvPicPr>
-                          <pic:cNvPr descr="figureS5.png" id="244" name="Picture"/>
+                          <pic:cNvPr descr="figureS5.png" id="245" name="Picture"/>
                           <pic:cNvPicPr>
                             <a:picLocks noChangeArrowheads="1" noChangeAspect="1"/>
                           </pic:cNvPicPr>
                         </pic:nvPicPr>
                         <pic:blipFill>
-                          <a:blip r:embed="rId242"/>
+                          <a:blip r:embed="rId243"/>
                           <a:stretch>
                             <a:fillRect/>
                           </a:stretch>
@@ -11177,7 +11207,7 @@
               <w:t xml:space="preserve">(3) row is the prior-sensitivity refit of the contrast immediately above it, reported in that table’s caption rather than as a row of its own, and it sits further from 1 rather than nearer, which is what makes the productive-controls gap a finding rather than an artifact of the Normal prior. The axis spans five orders of magnitude because that contrast genuinely does.</w:t>
             </w:r>
           </w:p>
-          <w:bookmarkEnd w:id="245"/>
+          <w:bookmarkEnd w:id="246"/>
         </w:tc>
       </w:tr>
     </w:tbl>
@@ -11202,7 +11232,7 @@
       <w:tr>
         <w:tc>
           <w:tcPr/>
-          <w:bookmarkStart w:id="246" w:name="supptbl-types"/>
+          <w:bookmarkStart w:id="247" w:name="supptbl-types"/>
           <w:tbl>
             <w:tblPr>
               <w:tblStyle w:val="Table"/>
@@ -13982,7 +14012,7 @@
               <w:t xml:space="preserve">, at the level of HPV genus.</w:t>
             </w:r>
           </w:p>
-          <w:bookmarkEnd w:id="246"/>
+          <w:bookmarkEnd w:id="247"/>
         </w:tc>
       </w:tr>
     </w:tbl>
@@ -14007,7 +14037,7 @@
       <w:tr>
         <w:tc>
           <w:tcPr/>
-          <w:bookmarkStart w:id="247" w:name="supptbl-productive"/>
+          <w:bookmarkStart w:id="248" w:name="supptbl-productive"/>
           <w:tbl>
             <w:tblPr>
               <w:tblStyle w:val="Table"/>
@@ -14694,7 +14724,7 @@
               <w:t xml:space="preserve">).</w:t>
             </w:r>
           </w:p>
-          <w:bookmarkEnd w:id="247"/>
+          <w:bookmarkEnd w:id="248"/>
         </w:tc>
       </w:tr>
     </w:tbl>
@@ -14719,7 +14749,7 @@
       <w:tr>
         <w:tc>
           <w:tcPr/>
-          <w:bookmarkStart w:id="248" w:name="supptbl-bayes"/>
+          <w:bookmarkStart w:id="249" w:name="supptbl-bayes"/>
           <w:tbl>
             <w:tblPr>
               <w:tblStyle w:val="Table"/>
@@ -15299,7 +15329,7 @@
               <w:t xml:space="preserve">(3) prior gives an even larger posterior OR, 14,515 [3,961, 77,562], confirming robustness). Sequencing depth is modeled per 10-fold (log₁₀) change in library size.</w:t>
             </w:r>
           </w:p>
-          <w:bookmarkEnd w:id="248"/>
+          <w:bookmarkEnd w:id="249"/>
         </w:tc>
       </w:tr>
     </w:tbl>
@@ -15324,7 +15354,7 @@
       <w:tr>
         <w:tc>
           <w:tcPr/>
-          <w:bookmarkStart w:id="249" w:name="supptbl-cin"/>
+          <w:bookmarkStart w:id="250" w:name="supptbl-cin"/>
           <w:tbl>
             <w:tblPr>
               <w:tblStyle w:val="Table"/>
@@ -15705,7 +15735,7 @@
               <w:t xml:space="preserve">= 0.0038). Retaining them is therefore the conservative analytical choice: the small floor-level excess of neoplasia over skin reported in the main text is an upper bound. Virus–host junction calling supports the same reading from an independent direction: the members of this set that carry enough viral reads to test are integration-positive, whereas the cutaneous-neoplasia libraries outside it are not. Integration is the expected state of mucosal HPV16 in carcinoma and is not a property of the cutaneous reservoir, so the assignment of these libraries to a mucosal origin rests on genome state as well as on type.</w:t>
             </w:r>
           </w:p>
-          <w:bookmarkEnd w:id="249"/>
+          <w:bookmarkEnd w:id="250"/>
         </w:tc>
       </w:tr>
     </w:tbl>
@@ -15730,7 +15760,7 @@
       <w:tr>
         <w:tc>
           <w:tcPr/>
-          <w:bookmarkStart w:id="250" w:name="supptbl-chem"/>
+          <w:bookmarkStart w:id="251" w:name="supptbl-chem"/>
           <w:tbl>
             <w:tblPr>
               <w:tblStyle w:val="Table"/>
@@ -16648,7 +16678,7 @@
               <w:t xml:space="preserve">= 7.2×10⁻¹²) and yields no above-floor library in either group.</w:t>
             </w:r>
           </w:p>
-          <w:bookmarkEnd w:id="250"/>
+          <w:bookmarkEnd w:id="251"/>
         </w:tc>
       </w:tr>
     </w:tbl>
@@ -16673,7 +16703,7 @@
       <w:tr>
         <w:tc>
           <w:tcPr/>
-          <w:bookmarkStart w:id="251" w:name="supptbl-trace"/>
+          <w:bookmarkStart w:id="252" w:name="supptbl-trace"/>
           <w:tbl>
             <w:tblPr>
               <w:tblStyle w:val="Table"/>
@@ -19378,7 +19408,7 @@
               <w:t xml:space="preserve">, from HPV type to HPV genus.</w:t>
             </w:r>
           </w:p>
-          <w:bookmarkEnd w:id="251"/>
+          <w:bookmarkEnd w:id="252"/>
         </w:tc>
       </w:tr>
     </w:tbl>
@@ -19403,7 +19433,7 @@
       <w:tr>
         <w:tc>
           <w:tcPr/>
-          <w:bookmarkStart w:id="252" w:name="supptbl-coinf"/>
+          <w:bookmarkStart w:id="253" w:name="supptbl-coinf"/>
           <w:tbl>
             <w:tblPr>
               <w:tblStyle w:val="Table"/>
@@ -20920,12 +20950,12 @@
               <w:t xml:space="preserve">, which retains only uniquely-mapped reads, since STAR assigns MAPQ ≤ 3 to any read placing equally well on two references, so cross-mapping between similar types cannot manufacture a co-infection call: each type in a row is supported by reads that map to it and to nothing else. Three cautions govern how far the table can be read. First, the rows are not independent observations: 13 of the 26 come from the paired studies SRP314958 (RNA-seq) and SRP314961 (MeRIP-seq), which are condyloma lesions from 5 donors (CA_1 to CA_5), each sequenced as an RNA-seq library plus a MeRIP input and IP fraction, so rows sharing a donor carry near-identical read profiles. Second, the secondary types often sit close to the threshold: across all non-dominant calls the median depth is 9.0× and 39% fall below 5×, so which type is called second can depend on the library fraction, and in donor CA_2 the RNA-seq and MeRIP input fractions call HPV6 + HPV11 while the IP fraction of the same specimen calls HPV6 + HPV42. Third, the deepest type in a co-infected library typically dominates its partner, by a median of 45-fold (interquartile range 14 to 2,175), so most rows describe one established infection alongside a minor second type rather than two comparable ones. Where both partners are unambiguous the pairings are biologically coherent: two carcinoma and actinic-keratosis libraries whose SRA records carry no tissue field (ERR2274877, ERR1971044) carry the beta-types HPV96 and HPV182 together at 98–99% breadth and 61–245× depth, and an EV biopsy (SRR21205038) carries the beta-types HPV20 and HPV9 at 18,558× and 736×; both are two full genomes in one library, not a genome plus a fragment. The most frequent pairing in the study is HPV11 with HPV42: 8 libraries carry both, against 14 with HPV11 alone and 1 with HPV42 alone. Requiring both partners to clear a stricter bar (breadth ≥ 0.70 and depth ≥ 5× for each) leaves 3 libraries from 1 of those donors (CA_1). Their dominance relation is asymmetric: HPV11 is the deeper type in all five condyloma lesions, exceeding HPV42 48- to 4,100-fold in the three with a strong HPV11 signal (CA_1, CA_4, CA_5) and 2- to 4-fold in the other two, so HPV42 is the minor partner throughout and clears the assignment threshold only where it happens to be abundant. Whether the pairing is a genuine dual infection or an artifact of that sensitivity limit cannot be settled from five donors of one study: it is a hypothesis the data motivate, not a result they support.</w:t>
             </w:r>
           </w:p>
-          <w:bookmarkEnd w:id="252"/>
+          <w:bookmarkEnd w:id="253"/>
         </w:tc>
       </w:tr>
     </w:tbl>
-    <w:bookmarkEnd w:id="253"/>
-    <w:bookmarkStart w:id="255" w:name="sec-s-crosstalk"/>
+    <w:bookmarkEnd w:id="254"/>
+    <w:bookmarkStart w:id="256" w:name="sec-s-crosstalk"/>
     <w:p>
       <w:pPr>
         <w:pStyle w:val="Heading2"/>
@@ -21155,7 +21185,7 @@
       <w:tr>
         <w:tc>
           <w:tcPr/>
-          <w:bookmarkStart w:id="254" w:name="supptbl-e2"/>
+          <w:bookmarkStart w:id="255" w:name="supptbl-e2"/>
           <w:tbl>
             <w:tblPr>
               <w:tblStyle w:val="Table"/>
@@ -21683,12 +21713,12 @@
               <w:t xml:space="preserve">against RefSeq papillomavirus open reading frames, and scored for whether E2 is present given that E1 is present. The comparison that matters is between the two right-hand columns and the two left-hand ones. Across all contigs, E2 recovery tracks assembly quality rather than biology: it is lowest in cervical CIN (79.3%) and cervical carcinoma (83.6%), which are also the arms with the shortest contigs, and highest in the vaginal and gut metagenomes, which assemble best. Once the question is restricted to near-complete contigs (≥7 kb), where E2 presence can actually be assessed, every category converges on 100%, and cervical carcinoma, in which integration and E2 disruption are the rule, returns 99.3% against 99.9% for skin. That convergence is not a biological result. An integrated genome cannot assemble across the virus-host junction, so conditioning on completeness selects episomal genomes in every category, and the statistic is structurally incapable of detecting the event it was built to detect. This table is reported because the inference is an inviting one to draw from a public contig catalog, and because it bounds what the DNA axis can contribute: presence of a papillomavirus in such a catalog is presence of a detectable L1, and carries no information about the state of the genome (Discussion).</w:t>
             </w:r>
           </w:p>
-          <w:bookmarkEnd w:id="254"/>
+          <w:bookmarkEnd w:id="255"/>
         </w:tc>
       </w:tr>
     </w:tbl>
-    <w:bookmarkEnd w:id="255"/>
     <w:bookmarkEnd w:id="256"/>
+    <w:bookmarkEnd w:id="257"/>
     <w:sectPr>
       <w:headerReference r:id="rId9" w:type="default"/>
       <w:pgSz w:h="15840" w:w="12240"/>

</xml_diff>